<commit_message>
Exploring about theGenerative AI foundation models and platforms in Specialization
</commit_message>
<xml_diff>
--- a/3_Generarive_AI_Foundation_Models_and_Platforms/IBM_Gen_AI_Foundation_Models_and_Platforms_Notes.docx
+++ b/3_Generarive_AI_Foundation_Models_and_Platforms/IBM_Gen_AI_Foundation_Models_and_Platforms_Notes.docx
@@ -76,6 +76,90 @@
           <w14:ligatures w14:val="none"/>
         </w:rPr>
         <w:t xml:space="preserve"> is a platform designed to manage the entire AI model lifecycle, from development through production, while providing built-in compliance and risk management capabilities. It helps organizations develop, deploy, and maintain AI models responsibly by ensuring transparency, fairness, and regulatory compliance.</w:t>
+      </w:r>
+    </w:p>
+    <w:p>
+      <w:pPr>
+        <w:pStyle w:val="Heading3"/>
+      </w:pPr>
+      <w:r>
+        <w:t>Risk Management in the AI Lifecycle</w:t>
+      </w:r>
+    </w:p>
+    <w:p>
+      <w:pPr>
+        <w:pStyle w:val="NormalWeb"/>
+        <w:numPr>
+          <w:ilvl w:val="0"/>
+          <w:numId w:val="21"/>
+        </w:numPr>
+      </w:pPr>
+      <w:r>
+        <w:t xml:space="preserve">Risk management is the proactive process of </w:t>
+      </w:r>
+      <w:r>
+        <w:rPr>
+          <w:b/>
+          <w:bCs/>
+        </w:rPr>
+        <w:t>identifying, assessing, and mitigating potential negative outcomes</w:t>
+      </w:r>
+      <w:r>
+        <w:t xml:space="preserve"> associated with developing and deploying AI.</w:t>
+      </w:r>
+    </w:p>
+    <w:p>
+      <w:pPr>
+        <w:pStyle w:val="NormalWeb"/>
+        <w:numPr>
+          <w:ilvl w:val="0"/>
+          <w:numId w:val="21"/>
+        </w:numPr>
+      </w:pPr>
+      <w:r>
+        <w:t xml:space="preserve">Unlike traditional software, AI models are dynamic, probabilistic, and can behave unpredictably when exposed to new data. </w:t>
+      </w:r>
+    </w:p>
+    <w:p>
+      <w:pPr>
+        <w:pStyle w:val="Heading3"/>
+      </w:pPr>
+      <w:r>
+        <w:t>Compliance in the AI Lifecycle</w:t>
+      </w:r>
+    </w:p>
+    <w:p>
+      <w:pPr>
+        <w:pStyle w:val="NormalWeb"/>
+        <w:numPr>
+          <w:ilvl w:val="0"/>
+          <w:numId w:val="20"/>
+        </w:numPr>
+      </w:pPr>
+      <w:r>
+        <w:t xml:space="preserve">Compliance refers to ensuring that an AI model adheres to </w:t>
+      </w:r>
+      <w:r>
+        <w:rPr>
+          <w:b/>
+          <w:bCs/>
+        </w:rPr>
+        <w:t>external laws, government regulations, and internal organizational policies</w:t>
+      </w:r>
+      <w:r>
+        <w:t>.</w:t>
+      </w:r>
+    </w:p>
+    <w:p>
+      <w:pPr>
+        <w:pStyle w:val="NormalWeb"/>
+        <w:numPr>
+          <w:ilvl w:val="0"/>
+          <w:numId w:val="20"/>
+        </w:numPr>
+      </w:pPr>
+      <w:r>
+        <w:t>Because AI can impact privacy, civil rights, and safety, compliance acts as the guardrails that keep an organization legally protected.</w:t>
       </w:r>
     </w:p>
     <w:p>
@@ -237,6 +321,446 @@
     </w:p>
     <w:p>
       <w:pPr>
+        <w:pStyle w:val="Heading1"/>
+      </w:pPr>
+      <w:r>
+        <w:t>Generative AI: Introduction and Applications – Overview</w:t>
+      </w:r>
+    </w:p>
+    <w:p>
+      <w:pPr>
+        <w:pStyle w:val="Heading2"/>
+      </w:pPr>
+      <w:r>
+        <w:t>Introduction</w:t>
+      </w:r>
+    </w:p>
+    <w:p>
+      <w:pPr>
+        <w:pStyle w:val="NormalWeb"/>
+      </w:pPr>
+      <w:r>
+        <w:t>Generative AI is a rapidly developing field that is changing how people create content, solve problems, and build intelligent applications. This overview introduces the core ideas, models, and platforms that shape the field and provides a practical starting point for understanding how generative systems work.</w:t>
+      </w:r>
+    </w:p>
+    <w:p>
+      <w:pPr>
+        <w:pStyle w:val="NormalWeb"/>
+      </w:pPr>
+      <w:r>
+        <w:lastRenderedPageBreak/>
+        <w:t>The focus is on the fundamental concepts and model families that form the foundation of generative AI. These include deep learning and Large Language Models (LLMs), along with major model types such as:</w:t>
+      </w:r>
+    </w:p>
+    <w:p>
+      <w:pPr>
+        <w:pStyle w:val="NormalWeb"/>
+        <w:numPr>
+          <w:ilvl w:val="0"/>
+          <w:numId w:val="22"/>
+        </w:numPr>
+      </w:pPr>
+      <w:r>
+        <w:t>Generative Adversarial Networks (GANs)</w:t>
+      </w:r>
+    </w:p>
+    <w:p>
+      <w:pPr>
+        <w:pStyle w:val="NormalWeb"/>
+        <w:numPr>
+          <w:ilvl w:val="0"/>
+          <w:numId w:val="22"/>
+        </w:numPr>
+      </w:pPr>
+      <w:r>
+        <w:t>Variational Autoencoders (VAEs)</w:t>
+      </w:r>
+    </w:p>
+    <w:p>
+      <w:pPr>
+        <w:pStyle w:val="NormalWeb"/>
+        <w:numPr>
+          <w:ilvl w:val="0"/>
+          <w:numId w:val="22"/>
+        </w:numPr>
+      </w:pPr>
+      <w:r>
+        <w:t>Transformers</w:t>
+      </w:r>
+    </w:p>
+    <w:p>
+      <w:pPr>
+        <w:pStyle w:val="NormalWeb"/>
+        <w:numPr>
+          <w:ilvl w:val="0"/>
+          <w:numId w:val="22"/>
+        </w:numPr>
+      </w:pPr>
+      <w:r>
+        <w:t>Diffusion Models</w:t>
+      </w:r>
+    </w:p>
+    <w:p>
+      <w:pPr>
+        <w:pStyle w:val="NormalWeb"/>
+      </w:pPr>
+      <w:r>
+        <w:t>The overview also introduces the idea of Foundation Models and explains how pre-trained models can be used to generate:</w:t>
+      </w:r>
+    </w:p>
+    <w:p>
+      <w:pPr>
+        <w:pStyle w:val="NormalWeb"/>
+        <w:numPr>
+          <w:ilvl w:val="0"/>
+          <w:numId w:val="23"/>
+        </w:numPr>
+      </w:pPr>
+      <w:r>
+        <w:t>Text</w:t>
+      </w:r>
+    </w:p>
+    <w:p>
+      <w:pPr>
+        <w:pStyle w:val="NormalWeb"/>
+        <w:numPr>
+          <w:ilvl w:val="0"/>
+          <w:numId w:val="23"/>
+        </w:numPr>
+      </w:pPr>
+      <w:r>
+        <w:t>Images</w:t>
+      </w:r>
+    </w:p>
+    <w:p>
+      <w:pPr>
+        <w:pStyle w:val="NormalWeb"/>
+        <w:numPr>
+          <w:ilvl w:val="0"/>
+          <w:numId w:val="23"/>
+        </w:numPr>
+      </w:pPr>
+      <w:r>
+        <w:t>Code</w:t>
+      </w:r>
+    </w:p>
+    <w:p>
+      <w:pPr>
+        <w:pStyle w:val="NormalWeb"/>
+      </w:pPr>
+      <w:r>
+        <w:t>In addition, it highlights widely used generative AI platforms, including:</w:t>
+      </w:r>
+    </w:p>
+    <w:p>
+      <w:pPr>
+        <w:pStyle w:val="NormalWeb"/>
+        <w:numPr>
+          <w:ilvl w:val="0"/>
+          <w:numId w:val="24"/>
+        </w:numPr>
+      </w:pPr>
+      <w:r>
+        <w:t>IBM watsonx</w:t>
+      </w:r>
+    </w:p>
+    <w:p>
+      <w:pPr>
+        <w:pStyle w:val="NormalWeb"/>
+        <w:numPr>
+          <w:ilvl w:val="0"/>
+          <w:numId w:val="24"/>
+        </w:numPr>
+      </w:pPr>
+      <w:r>
+        <w:t>Hugging Face</w:t>
+      </w:r>
+    </w:p>
+    <w:p>
+      <w:pPr>
+        <w:pStyle w:val="NormalWeb"/>
+      </w:pPr>
+      <w:r>
+        <w:t>Practical labs provide hands-on exposure through the IBM Generative AI Classroom and platforms such as IBM watsonx. These activities include working with foundation models such as:</w:t>
+      </w:r>
+    </w:p>
+    <w:p>
+      <w:pPr>
+        <w:pStyle w:val="NormalWeb"/>
+        <w:numPr>
+          <w:ilvl w:val="0"/>
+          <w:numId w:val="25"/>
+        </w:numPr>
+      </w:pPr>
+      <w:r>
+        <w:t>IBM Granite</w:t>
+      </w:r>
+    </w:p>
+    <w:p>
+      <w:pPr>
+        <w:pStyle w:val="NormalWeb"/>
+        <w:numPr>
+          <w:ilvl w:val="0"/>
+          <w:numId w:val="25"/>
+        </w:numPr>
+      </w:pPr>
+      <w:r>
+        <w:t>OpenAI GPT</w:t>
+      </w:r>
+    </w:p>
+    <w:p>
+      <w:pPr>
+        <w:pStyle w:val="NormalWeb"/>
+        <w:numPr>
+          <w:ilvl w:val="0"/>
+          <w:numId w:val="25"/>
+        </w:numPr>
+      </w:pPr>
+      <w:r>
+        <w:t>Google FLAN</w:t>
+      </w:r>
+    </w:p>
+    <w:p>
+      <w:pPr>
+        <w:pStyle w:val="NormalWeb"/>
+        <w:numPr>
+          <w:ilvl w:val="0"/>
+          <w:numId w:val="25"/>
+        </w:numPr>
+      </w:pPr>
+      <w:r>
+        <w:t>Meta Llama</w:t>
+      </w:r>
+    </w:p>
+    <w:p>
+      <w:pPr>
+        <w:pStyle w:val="NormalWeb"/>
+      </w:pPr>
+      <w:r>
+        <w:t>Expert insights are also included to show how generative AI is being applied in real-world settings and what tools are shaping its growth.</w:t>
+      </w:r>
+    </w:p>
+    <w:p>
+      <w:pPr>
+        <w:pStyle w:val="Heading2"/>
+      </w:pPr>
+      <w:r>
+        <w:t>Learning Outcomes</w:t>
+      </w:r>
+    </w:p>
+    <w:p>
+      <w:pPr>
+        <w:pStyle w:val="NormalWeb"/>
+      </w:pPr>
+      <w:r>
+        <w:t>By the end of this overview, you will be able to:</w:t>
+      </w:r>
+    </w:p>
+    <w:p>
+      <w:pPr>
+        <w:pStyle w:val="NormalWeb"/>
+        <w:numPr>
+          <w:ilvl w:val="0"/>
+          <w:numId w:val="26"/>
+        </w:numPr>
+      </w:pPr>
+      <w:r>
+        <w:t>Describe the fundamental concepts of Generative AI and its core models.</w:t>
+      </w:r>
+    </w:p>
+    <w:p>
+      <w:pPr>
+        <w:pStyle w:val="NormalWeb"/>
+        <w:numPr>
+          <w:ilvl w:val="0"/>
+          <w:numId w:val="26"/>
+        </w:numPr>
+      </w:pPr>
+      <w:r>
+        <w:t>Explain the concept of Foundation Models in Generative AI.</w:t>
+      </w:r>
+    </w:p>
+    <w:p>
+      <w:pPr>
+        <w:pStyle w:val="NormalWeb"/>
+        <w:numPr>
+          <w:ilvl w:val="0"/>
+          <w:numId w:val="26"/>
+        </w:numPr>
+      </w:pPr>
+      <w:r>
+        <w:t>Explore the capabilities of pre-trained models for AI application development.</w:t>
+      </w:r>
+    </w:p>
+    <w:p>
+      <w:pPr>
+        <w:pStyle w:val="NormalWeb"/>
+        <w:numPr>
+          <w:ilvl w:val="0"/>
+          <w:numId w:val="26"/>
+        </w:numPr>
+      </w:pPr>
+      <w:r>
+        <w:t>Explore the features, capabilities, and applications of Generative AI platforms such as IBM watsonx and Hugging Face.</w:t>
+      </w:r>
+    </w:p>
+    <w:p>
+      <w:pPr>
+        <w:pStyle w:val="Heading2"/>
+      </w:pPr>
+      <w:r>
+        <w:t>Who This Is For</w:t>
+      </w:r>
+    </w:p>
+    <w:p>
+      <w:pPr>
+        <w:pStyle w:val="NormalWeb"/>
+      </w:pPr>
+      <w:r>
+        <w:t>This overview is suitable for anyone interested in the rapidly evolving field of Generative AI and its core concepts, models, and platforms.</w:t>
+      </w:r>
+    </w:p>
+    <w:p>
+      <w:pPr>
+        <w:pStyle w:val="NormalWeb"/>
+      </w:pPr>
+      <w:r>
+        <w:t>It is especially useful for:</w:t>
+      </w:r>
+    </w:p>
+    <w:p>
+      <w:pPr>
+        <w:pStyle w:val="NormalWeb"/>
+        <w:numPr>
+          <w:ilvl w:val="0"/>
+          <w:numId w:val="34"/>
+        </w:numPr>
+      </w:pPr>
+      <w:r>
+        <w:lastRenderedPageBreak/>
+        <w:t>Individuals seeking an introduction to Generative AI models, platforms, and their capabilities.</w:t>
+      </w:r>
+    </w:p>
+    <w:p>
+      <w:pPr>
+        <w:pStyle w:val="NormalWeb"/>
+        <w:numPr>
+          <w:ilvl w:val="0"/>
+          <w:numId w:val="34"/>
+        </w:numPr>
+      </w:pPr>
+      <w:r>
+        <w:t>Professionals looking to improve their work by leveraging the power of Generative AI.</w:t>
+      </w:r>
+    </w:p>
+    <w:p>
+      <w:pPr>
+        <w:pStyle w:val="NormalWeb"/>
+        <w:numPr>
+          <w:ilvl w:val="0"/>
+          <w:numId w:val="34"/>
+        </w:numPr>
+      </w:pPr>
+      <w:r>
+        <w:t>Managers and executives exploring how Generative AI platforms can be used within their organizations.</w:t>
+      </w:r>
+    </w:p>
+    <w:p>
+      <w:pPr>
+        <w:pStyle w:val="NormalWeb"/>
+        <w:numPr>
+          <w:ilvl w:val="0"/>
+          <w:numId w:val="34"/>
+        </w:numPr>
+      </w:pPr>
+      <w:r>
+        <w:t>Students who want to build practical Generative AI skills to improve their job readiness.</w:t>
+      </w:r>
+    </w:p>
+    <w:p>
+      <w:pPr>
+        <w:pStyle w:val="Heading2"/>
+      </w:pPr>
+      <w:r>
+        <w:t>Recommended Background</w:t>
+      </w:r>
+    </w:p>
+    <w:p>
+      <w:pPr>
+        <w:pStyle w:val="NormalWeb"/>
+      </w:pPr>
+      <w:r>
+        <w:t xml:space="preserve">This material is designed for anyone interested in exploring Generative AI and </w:t>
+      </w:r>
+      <w:r>
+        <w:t>requires</w:t>
+      </w:r>
+      <w:r>
+        <w:rPr>
+          <w:rStyle w:val="Strong"/>
+        </w:rPr>
+        <w:t xml:space="preserve"> </w:t>
+      </w:r>
+      <w:r>
+        <w:rPr>
+          <w:rStyle w:val="Strong"/>
+        </w:rPr>
+        <w:t>no</w:t>
+      </w:r>
+      <w:r>
+        <w:rPr>
+          <w:rStyle w:val="Strong"/>
+        </w:rPr>
+        <w:t xml:space="preserve"> specific prerequisites</w:t>
+      </w:r>
+      <w:r>
+        <w:t>.</w:t>
+      </w:r>
+    </w:p>
+    <w:p>
+      <w:pPr>
+        <w:pStyle w:val="NormalWeb"/>
+      </w:pPr>
+      <w:r>
+        <w:t>It uses simple, easy-to-understand language to explain the essential concepts without relying on technical jargon.</w:t>
+      </w:r>
+    </w:p>
+    <w:p>
+      <w:pPr>
+        <w:pStyle w:val="NormalWeb"/>
+      </w:pPr>
+      <w:r>
+        <w:t xml:space="preserve">The hands-on labs require </w:t>
+      </w:r>
+      <w:r>
+        <w:rPr>
+          <w:rStyle w:val="Strong"/>
+        </w:rPr>
+        <w:t>no programming experience</w:t>
+      </w:r>
+      <w:r>
+        <w:t xml:space="preserve">, and </w:t>
+      </w:r>
+      <w:r>
+        <w:rPr>
+          <w:rStyle w:val="Strong"/>
+        </w:rPr>
+        <w:t>no educational degree is required</w:t>
+      </w:r>
+      <w:r>
+        <w:t>.</w:t>
+      </w:r>
+    </w:p>
+    <w:p>
+      <w:pPr>
+        <w:pStyle w:val="NormalWeb"/>
+      </w:pPr>
+      <w:r>
+        <w:t>To get the most from the material, active participation and completion of the learning activities across all sections are recommended.</w:t>
+      </w:r>
+    </w:p>
+    <w:p>
+      <w:pPr>
         <w:rPr>
           <w:lang w:val="en" w:eastAsia="en"/>
         </w:rPr>
@@ -255,6 +779,304 @@
 <file path=word/numbering.xml><?xml version="1.0" encoding="utf-8"?>
 <w:numbering xmlns:wpc="http://schemas.microsoft.com/office/word/2010/wordprocessingCanvas" xmlns:cx="http://schemas.microsoft.com/office/drawing/2014/chartex" xmlns:cx1="http://schemas.microsoft.com/office/drawing/2015/9/8/chartex" xmlns:cx2="http://schemas.microsoft.com/office/drawing/2015/10/21/chartex" xmlns:cx3="http://schemas.microsoft.com/office/drawing/2016/5/9/chartex" xmlns:cx4="http://schemas.microsoft.com/office/drawing/2016/5/10/chartex" xmlns:cx5="http://schemas.microsoft.com/office/drawing/2016/5/11/chartex" xmlns:cx6="http://schemas.microsoft.com/office/drawing/2016/5/12/chartex" xmlns:cx7="http://schemas.microsoft.com/office/drawing/2016/5/13/chartex" xmlns:cx8="http://schemas.microsoft.com/office/drawing/2016/5/14/chartex" xmlns:mc="http://schemas.openxmlformats.org/markup-compatibility/2006" xmlns:aink="http://schemas.microsoft.com/office/drawing/2016/ink" xmlns:am3d="http://schemas.microsoft.com/office/drawing/2017/model3d" xmlns:o="urn:schemas-microsoft-com:office:office" xmlns:oel="http://schemas.microsoft.com/office/2019/extlst" xmlns:r="http://schemas.openxmlformats.org/officeDocument/2006/relationships" xmlns:m="http://schemas.openxmlformats.org/officeDocument/2006/math" xmlns:v="urn:schemas-microsoft-com:vml" xmlns:wp14="http://schemas.microsoft.com/office/word/2010/wordprocessingDrawing" xmlns:wp="http://schemas.openxmlformats.org/drawingml/2006/wordprocessingDrawing" xmlns:w10="urn:schemas-microsoft-com:office:word" xmlns:w="http://schemas.openxmlformats.org/wordprocessingml/2006/main" xmlns:w14="http://schemas.microsoft.com/office/word/2010/wordml" xmlns:w15="http://schemas.microsoft.com/office/word/2012/wordml" xmlns:w16cex="http://schemas.microsoft.com/office/word/2018/wordml/cex" xmlns:w16cid="http://schemas.microsoft.com/office/word/2016/wordml/cid" xmlns:w16="http://schemas.microsoft.com/office/word/2018/wordml" xmlns:w16du="http://schemas.microsoft.com/office/word/2023/wordml/word16du" xmlns:w16sdtdh="http://schemas.microsoft.com/office/word/2020/wordml/sdtdatahash" xmlns:w16sdtfl="http://schemas.microsoft.com/office/word/2024/wordml/sdtformatlock" xmlns:w16se="http://schemas.microsoft.com/office/word/2015/wordml/symex" xmlns:wpg="http://schemas.microsoft.com/office/word/2010/wordprocessingGroup" xmlns:wpi="http://schemas.microsoft.com/office/word/2010/wordprocessingInk" xmlns:wne="http://schemas.microsoft.com/office/word/2006/wordml" xmlns:wps="http://schemas.microsoft.com/office/word/2010/wordprocessingShape" mc:Ignorable="w14 w15 w16se w16cid w16 w16cex w16sdtdh w16sdtfl w16du wp14">
   <w:abstractNum w:abstractNumId="0" w15:restartNumberingAfterBreak="0">
+    <w:nsid w:val="02552376"/>
+    <w:multiLevelType w:val="multilevel"/>
+    <w:tmpl w:val="42EA97F0"/>
+    <w:lvl w:ilvl="0">
+      <w:start w:val="1"/>
+      <w:numFmt w:val="bullet"/>
+      <w:lvlText w:val=""/>
+      <w:lvlJc w:val="left"/>
+      <w:pPr>
+        <w:tabs>
+          <w:tab w:val="num" w:pos="720"/>
+        </w:tabs>
+        <w:ind w:left="720" w:hanging="360"/>
+      </w:pPr>
+      <w:rPr>
+        <w:rFonts w:ascii="Symbol" w:hAnsi="Symbol" w:hint="default"/>
+        <w:sz w:val="20"/>
+      </w:rPr>
+    </w:lvl>
+    <w:lvl w:ilvl="1" w:tentative="1">
+      <w:start w:val="1"/>
+      <w:numFmt w:val="bullet"/>
+      <w:lvlText w:val="o"/>
+      <w:lvlJc w:val="left"/>
+      <w:pPr>
+        <w:tabs>
+          <w:tab w:val="num" w:pos="1440"/>
+        </w:tabs>
+        <w:ind w:left="1440" w:hanging="360"/>
+      </w:pPr>
+      <w:rPr>
+        <w:rFonts w:ascii="Courier New" w:hAnsi="Courier New" w:hint="default"/>
+        <w:sz w:val="20"/>
+      </w:rPr>
+    </w:lvl>
+    <w:lvl w:ilvl="2" w:tentative="1">
+      <w:start w:val="1"/>
+      <w:numFmt w:val="bullet"/>
+      <w:lvlText w:val=""/>
+      <w:lvlJc w:val="left"/>
+      <w:pPr>
+        <w:tabs>
+          <w:tab w:val="num" w:pos="2160"/>
+        </w:tabs>
+        <w:ind w:left="2160" w:hanging="360"/>
+      </w:pPr>
+      <w:rPr>
+        <w:rFonts w:ascii="Wingdings" w:hAnsi="Wingdings" w:hint="default"/>
+        <w:sz w:val="20"/>
+      </w:rPr>
+    </w:lvl>
+    <w:lvl w:ilvl="3" w:tentative="1">
+      <w:start w:val="1"/>
+      <w:numFmt w:val="bullet"/>
+      <w:lvlText w:val=""/>
+      <w:lvlJc w:val="left"/>
+      <w:pPr>
+        <w:tabs>
+          <w:tab w:val="num" w:pos="2880"/>
+        </w:tabs>
+        <w:ind w:left="2880" w:hanging="360"/>
+      </w:pPr>
+      <w:rPr>
+        <w:rFonts w:ascii="Wingdings" w:hAnsi="Wingdings" w:hint="default"/>
+        <w:sz w:val="20"/>
+      </w:rPr>
+    </w:lvl>
+    <w:lvl w:ilvl="4" w:tentative="1">
+      <w:start w:val="1"/>
+      <w:numFmt w:val="bullet"/>
+      <w:lvlText w:val=""/>
+      <w:lvlJc w:val="left"/>
+      <w:pPr>
+        <w:tabs>
+          <w:tab w:val="num" w:pos="3600"/>
+        </w:tabs>
+        <w:ind w:left="3600" w:hanging="360"/>
+      </w:pPr>
+      <w:rPr>
+        <w:rFonts w:ascii="Wingdings" w:hAnsi="Wingdings" w:hint="default"/>
+        <w:sz w:val="20"/>
+      </w:rPr>
+    </w:lvl>
+    <w:lvl w:ilvl="5" w:tentative="1">
+      <w:start w:val="1"/>
+      <w:numFmt w:val="bullet"/>
+      <w:lvlText w:val=""/>
+      <w:lvlJc w:val="left"/>
+      <w:pPr>
+        <w:tabs>
+          <w:tab w:val="num" w:pos="4320"/>
+        </w:tabs>
+        <w:ind w:left="4320" w:hanging="360"/>
+      </w:pPr>
+      <w:rPr>
+        <w:rFonts w:ascii="Wingdings" w:hAnsi="Wingdings" w:hint="default"/>
+        <w:sz w:val="20"/>
+      </w:rPr>
+    </w:lvl>
+    <w:lvl w:ilvl="6" w:tentative="1">
+      <w:start w:val="1"/>
+      <w:numFmt w:val="bullet"/>
+      <w:lvlText w:val=""/>
+      <w:lvlJc w:val="left"/>
+      <w:pPr>
+        <w:tabs>
+          <w:tab w:val="num" w:pos="5040"/>
+        </w:tabs>
+        <w:ind w:left="5040" w:hanging="360"/>
+      </w:pPr>
+      <w:rPr>
+        <w:rFonts w:ascii="Wingdings" w:hAnsi="Wingdings" w:hint="default"/>
+        <w:sz w:val="20"/>
+      </w:rPr>
+    </w:lvl>
+    <w:lvl w:ilvl="7" w:tentative="1">
+      <w:start w:val="1"/>
+      <w:numFmt w:val="bullet"/>
+      <w:lvlText w:val=""/>
+      <w:lvlJc w:val="left"/>
+      <w:pPr>
+        <w:tabs>
+          <w:tab w:val="num" w:pos="5760"/>
+        </w:tabs>
+        <w:ind w:left="5760" w:hanging="360"/>
+      </w:pPr>
+      <w:rPr>
+        <w:rFonts w:ascii="Wingdings" w:hAnsi="Wingdings" w:hint="default"/>
+        <w:sz w:val="20"/>
+      </w:rPr>
+    </w:lvl>
+    <w:lvl w:ilvl="8" w:tentative="1">
+      <w:start w:val="1"/>
+      <w:numFmt w:val="bullet"/>
+      <w:lvlText w:val=""/>
+      <w:lvlJc w:val="left"/>
+      <w:pPr>
+        <w:tabs>
+          <w:tab w:val="num" w:pos="6480"/>
+        </w:tabs>
+        <w:ind w:left="6480" w:hanging="360"/>
+      </w:pPr>
+      <w:rPr>
+        <w:rFonts w:ascii="Wingdings" w:hAnsi="Wingdings" w:hint="default"/>
+        <w:sz w:val="20"/>
+      </w:rPr>
+    </w:lvl>
+  </w:abstractNum>
+  <w:abstractNum w:abstractNumId="1" w15:restartNumberingAfterBreak="0">
+    <w:nsid w:val="17C060EC"/>
+    <w:multiLevelType w:val="multilevel"/>
+    <w:tmpl w:val="1CA2C192"/>
+    <w:lvl w:ilvl="0">
+      <w:start w:val="1"/>
+      <w:numFmt w:val="bullet"/>
+      <w:lvlText w:val=""/>
+      <w:lvlJc w:val="left"/>
+      <w:pPr>
+        <w:tabs>
+          <w:tab w:val="num" w:pos="720"/>
+        </w:tabs>
+        <w:ind w:left="720" w:hanging="360"/>
+      </w:pPr>
+      <w:rPr>
+        <w:rFonts w:ascii="Symbol" w:hAnsi="Symbol" w:hint="default"/>
+        <w:sz w:val="20"/>
+      </w:rPr>
+    </w:lvl>
+    <w:lvl w:ilvl="1" w:tentative="1">
+      <w:start w:val="1"/>
+      <w:numFmt w:val="bullet"/>
+      <w:lvlText w:val="o"/>
+      <w:lvlJc w:val="left"/>
+      <w:pPr>
+        <w:tabs>
+          <w:tab w:val="num" w:pos="1440"/>
+        </w:tabs>
+        <w:ind w:left="1440" w:hanging="360"/>
+      </w:pPr>
+      <w:rPr>
+        <w:rFonts w:ascii="Courier New" w:hAnsi="Courier New" w:hint="default"/>
+        <w:sz w:val="20"/>
+      </w:rPr>
+    </w:lvl>
+    <w:lvl w:ilvl="2" w:tentative="1">
+      <w:start w:val="1"/>
+      <w:numFmt w:val="bullet"/>
+      <w:lvlText w:val=""/>
+      <w:lvlJc w:val="left"/>
+      <w:pPr>
+        <w:tabs>
+          <w:tab w:val="num" w:pos="2160"/>
+        </w:tabs>
+        <w:ind w:left="2160" w:hanging="360"/>
+      </w:pPr>
+      <w:rPr>
+        <w:rFonts w:ascii="Wingdings" w:hAnsi="Wingdings" w:hint="default"/>
+        <w:sz w:val="20"/>
+      </w:rPr>
+    </w:lvl>
+    <w:lvl w:ilvl="3" w:tentative="1">
+      <w:start w:val="1"/>
+      <w:numFmt w:val="bullet"/>
+      <w:lvlText w:val=""/>
+      <w:lvlJc w:val="left"/>
+      <w:pPr>
+        <w:tabs>
+          <w:tab w:val="num" w:pos="2880"/>
+        </w:tabs>
+        <w:ind w:left="2880" w:hanging="360"/>
+      </w:pPr>
+      <w:rPr>
+        <w:rFonts w:ascii="Wingdings" w:hAnsi="Wingdings" w:hint="default"/>
+        <w:sz w:val="20"/>
+      </w:rPr>
+    </w:lvl>
+    <w:lvl w:ilvl="4" w:tentative="1">
+      <w:start w:val="1"/>
+      <w:numFmt w:val="bullet"/>
+      <w:lvlText w:val=""/>
+      <w:lvlJc w:val="left"/>
+      <w:pPr>
+        <w:tabs>
+          <w:tab w:val="num" w:pos="3600"/>
+        </w:tabs>
+        <w:ind w:left="3600" w:hanging="360"/>
+      </w:pPr>
+      <w:rPr>
+        <w:rFonts w:ascii="Wingdings" w:hAnsi="Wingdings" w:hint="default"/>
+        <w:sz w:val="20"/>
+      </w:rPr>
+    </w:lvl>
+    <w:lvl w:ilvl="5" w:tentative="1">
+      <w:start w:val="1"/>
+      <w:numFmt w:val="bullet"/>
+      <w:lvlText w:val=""/>
+      <w:lvlJc w:val="left"/>
+      <w:pPr>
+        <w:tabs>
+          <w:tab w:val="num" w:pos="4320"/>
+        </w:tabs>
+        <w:ind w:left="4320" w:hanging="360"/>
+      </w:pPr>
+      <w:rPr>
+        <w:rFonts w:ascii="Wingdings" w:hAnsi="Wingdings" w:hint="default"/>
+        <w:sz w:val="20"/>
+      </w:rPr>
+    </w:lvl>
+    <w:lvl w:ilvl="6" w:tentative="1">
+      <w:start w:val="1"/>
+      <w:numFmt w:val="bullet"/>
+      <w:lvlText w:val=""/>
+      <w:lvlJc w:val="left"/>
+      <w:pPr>
+        <w:tabs>
+          <w:tab w:val="num" w:pos="5040"/>
+        </w:tabs>
+        <w:ind w:left="5040" w:hanging="360"/>
+      </w:pPr>
+      <w:rPr>
+        <w:rFonts w:ascii="Wingdings" w:hAnsi="Wingdings" w:hint="default"/>
+        <w:sz w:val="20"/>
+      </w:rPr>
+    </w:lvl>
+    <w:lvl w:ilvl="7" w:tentative="1">
+      <w:start w:val="1"/>
+      <w:numFmt w:val="bullet"/>
+      <w:lvlText w:val=""/>
+      <w:lvlJc w:val="left"/>
+      <w:pPr>
+        <w:tabs>
+          <w:tab w:val="num" w:pos="5760"/>
+        </w:tabs>
+        <w:ind w:left="5760" w:hanging="360"/>
+      </w:pPr>
+      <w:rPr>
+        <w:rFonts w:ascii="Wingdings" w:hAnsi="Wingdings" w:hint="default"/>
+        <w:sz w:val="20"/>
+      </w:rPr>
+    </w:lvl>
+    <w:lvl w:ilvl="8" w:tentative="1">
+      <w:start w:val="1"/>
+      <w:numFmt w:val="bullet"/>
+      <w:lvlText w:val=""/>
+      <w:lvlJc w:val="left"/>
+      <w:pPr>
+        <w:tabs>
+          <w:tab w:val="num" w:pos="6480"/>
+        </w:tabs>
+        <w:ind w:left="6480" w:hanging="360"/>
+      </w:pPr>
+      <w:rPr>
+        <w:rFonts w:ascii="Wingdings" w:hAnsi="Wingdings" w:hint="default"/>
+        <w:sz w:val="20"/>
+      </w:rPr>
+    </w:lvl>
+  </w:abstractNum>
+  <w:abstractNum w:abstractNumId="2" w15:restartNumberingAfterBreak="0">
     <w:nsid w:val="1C313645"/>
     <w:multiLevelType w:val="multilevel"/>
     <w:tmpl w:val="45682496"/>
@@ -403,7 +1225,7 @@
       </w:rPr>
     </w:lvl>
   </w:abstractNum>
-  <w:abstractNum w:abstractNumId="1" w15:restartNumberingAfterBreak="0">
+  <w:abstractNum w:abstractNumId="3" w15:restartNumberingAfterBreak="0">
     <w:nsid w:val="26106C50"/>
     <w:multiLevelType w:val="multilevel"/>
     <w:tmpl w:val="D9869F06"/>
@@ -516,7 +1338,454 @@
       </w:pPr>
     </w:lvl>
   </w:abstractNum>
-  <w:abstractNum w:abstractNumId="2" w15:restartNumberingAfterBreak="0">
+  <w:abstractNum w:abstractNumId="4" w15:restartNumberingAfterBreak="0">
+    <w:nsid w:val="2F643968"/>
+    <w:multiLevelType w:val="multilevel"/>
+    <w:tmpl w:val="398CF822"/>
+    <w:lvl w:ilvl="0">
+      <w:start w:val="1"/>
+      <w:numFmt w:val="bullet"/>
+      <w:lvlText w:val=""/>
+      <w:lvlJc w:val="left"/>
+      <w:pPr>
+        <w:tabs>
+          <w:tab w:val="num" w:pos="720"/>
+        </w:tabs>
+        <w:ind w:left="720" w:hanging="360"/>
+      </w:pPr>
+      <w:rPr>
+        <w:rFonts w:ascii="Symbol" w:hAnsi="Symbol" w:hint="default"/>
+        <w:sz w:val="20"/>
+      </w:rPr>
+    </w:lvl>
+    <w:lvl w:ilvl="1" w:tentative="1">
+      <w:start w:val="1"/>
+      <w:numFmt w:val="bullet"/>
+      <w:lvlText w:val="o"/>
+      <w:lvlJc w:val="left"/>
+      <w:pPr>
+        <w:tabs>
+          <w:tab w:val="num" w:pos="1440"/>
+        </w:tabs>
+        <w:ind w:left="1440" w:hanging="360"/>
+      </w:pPr>
+      <w:rPr>
+        <w:rFonts w:ascii="Courier New" w:hAnsi="Courier New" w:hint="default"/>
+        <w:sz w:val="20"/>
+      </w:rPr>
+    </w:lvl>
+    <w:lvl w:ilvl="2" w:tentative="1">
+      <w:start w:val="1"/>
+      <w:numFmt w:val="bullet"/>
+      <w:lvlText w:val=""/>
+      <w:lvlJc w:val="left"/>
+      <w:pPr>
+        <w:tabs>
+          <w:tab w:val="num" w:pos="2160"/>
+        </w:tabs>
+        <w:ind w:left="2160" w:hanging="360"/>
+      </w:pPr>
+      <w:rPr>
+        <w:rFonts w:ascii="Wingdings" w:hAnsi="Wingdings" w:hint="default"/>
+        <w:sz w:val="20"/>
+      </w:rPr>
+    </w:lvl>
+    <w:lvl w:ilvl="3" w:tentative="1">
+      <w:start w:val="1"/>
+      <w:numFmt w:val="bullet"/>
+      <w:lvlText w:val=""/>
+      <w:lvlJc w:val="left"/>
+      <w:pPr>
+        <w:tabs>
+          <w:tab w:val="num" w:pos="2880"/>
+        </w:tabs>
+        <w:ind w:left="2880" w:hanging="360"/>
+      </w:pPr>
+      <w:rPr>
+        <w:rFonts w:ascii="Wingdings" w:hAnsi="Wingdings" w:hint="default"/>
+        <w:sz w:val="20"/>
+      </w:rPr>
+    </w:lvl>
+    <w:lvl w:ilvl="4" w:tentative="1">
+      <w:start w:val="1"/>
+      <w:numFmt w:val="bullet"/>
+      <w:lvlText w:val=""/>
+      <w:lvlJc w:val="left"/>
+      <w:pPr>
+        <w:tabs>
+          <w:tab w:val="num" w:pos="3600"/>
+        </w:tabs>
+        <w:ind w:left="3600" w:hanging="360"/>
+      </w:pPr>
+      <w:rPr>
+        <w:rFonts w:ascii="Wingdings" w:hAnsi="Wingdings" w:hint="default"/>
+        <w:sz w:val="20"/>
+      </w:rPr>
+    </w:lvl>
+    <w:lvl w:ilvl="5" w:tentative="1">
+      <w:start w:val="1"/>
+      <w:numFmt w:val="bullet"/>
+      <w:lvlText w:val=""/>
+      <w:lvlJc w:val="left"/>
+      <w:pPr>
+        <w:tabs>
+          <w:tab w:val="num" w:pos="4320"/>
+        </w:tabs>
+        <w:ind w:left="4320" w:hanging="360"/>
+      </w:pPr>
+      <w:rPr>
+        <w:rFonts w:ascii="Wingdings" w:hAnsi="Wingdings" w:hint="default"/>
+        <w:sz w:val="20"/>
+      </w:rPr>
+    </w:lvl>
+    <w:lvl w:ilvl="6" w:tentative="1">
+      <w:start w:val="1"/>
+      <w:numFmt w:val="bullet"/>
+      <w:lvlText w:val=""/>
+      <w:lvlJc w:val="left"/>
+      <w:pPr>
+        <w:tabs>
+          <w:tab w:val="num" w:pos="5040"/>
+        </w:tabs>
+        <w:ind w:left="5040" w:hanging="360"/>
+      </w:pPr>
+      <w:rPr>
+        <w:rFonts w:ascii="Wingdings" w:hAnsi="Wingdings" w:hint="default"/>
+        <w:sz w:val="20"/>
+      </w:rPr>
+    </w:lvl>
+    <w:lvl w:ilvl="7" w:tentative="1">
+      <w:start w:val="1"/>
+      <w:numFmt w:val="bullet"/>
+      <w:lvlText w:val=""/>
+      <w:lvlJc w:val="left"/>
+      <w:pPr>
+        <w:tabs>
+          <w:tab w:val="num" w:pos="5760"/>
+        </w:tabs>
+        <w:ind w:left="5760" w:hanging="360"/>
+      </w:pPr>
+      <w:rPr>
+        <w:rFonts w:ascii="Wingdings" w:hAnsi="Wingdings" w:hint="default"/>
+        <w:sz w:val="20"/>
+      </w:rPr>
+    </w:lvl>
+    <w:lvl w:ilvl="8" w:tentative="1">
+      <w:start w:val="1"/>
+      <w:numFmt w:val="bullet"/>
+      <w:lvlText w:val=""/>
+      <w:lvlJc w:val="left"/>
+      <w:pPr>
+        <w:tabs>
+          <w:tab w:val="num" w:pos="6480"/>
+        </w:tabs>
+        <w:ind w:left="6480" w:hanging="360"/>
+      </w:pPr>
+      <w:rPr>
+        <w:rFonts w:ascii="Wingdings" w:hAnsi="Wingdings" w:hint="default"/>
+        <w:sz w:val="20"/>
+      </w:rPr>
+    </w:lvl>
+  </w:abstractNum>
+  <w:abstractNum w:abstractNumId="5" w15:restartNumberingAfterBreak="0">
+    <w:nsid w:val="37562966"/>
+    <w:multiLevelType w:val="multilevel"/>
+    <w:tmpl w:val="D2EE95EE"/>
+    <w:lvl w:ilvl="0">
+      <w:start w:val="1"/>
+      <w:numFmt w:val="bullet"/>
+      <w:lvlText w:val=""/>
+      <w:lvlJc w:val="left"/>
+      <w:pPr>
+        <w:tabs>
+          <w:tab w:val="num" w:pos="720"/>
+        </w:tabs>
+        <w:ind w:left="720" w:hanging="360"/>
+      </w:pPr>
+      <w:rPr>
+        <w:rFonts w:ascii="Symbol" w:hAnsi="Symbol" w:hint="default"/>
+        <w:sz w:val="20"/>
+      </w:rPr>
+    </w:lvl>
+    <w:lvl w:ilvl="1" w:tentative="1">
+      <w:start w:val="1"/>
+      <w:numFmt w:val="bullet"/>
+      <w:lvlText w:val="o"/>
+      <w:lvlJc w:val="left"/>
+      <w:pPr>
+        <w:tabs>
+          <w:tab w:val="num" w:pos="1440"/>
+        </w:tabs>
+        <w:ind w:left="1440" w:hanging="360"/>
+      </w:pPr>
+      <w:rPr>
+        <w:rFonts w:ascii="Courier New" w:hAnsi="Courier New" w:hint="default"/>
+        <w:sz w:val="20"/>
+      </w:rPr>
+    </w:lvl>
+    <w:lvl w:ilvl="2" w:tentative="1">
+      <w:start w:val="1"/>
+      <w:numFmt w:val="bullet"/>
+      <w:lvlText w:val=""/>
+      <w:lvlJc w:val="left"/>
+      <w:pPr>
+        <w:tabs>
+          <w:tab w:val="num" w:pos="2160"/>
+        </w:tabs>
+        <w:ind w:left="2160" w:hanging="360"/>
+      </w:pPr>
+      <w:rPr>
+        <w:rFonts w:ascii="Wingdings" w:hAnsi="Wingdings" w:hint="default"/>
+        <w:sz w:val="20"/>
+      </w:rPr>
+    </w:lvl>
+    <w:lvl w:ilvl="3" w:tentative="1">
+      <w:start w:val="1"/>
+      <w:numFmt w:val="bullet"/>
+      <w:lvlText w:val=""/>
+      <w:lvlJc w:val="left"/>
+      <w:pPr>
+        <w:tabs>
+          <w:tab w:val="num" w:pos="2880"/>
+        </w:tabs>
+        <w:ind w:left="2880" w:hanging="360"/>
+      </w:pPr>
+      <w:rPr>
+        <w:rFonts w:ascii="Wingdings" w:hAnsi="Wingdings" w:hint="default"/>
+        <w:sz w:val="20"/>
+      </w:rPr>
+    </w:lvl>
+    <w:lvl w:ilvl="4" w:tentative="1">
+      <w:start w:val="1"/>
+      <w:numFmt w:val="bullet"/>
+      <w:lvlText w:val=""/>
+      <w:lvlJc w:val="left"/>
+      <w:pPr>
+        <w:tabs>
+          <w:tab w:val="num" w:pos="3600"/>
+        </w:tabs>
+        <w:ind w:left="3600" w:hanging="360"/>
+      </w:pPr>
+      <w:rPr>
+        <w:rFonts w:ascii="Wingdings" w:hAnsi="Wingdings" w:hint="default"/>
+        <w:sz w:val="20"/>
+      </w:rPr>
+    </w:lvl>
+    <w:lvl w:ilvl="5" w:tentative="1">
+      <w:start w:val="1"/>
+      <w:numFmt w:val="bullet"/>
+      <w:lvlText w:val=""/>
+      <w:lvlJc w:val="left"/>
+      <w:pPr>
+        <w:tabs>
+          <w:tab w:val="num" w:pos="4320"/>
+        </w:tabs>
+        <w:ind w:left="4320" w:hanging="360"/>
+      </w:pPr>
+      <w:rPr>
+        <w:rFonts w:ascii="Wingdings" w:hAnsi="Wingdings" w:hint="default"/>
+        <w:sz w:val="20"/>
+      </w:rPr>
+    </w:lvl>
+    <w:lvl w:ilvl="6" w:tentative="1">
+      <w:start w:val="1"/>
+      <w:numFmt w:val="bullet"/>
+      <w:lvlText w:val=""/>
+      <w:lvlJc w:val="left"/>
+      <w:pPr>
+        <w:tabs>
+          <w:tab w:val="num" w:pos="5040"/>
+        </w:tabs>
+        <w:ind w:left="5040" w:hanging="360"/>
+      </w:pPr>
+      <w:rPr>
+        <w:rFonts w:ascii="Wingdings" w:hAnsi="Wingdings" w:hint="default"/>
+        <w:sz w:val="20"/>
+      </w:rPr>
+    </w:lvl>
+    <w:lvl w:ilvl="7" w:tentative="1">
+      <w:start w:val="1"/>
+      <w:numFmt w:val="bullet"/>
+      <w:lvlText w:val=""/>
+      <w:lvlJc w:val="left"/>
+      <w:pPr>
+        <w:tabs>
+          <w:tab w:val="num" w:pos="5760"/>
+        </w:tabs>
+        <w:ind w:left="5760" w:hanging="360"/>
+      </w:pPr>
+      <w:rPr>
+        <w:rFonts w:ascii="Wingdings" w:hAnsi="Wingdings" w:hint="default"/>
+        <w:sz w:val="20"/>
+      </w:rPr>
+    </w:lvl>
+    <w:lvl w:ilvl="8" w:tentative="1">
+      <w:start w:val="1"/>
+      <w:numFmt w:val="bullet"/>
+      <w:lvlText w:val=""/>
+      <w:lvlJc w:val="left"/>
+      <w:pPr>
+        <w:tabs>
+          <w:tab w:val="num" w:pos="6480"/>
+        </w:tabs>
+        <w:ind w:left="6480" w:hanging="360"/>
+      </w:pPr>
+      <w:rPr>
+        <w:rFonts w:ascii="Wingdings" w:hAnsi="Wingdings" w:hint="default"/>
+        <w:sz w:val="20"/>
+      </w:rPr>
+    </w:lvl>
+  </w:abstractNum>
+  <w:abstractNum w:abstractNumId="6" w15:restartNumberingAfterBreak="0">
+    <w:nsid w:val="37C65F6E"/>
+    <w:multiLevelType w:val="multilevel"/>
+    <w:tmpl w:val="9E188722"/>
+    <w:lvl w:ilvl="0">
+      <w:start w:val="1"/>
+      <w:numFmt w:val="bullet"/>
+      <w:lvlText w:val=""/>
+      <w:lvlJc w:val="left"/>
+      <w:pPr>
+        <w:tabs>
+          <w:tab w:val="num" w:pos="720"/>
+        </w:tabs>
+        <w:ind w:left="720" w:hanging="360"/>
+      </w:pPr>
+      <w:rPr>
+        <w:rFonts w:ascii="Symbol" w:hAnsi="Symbol" w:hint="default"/>
+        <w:sz w:val="20"/>
+      </w:rPr>
+    </w:lvl>
+    <w:lvl w:ilvl="1" w:tentative="1">
+      <w:start w:val="1"/>
+      <w:numFmt w:val="bullet"/>
+      <w:lvlText w:val="o"/>
+      <w:lvlJc w:val="left"/>
+      <w:pPr>
+        <w:tabs>
+          <w:tab w:val="num" w:pos="1440"/>
+        </w:tabs>
+        <w:ind w:left="1440" w:hanging="360"/>
+      </w:pPr>
+      <w:rPr>
+        <w:rFonts w:ascii="Courier New" w:hAnsi="Courier New" w:hint="default"/>
+        <w:sz w:val="20"/>
+      </w:rPr>
+    </w:lvl>
+    <w:lvl w:ilvl="2" w:tentative="1">
+      <w:start w:val="1"/>
+      <w:numFmt w:val="bullet"/>
+      <w:lvlText w:val=""/>
+      <w:lvlJc w:val="left"/>
+      <w:pPr>
+        <w:tabs>
+          <w:tab w:val="num" w:pos="2160"/>
+        </w:tabs>
+        <w:ind w:left="2160" w:hanging="360"/>
+      </w:pPr>
+      <w:rPr>
+        <w:rFonts w:ascii="Wingdings" w:hAnsi="Wingdings" w:hint="default"/>
+        <w:sz w:val="20"/>
+      </w:rPr>
+    </w:lvl>
+    <w:lvl w:ilvl="3" w:tentative="1">
+      <w:start w:val="1"/>
+      <w:numFmt w:val="bullet"/>
+      <w:lvlText w:val=""/>
+      <w:lvlJc w:val="left"/>
+      <w:pPr>
+        <w:tabs>
+          <w:tab w:val="num" w:pos="2880"/>
+        </w:tabs>
+        <w:ind w:left="2880" w:hanging="360"/>
+      </w:pPr>
+      <w:rPr>
+        <w:rFonts w:ascii="Wingdings" w:hAnsi="Wingdings" w:hint="default"/>
+        <w:sz w:val="20"/>
+      </w:rPr>
+    </w:lvl>
+    <w:lvl w:ilvl="4" w:tentative="1">
+      <w:start w:val="1"/>
+      <w:numFmt w:val="bullet"/>
+      <w:lvlText w:val=""/>
+      <w:lvlJc w:val="left"/>
+      <w:pPr>
+        <w:tabs>
+          <w:tab w:val="num" w:pos="3600"/>
+        </w:tabs>
+        <w:ind w:left="3600" w:hanging="360"/>
+      </w:pPr>
+      <w:rPr>
+        <w:rFonts w:ascii="Wingdings" w:hAnsi="Wingdings" w:hint="default"/>
+        <w:sz w:val="20"/>
+      </w:rPr>
+    </w:lvl>
+    <w:lvl w:ilvl="5" w:tentative="1">
+      <w:start w:val="1"/>
+      <w:numFmt w:val="bullet"/>
+      <w:lvlText w:val=""/>
+      <w:lvlJc w:val="left"/>
+      <w:pPr>
+        <w:tabs>
+          <w:tab w:val="num" w:pos="4320"/>
+        </w:tabs>
+        <w:ind w:left="4320" w:hanging="360"/>
+      </w:pPr>
+      <w:rPr>
+        <w:rFonts w:ascii="Wingdings" w:hAnsi="Wingdings" w:hint="default"/>
+        <w:sz w:val="20"/>
+      </w:rPr>
+    </w:lvl>
+    <w:lvl w:ilvl="6" w:tentative="1">
+      <w:start w:val="1"/>
+      <w:numFmt w:val="bullet"/>
+      <w:lvlText w:val=""/>
+      <w:lvlJc w:val="left"/>
+      <w:pPr>
+        <w:tabs>
+          <w:tab w:val="num" w:pos="5040"/>
+        </w:tabs>
+        <w:ind w:left="5040" w:hanging="360"/>
+      </w:pPr>
+      <w:rPr>
+        <w:rFonts w:ascii="Wingdings" w:hAnsi="Wingdings" w:hint="default"/>
+        <w:sz w:val="20"/>
+      </w:rPr>
+    </w:lvl>
+    <w:lvl w:ilvl="7" w:tentative="1">
+      <w:start w:val="1"/>
+      <w:numFmt w:val="bullet"/>
+      <w:lvlText w:val=""/>
+      <w:lvlJc w:val="left"/>
+      <w:pPr>
+        <w:tabs>
+          <w:tab w:val="num" w:pos="5760"/>
+        </w:tabs>
+        <w:ind w:left="5760" w:hanging="360"/>
+      </w:pPr>
+      <w:rPr>
+        <w:rFonts w:ascii="Wingdings" w:hAnsi="Wingdings" w:hint="default"/>
+        <w:sz w:val="20"/>
+      </w:rPr>
+    </w:lvl>
+    <w:lvl w:ilvl="8" w:tentative="1">
+      <w:start w:val="1"/>
+      <w:numFmt w:val="bullet"/>
+      <w:lvlText w:val=""/>
+      <w:lvlJc w:val="left"/>
+      <w:pPr>
+        <w:tabs>
+          <w:tab w:val="num" w:pos="6480"/>
+        </w:tabs>
+        <w:ind w:left="6480" w:hanging="360"/>
+      </w:pPr>
+      <w:rPr>
+        <w:rFonts w:ascii="Wingdings" w:hAnsi="Wingdings" w:hint="default"/>
+        <w:sz w:val="20"/>
+      </w:rPr>
+    </w:lvl>
+  </w:abstractNum>
+  <w:abstractNum w:abstractNumId="7" w15:restartNumberingAfterBreak="0">
     <w:nsid w:val="384C78CB"/>
     <w:multiLevelType w:val="multilevel"/>
     <w:tmpl w:val="9BE65B8E"/>
@@ -607,7 +1876,156 @@
       </w:pPr>
     </w:lvl>
   </w:abstractNum>
-  <w:abstractNum w:abstractNumId="3" w15:restartNumberingAfterBreak="0">
+  <w:abstractNum w:abstractNumId="8" w15:restartNumberingAfterBreak="0">
+    <w:nsid w:val="3858393F"/>
+    <w:multiLevelType w:val="multilevel"/>
+    <w:tmpl w:val="E7DC6810"/>
+    <w:lvl w:ilvl="0">
+      <w:start w:val="1"/>
+      <w:numFmt w:val="bullet"/>
+      <w:lvlText w:val=""/>
+      <w:lvlJc w:val="left"/>
+      <w:pPr>
+        <w:tabs>
+          <w:tab w:val="num" w:pos="720"/>
+        </w:tabs>
+        <w:ind w:left="720" w:hanging="360"/>
+      </w:pPr>
+      <w:rPr>
+        <w:rFonts w:ascii="Symbol" w:hAnsi="Symbol" w:hint="default"/>
+        <w:sz w:val="20"/>
+      </w:rPr>
+    </w:lvl>
+    <w:lvl w:ilvl="1" w:tentative="1">
+      <w:start w:val="1"/>
+      <w:numFmt w:val="bullet"/>
+      <w:lvlText w:val="o"/>
+      <w:lvlJc w:val="left"/>
+      <w:pPr>
+        <w:tabs>
+          <w:tab w:val="num" w:pos="1440"/>
+        </w:tabs>
+        <w:ind w:left="1440" w:hanging="360"/>
+      </w:pPr>
+      <w:rPr>
+        <w:rFonts w:ascii="Courier New" w:hAnsi="Courier New" w:hint="default"/>
+        <w:sz w:val="20"/>
+      </w:rPr>
+    </w:lvl>
+    <w:lvl w:ilvl="2" w:tentative="1">
+      <w:start w:val="1"/>
+      <w:numFmt w:val="bullet"/>
+      <w:lvlText w:val=""/>
+      <w:lvlJc w:val="left"/>
+      <w:pPr>
+        <w:tabs>
+          <w:tab w:val="num" w:pos="2160"/>
+        </w:tabs>
+        <w:ind w:left="2160" w:hanging="360"/>
+      </w:pPr>
+      <w:rPr>
+        <w:rFonts w:ascii="Wingdings" w:hAnsi="Wingdings" w:hint="default"/>
+        <w:sz w:val="20"/>
+      </w:rPr>
+    </w:lvl>
+    <w:lvl w:ilvl="3" w:tentative="1">
+      <w:start w:val="1"/>
+      <w:numFmt w:val="bullet"/>
+      <w:lvlText w:val=""/>
+      <w:lvlJc w:val="left"/>
+      <w:pPr>
+        <w:tabs>
+          <w:tab w:val="num" w:pos="2880"/>
+        </w:tabs>
+        <w:ind w:left="2880" w:hanging="360"/>
+      </w:pPr>
+      <w:rPr>
+        <w:rFonts w:ascii="Wingdings" w:hAnsi="Wingdings" w:hint="default"/>
+        <w:sz w:val="20"/>
+      </w:rPr>
+    </w:lvl>
+    <w:lvl w:ilvl="4" w:tentative="1">
+      <w:start w:val="1"/>
+      <w:numFmt w:val="bullet"/>
+      <w:lvlText w:val=""/>
+      <w:lvlJc w:val="left"/>
+      <w:pPr>
+        <w:tabs>
+          <w:tab w:val="num" w:pos="3600"/>
+        </w:tabs>
+        <w:ind w:left="3600" w:hanging="360"/>
+      </w:pPr>
+      <w:rPr>
+        <w:rFonts w:ascii="Wingdings" w:hAnsi="Wingdings" w:hint="default"/>
+        <w:sz w:val="20"/>
+      </w:rPr>
+    </w:lvl>
+    <w:lvl w:ilvl="5" w:tentative="1">
+      <w:start w:val="1"/>
+      <w:numFmt w:val="bullet"/>
+      <w:lvlText w:val=""/>
+      <w:lvlJc w:val="left"/>
+      <w:pPr>
+        <w:tabs>
+          <w:tab w:val="num" w:pos="4320"/>
+        </w:tabs>
+        <w:ind w:left="4320" w:hanging="360"/>
+      </w:pPr>
+      <w:rPr>
+        <w:rFonts w:ascii="Wingdings" w:hAnsi="Wingdings" w:hint="default"/>
+        <w:sz w:val="20"/>
+      </w:rPr>
+    </w:lvl>
+    <w:lvl w:ilvl="6" w:tentative="1">
+      <w:start w:val="1"/>
+      <w:numFmt w:val="bullet"/>
+      <w:lvlText w:val=""/>
+      <w:lvlJc w:val="left"/>
+      <w:pPr>
+        <w:tabs>
+          <w:tab w:val="num" w:pos="5040"/>
+        </w:tabs>
+        <w:ind w:left="5040" w:hanging="360"/>
+      </w:pPr>
+      <w:rPr>
+        <w:rFonts w:ascii="Wingdings" w:hAnsi="Wingdings" w:hint="default"/>
+        <w:sz w:val="20"/>
+      </w:rPr>
+    </w:lvl>
+    <w:lvl w:ilvl="7" w:tentative="1">
+      <w:start w:val="1"/>
+      <w:numFmt w:val="bullet"/>
+      <w:lvlText w:val=""/>
+      <w:lvlJc w:val="left"/>
+      <w:pPr>
+        <w:tabs>
+          <w:tab w:val="num" w:pos="5760"/>
+        </w:tabs>
+        <w:ind w:left="5760" w:hanging="360"/>
+      </w:pPr>
+      <w:rPr>
+        <w:rFonts w:ascii="Wingdings" w:hAnsi="Wingdings" w:hint="default"/>
+        <w:sz w:val="20"/>
+      </w:rPr>
+    </w:lvl>
+    <w:lvl w:ilvl="8" w:tentative="1">
+      <w:start w:val="1"/>
+      <w:numFmt w:val="bullet"/>
+      <w:lvlText w:val=""/>
+      <w:lvlJc w:val="left"/>
+      <w:pPr>
+        <w:tabs>
+          <w:tab w:val="num" w:pos="6480"/>
+        </w:tabs>
+        <w:ind w:left="6480" w:hanging="360"/>
+      </w:pPr>
+      <w:rPr>
+        <w:rFonts w:ascii="Wingdings" w:hAnsi="Wingdings" w:hint="default"/>
+        <w:sz w:val="20"/>
+      </w:rPr>
+    </w:lvl>
+  </w:abstractNum>
+  <w:abstractNum w:abstractNumId="9" w15:restartNumberingAfterBreak="0">
     <w:nsid w:val="41BA488D"/>
     <w:multiLevelType w:val="multilevel"/>
     <w:tmpl w:val="4260AB64"/>
@@ -693,7 +2111,603 @@
       </w:pPr>
     </w:lvl>
   </w:abstractNum>
-  <w:abstractNum w:abstractNumId="4" w15:restartNumberingAfterBreak="0">
+  <w:abstractNum w:abstractNumId="10" w15:restartNumberingAfterBreak="0">
+    <w:nsid w:val="41E82BAE"/>
+    <w:multiLevelType w:val="multilevel"/>
+    <w:tmpl w:val="BB2AC3EC"/>
+    <w:lvl w:ilvl="0">
+      <w:start w:val="1"/>
+      <w:numFmt w:val="bullet"/>
+      <w:lvlText w:val=""/>
+      <w:lvlJc w:val="left"/>
+      <w:pPr>
+        <w:tabs>
+          <w:tab w:val="num" w:pos="720"/>
+        </w:tabs>
+        <w:ind w:left="720" w:hanging="360"/>
+      </w:pPr>
+      <w:rPr>
+        <w:rFonts w:ascii="Symbol" w:hAnsi="Symbol" w:hint="default"/>
+        <w:sz w:val="20"/>
+      </w:rPr>
+    </w:lvl>
+    <w:lvl w:ilvl="1" w:tentative="1">
+      <w:start w:val="1"/>
+      <w:numFmt w:val="bullet"/>
+      <w:lvlText w:val="o"/>
+      <w:lvlJc w:val="left"/>
+      <w:pPr>
+        <w:tabs>
+          <w:tab w:val="num" w:pos="1440"/>
+        </w:tabs>
+        <w:ind w:left="1440" w:hanging="360"/>
+      </w:pPr>
+      <w:rPr>
+        <w:rFonts w:ascii="Courier New" w:hAnsi="Courier New" w:hint="default"/>
+        <w:sz w:val="20"/>
+      </w:rPr>
+    </w:lvl>
+    <w:lvl w:ilvl="2" w:tentative="1">
+      <w:start w:val="1"/>
+      <w:numFmt w:val="bullet"/>
+      <w:lvlText w:val=""/>
+      <w:lvlJc w:val="left"/>
+      <w:pPr>
+        <w:tabs>
+          <w:tab w:val="num" w:pos="2160"/>
+        </w:tabs>
+        <w:ind w:left="2160" w:hanging="360"/>
+      </w:pPr>
+      <w:rPr>
+        <w:rFonts w:ascii="Wingdings" w:hAnsi="Wingdings" w:hint="default"/>
+        <w:sz w:val="20"/>
+      </w:rPr>
+    </w:lvl>
+    <w:lvl w:ilvl="3" w:tentative="1">
+      <w:start w:val="1"/>
+      <w:numFmt w:val="bullet"/>
+      <w:lvlText w:val=""/>
+      <w:lvlJc w:val="left"/>
+      <w:pPr>
+        <w:tabs>
+          <w:tab w:val="num" w:pos="2880"/>
+        </w:tabs>
+        <w:ind w:left="2880" w:hanging="360"/>
+      </w:pPr>
+      <w:rPr>
+        <w:rFonts w:ascii="Wingdings" w:hAnsi="Wingdings" w:hint="default"/>
+        <w:sz w:val="20"/>
+      </w:rPr>
+    </w:lvl>
+    <w:lvl w:ilvl="4" w:tentative="1">
+      <w:start w:val="1"/>
+      <w:numFmt w:val="bullet"/>
+      <w:lvlText w:val=""/>
+      <w:lvlJc w:val="left"/>
+      <w:pPr>
+        <w:tabs>
+          <w:tab w:val="num" w:pos="3600"/>
+        </w:tabs>
+        <w:ind w:left="3600" w:hanging="360"/>
+      </w:pPr>
+      <w:rPr>
+        <w:rFonts w:ascii="Wingdings" w:hAnsi="Wingdings" w:hint="default"/>
+        <w:sz w:val="20"/>
+      </w:rPr>
+    </w:lvl>
+    <w:lvl w:ilvl="5" w:tentative="1">
+      <w:start w:val="1"/>
+      <w:numFmt w:val="bullet"/>
+      <w:lvlText w:val=""/>
+      <w:lvlJc w:val="left"/>
+      <w:pPr>
+        <w:tabs>
+          <w:tab w:val="num" w:pos="4320"/>
+        </w:tabs>
+        <w:ind w:left="4320" w:hanging="360"/>
+      </w:pPr>
+      <w:rPr>
+        <w:rFonts w:ascii="Wingdings" w:hAnsi="Wingdings" w:hint="default"/>
+        <w:sz w:val="20"/>
+      </w:rPr>
+    </w:lvl>
+    <w:lvl w:ilvl="6" w:tentative="1">
+      <w:start w:val="1"/>
+      <w:numFmt w:val="bullet"/>
+      <w:lvlText w:val=""/>
+      <w:lvlJc w:val="left"/>
+      <w:pPr>
+        <w:tabs>
+          <w:tab w:val="num" w:pos="5040"/>
+        </w:tabs>
+        <w:ind w:left="5040" w:hanging="360"/>
+      </w:pPr>
+      <w:rPr>
+        <w:rFonts w:ascii="Wingdings" w:hAnsi="Wingdings" w:hint="default"/>
+        <w:sz w:val="20"/>
+      </w:rPr>
+    </w:lvl>
+    <w:lvl w:ilvl="7" w:tentative="1">
+      <w:start w:val="1"/>
+      <w:numFmt w:val="bullet"/>
+      <w:lvlText w:val=""/>
+      <w:lvlJc w:val="left"/>
+      <w:pPr>
+        <w:tabs>
+          <w:tab w:val="num" w:pos="5760"/>
+        </w:tabs>
+        <w:ind w:left="5760" w:hanging="360"/>
+      </w:pPr>
+      <w:rPr>
+        <w:rFonts w:ascii="Wingdings" w:hAnsi="Wingdings" w:hint="default"/>
+        <w:sz w:val="20"/>
+      </w:rPr>
+    </w:lvl>
+    <w:lvl w:ilvl="8" w:tentative="1">
+      <w:start w:val="1"/>
+      <w:numFmt w:val="bullet"/>
+      <w:lvlText w:val=""/>
+      <w:lvlJc w:val="left"/>
+      <w:pPr>
+        <w:tabs>
+          <w:tab w:val="num" w:pos="6480"/>
+        </w:tabs>
+        <w:ind w:left="6480" w:hanging="360"/>
+      </w:pPr>
+      <w:rPr>
+        <w:rFonts w:ascii="Wingdings" w:hAnsi="Wingdings" w:hint="default"/>
+        <w:sz w:val="20"/>
+      </w:rPr>
+    </w:lvl>
+  </w:abstractNum>
+  <w:abstractNum w:abstractNumId="11" w15:restartNumberingAfterBreak="0">
+    <w:nsid w:val="4A7776E7"/>
+    <w:multiLevelType w:val="multilevel"/>
+    <w:tmpl w:val="BCE07874"/>
+    <w:lvl w:ilvl="0">
+      <w:start w:val="1"/>
+      <w:numFmt w:val="bullet"/>
+      <w:lvlText w:val=""/>
+      <w:lvlJc w:val="left"/>
+      <w:pPr>
+        <w:tabs>
+          <w:tab w:val="num" w:pos="720"/>
+        </w:tabs>
+        <w:ind w:left="720" w:hanging="360"/>
+      </w:pPr>
+      <w:rPr>
+        <w:rFonts w:ascii="Symbol" w:hAnsi="Symbol" w:hint="default"/>
+        <w:sz w:val="20"/>
+      </w:rPr>
+    </w:lvl>
+    <w:lvl w:ilvl="1" w:tentative="1">
+      <w:start w:val="1"/>
+      <w:numFmt w:val="bullet"/>
+      <w:lvlText w:val="o"/>
+      <w:lvlJc w:val="left"/>
+      <w:pPr>
+        <w:tabs>
+          <w:tab w:val="num" w:pos="1440"/>
+        </w:tabs>
+        <w:ind w:left="1440" w:hanging="360"/>
+      </w:pPr>
+      <w:rPr>
+        <w:rFonts w:ascii="Courier New" w:hAnsi="Courier New" w:hint="default"/>
+        <w:sz w:val="20"/>
+      </w:rPr>
+    </w:lvl>
+    <w:lvl w:ilvl="2" w:tentative="1">
+      <w:start w:val="1"/>
+      <w:numFmt w:val="bullet"/>
+      <w:lvlText w:val=""/>
+      <w:lvlJc w:val="left"/>
+      <w:pPr>
+        <w:tabs>
+          <w:tab w:val="num" w:pos="2160"/>
+        </w:tabs>
+        <w:ind w:left="2160" w:hanging="360"/>
+      </w:pPr>
+      <w:rPr>
+        <w:rFonts w:ascii="Wingdings" w:hAnsi="Wingdings" w:hint="default"/>
+        <w:sz w:val="20"/>
+      </w:rPr>
+    </w:lvl>
+    <w:lvl w:ilvl="3" w:tentative="1">
+      <w:start w:val="1"/>
+      <w:numFmt w:val="bullet"/>
+      <w:lvlText w:val=""/>
+      <w:lvlJc w:val="left"/>
+      <w:pPr>
+        <w:tabs>
+          <w:tab w:val="num" w:pos="2880"/>
+        </w:tabs>
+        <w:ind w:left="2880" w:hanging="360"/>
+      </w:pPr>
+      <w:rPr>
+        <w:rFonts w:ascii="Wingdings" w:hAnsi="Wingdings" w:hint="default"/>
+        <w:sz w:val="20"/>
+      </w:rPr>
+    </w:lvl>
+    <w:lvl w:ilvl="4" w:tentative="1">
+      <w:start w:val="1"/>
+      <w:numFmt w:val="bullet"/>
+      <w:lvlText w:val=""/>
+      <w:lvlJc w:val="left"/>
+      <w:pPr>
+        <w:tabs>
+          <w:tab w:val="num" w:pos="3600"/>
+        </w:tabs>
+        <w:ind w:left="3600" w:hanging="360"/>
+      </w:pPr>
+      <w:rPr>
+        <w:rFonts w:ascii="Wingdings" w:hAnsi="Wingdings" w:hint="default"/>
+        <w:sz w:val="20"/>
+      </w:rPr>
+    </w:lvl>
+    <w:lvl w:ilvl="5" w:tentative="1">
+      <w:start w:val="1"/>
+      <w:numFmt w:val="bullet"/>
+      <w:lvlText w:val=""/>
+      <w:lvlJc w:val="left"/>
+      <w:pPr>
+        <w:tabs>
+          <w:tab w:val="num" w:pos="4320"/>
+        </w:tabs>
+        <w:ind w:left="4320" w:hanging="360"/>
+      </w:pPr>
+      <w:rPr>
+        <w:rFonts w:ascii="Wingdings" w:hAnsi="Wingdings" w:hint="default"/>
+        <w:sz w:val="20"/>
+      </w:rPr>
+    </w:lvl>
+    <w:lvl w:ilvl="6" w:tentative="1">
+      <w:start w:val="1"/>
+      <w:numFmt w:val="bullet"/>
+      <w:lvlText w:val=""/>
+      <w:lvlJc w:val="left"/>
+      <w:pPr>
+        <w:tabs>
+          <w:tab w:val="num" w:pos="5040"/>
+        </w:tabs>
+        <w:ind w:left="5040" w:hanging="360"/>
+      </w:pPr>
+      <w:rPr>
+        <w:rFonts w:ascii="Wingdings" w:hAnsi="Wingdings" w:hint="default"/>
+        <w:sz w:val="20"/>
+      </w:rPr>
+    </w:lvl>
+    <w:lvl w:ilvl="7" w:tentative="1">
+      <w:start w:val="1"/>
+      <w:numFmt w:val="bullet"/>
+      <w:lvlText w:val=""/>
+      <w:lvlJc w:val="left"/>
+      <w:pPr>
+        <w:tabs>
+          <w:tab w:val="num" w:pos="5760"/>
+        </w:tabs>
+        <w:ind w:left="5760" w:hanging="360"/>
+      </w:pPr>
+      <w:rPr>
+        <w:rFonts w:ascii="Wingdings" w:hAnsi="Wingdings" w:hint="default"/>
+        <w:sz w:val="20"/>
+      </w:rPr>
+    </w:lvl>
+    <w:lvl w:ilvl="8" w:tentative="1">
+      <w:start w:val="1"/>
+      <w:numFmt w:val="bullet"/>
+      <w:lvlText w:val=""/>
+      <w:lvlJc w:val="left"/>
+      <w:pPr>
+        <w:tabs>
+          <w:tab w:val="num" w:pos="6480"/>
+        </w:tabs>
+        <w:ind w:left="6480" w:hanging="360"/>
+      </w:pPr>
+      <w:rPr>
+        <w:rFonts w:ascii="Wingdings" w:hAnsi="Wingdings" w:hint="default"/>
+        <w:sz w:val="20"/>
+      </w:rPr>
+    </w:lvl>
+  </w:abstractNum>
+  <w:abstractNum w:abstractNumId="12" w15:restartNumberingAfterBreak="0">
+    <w:nsid w:val="4A7B1505"/>
+    <w:multiLevelType w:val="multilevel"/>
+    <w:tmpl w:val="43E40CB6"/>
+    <w:lvl w:ilvl="0">
+      <w:start w:val="1"/>
+      <w:numFmt w:val="bullet"/>
+      <w:lvlText w:val=""/>
+      <w:lvlJc w:val="left"/>
+      <w:pPr>
+        <w:tabs>
+          <w:tab w:val="num" w:pos="720"/>
+        </w:tabs>
+        <w:ind w:left="720" w:hanging="360"/>
+      </w:pPr>
+      <w:rPr>
+        <w:rFonts w:ascii="Symbol" w:hAnsi="Symbol" w:hint="default"/>
+        <w:sz w:val="20"/>
+      </w:rPr>
+    </w:lvl>
+    <w:lvl w:ilvl="1" w:tentative="1">
+      <w:start w:val="1"/>
+      <w:numFmt w:val="bullet"/>
+      <w:lvlText w:val="o"/>
+      <w:lvlJc w:val="left"/>
+      <w:pPr>
+        <w:tabs>
+          <w:tab w:val="num" w:pos="1440"/>
+        </w:tabs>
+        <w:ind w:left="1440" w:hanging="360"/>
+      </w:pPr>
+      <w:rPr>
+        <w:rFonts w:ascii="Courier New" w:hAnsi="Courier New" w:hint="default"/>
+        <w:sz w:val="20"/>
+      </w:rPr>
+    </w:lvl>
+    <w:lvl w:ilvl="2" w:tentative="1">
+      <w:start w:val="1"/>
+      <w:numFmt w:val="bullet"/>
+      <w:lvlText w:val=""/>
+      <w:lvlJc w:val="left"/>
+      <w:pPr>
+        <w:tabs>
+          <w:tab w:val="num" w:pos="2160"/>
+        </w:tabs>
+        <w:ind w:left="2160" w:hanging="360"/>
+      </w:pPr>
+      <w:rPr>
+        <w:rFonts w:ascii="Wingdings" w:hAnsi="Wingdings" w:hint="default"/>
+        <w:sz w:val="20"/>
+      </w:rPr>
+    </w:lvl>
+    <w:lvl w:ilvl="3" w:tentative="1">
+      <w:start w:val="1"/>
+      <w:numFmt w:val="bullet"/>
+      <w:lvlText w:val=""/>
+      <w:lvlJc w:val="left"/>
+      <w:pPr>
+        <w:tabs>
+          <w:tab w:val="num" w:pos="2880"/>
+        </w:tabs>
+        <w:ind w:left="2880" w:hanging="360"/>
+      </w:pPr>
+      <w:rPr>
+        <w:rFonts w:ascii="Wingdings" w:hAnsi="Wingdings" w:hint="default"/>
+        <w:sz w:val="20"/>
+      </w:rPr>
+    </w:lvl>
+    <w:lvl w:ilvl="4" w:tentative="1">
+      <w:start w:val="1"/>
+      <w:numFmt w:val="bullet"/>
+      <w:lvlText w:val=""/>
+      <w:lvlJc w:val="left"/>
+      <w:pPr>
+        <w:tabs>
+          <w:tab w:val="num" w:pos="3600"/>
+        </w:tabs>
+        <w:ind w:left="3600" w:hanging="360"/>
+      </w:pPr>
+      <w:rPr>
+        <w:rFonts w:ascii="Wingdings" w:hAnsi="Wingdings" w:hint="default"/>
+        <w:sz w:val="20"/>
+      </w:rPr>
+    </w:lvl>
+    <w:lvl w:ilvl="5" w:tentative="1">
+      <w:start w:val="1"/>
+      <w:numFmt w:val="bullet"/>
+      <w:lvlText w:val=""/>
+      <w:lvlJc w:val="left"/>
+      <w:pPr>
+        <w:tabs>
+          <w:tab w:val="num" w:pos="4320"/>
+        </w:tabs>
+        <w:ind w:left="4320" w:hanging="360"/>
+      </w:pPr>
+      <w:rPr>
+        <w:rFonts w:ascii="Wingdings" w:hAnsi="Wingdings" w:hint="default"/>
+        <w:sz w:val="20"/>
+      </w:rPr>
+    </w:lvl>
+    <w:lvl w:ilvl="6" w:tentative="1">
+      <w:start w:val="1"/>
+      <w:numFmt w:val="bullet"/>
+      <w:lvlText w:val=""/>
+      <w:lvlJc w:val="left"/>
+      <w:pPr>
+        <w:tabs>
+          <w:tab w:val="num" w:pos="5040"/>
+        </w:tabs>
+        <w:ind w:left="5040" w:hanging="360"/>
+      </w:pPr>
+      <w:rPr>
+        <w:rFonts w:ascii="Wingdings" w:hAnsi="Wingdings" w:hint="default"/>
+        <w:sz w:val="20"/>
+      </w:rPr>
+    </w:lvl>
+    <w:lvl w:ilvl="7" w:tentative="1">
+      <w:start w:val="1"/>
+      <w:numFmt w:val="bullet"/>
+      <w:lvlText w:val=""/>
+      <w:lvlJc w:val="left"/>
+      <w:pPr>
+        <w:tabs>
+          <w:tab w:val="num" w:pos="5760"/>
+        </w:tabs>
+        <w:ind w:left="5760" w:hanging="360"/>
+      </w:pPr>
+      <w:rPr>
+        <w:rFonts w:ascii="Wingdings" w:hAnsi="Wingdings" w:hint="default"/>
+        <w:sz w:val="20"/>
+      </w:rPr>
+    </w:lvl>
+    <w:lvl w:ilvl="8" w:tentative="1">
+      <w:start w:val="1"/>
+      <w:numFmt w:val="bullet"/>
+      <w:lvlText w:val=""/>
+      <w:lvlJc w:val="left"/>
+      <w:pPr>
+        <w:tabs>
+          <w:tab w:val="num" w:pos="6480"/>
+        </w:tabs>
+        <w:ind w:left="6480" w:hanging="360"/>
+      </w:pPr>
+      <w:rPr>
+        <w:rFonts w:ascii="Wingdings" w:hAnsi="Wingdings" w:hint="default"/>
+        <w:sz w:val="20"/>
+      </w:rPr>
+    </w:lvl>
+  </w:abstractNum>
+  <w:abstractNum w:abstractNumId="13" w15:restartNumberingAfterBreak="0">
+    <w:nsid w:val="4F4A7D4F"/>
+    <w:multiLevelType w:val="multilevel"/>
+    <w:tmpl w:val="34306C4E"/>
+    <w:lvl w:ilvl="0">
+      <w:start w:val="1"/>
+      <w:numFmt w:val="bullet"/>
+      <w:lvlText w:val=""/>
+      <w:lvlJc w:val="left"/>
+      <w:pPr>
+        <w:tabs>
+          <w:tab w:val="num" w:pos="720"/>
+        </w:tabs>
+        <w:ind w:left="720" w:hanging="360"/>
+      </w:pPr>
+      <w:rPr>
+        <w:rFonts w:ascii="Symbol" w:hAnsi="Symbol" w:hint="default"/>
+        <w:sz w:val="20"/>
+      </w:rPr>
+    </w:lvl>
+    <w:lvl w:ilvl="1" w:tentative="1">
+      <w:start w:val="1"/>
+      <w:numFmt w:val="bullet"/>
+      <w:lvlText w:val="o"/>
+      <w:lvlJc w:val="left"/>
+      <w:pPr>
+        <w:tabs>
+          <w:tab w:val="num" w:pos="1440"/>
+        </w:tabs>
+        <w:ind w:left="1440" w:hanging="360"/>
+      </w:pPr>
+      <w:rPr>
+        <w:rFonts w:ascii="Courier New" w:hAnsi="Courier New" w:hint="default"/>
+        <w:sz w:val="20"/>
+      </w:rPr>
+    </w:lvl>
+    <w:lvl w:ilvl="2" w:tentative="1">
+      <w:start w:val="1"/>
+      <w:numFmt w:val="bullet"/>
+      <w:lvlText w:val=""/>
+      <w:lvlJc w:val="left"/>
+      <w:pPr>
+        <w:tabs>
+          <w:tab w:val="num" w:pos="2160"/>
+        </w:tabs>
+        <w:ind w:left="2160" w:hanging="360"/>
+      </w:pPr>
+      <w:rPr>
+        <w:rFonts w:ascii="Wingdings" w:hAnsi="Wingdings" w:hint="default"/>
+        <w:sz w:val="20"/>
+      </w:rPr>
+    </w:lvl>
+    <w:lvl w:ilvl="3" w:tentative="1">
+      <w:start w:val="1"/>
+      <w:numFmt w:val="bullet"/>
+      <w:lvlText w:val=""/>
+      <w:lvlJc w:val="left"/>
+      <w:pPr>
+        <w:tabs>
+          <w:tab w:val="num" w:pos="2880"/>
+        </w:tabs>
+        <w:ind w:left="2880" w:hanging="360"/>
+      </w:pPr>
+      <w:rPr>
+        <w:rFonts w:ascii="Wingdings" w:hAnsi="Wingdings" w:hint="default"/>
+        <w:sz w:val="20"/>
+      </w:rPr>
+    </w:lvl>
+    <w:lvl w:ilvl="4" w:tentative="1">
+      <w:start w:val="1"/>
+      <w:numFmt w:val="bullet"/>
+      <w:lvlText w:val=""/>
+      <w:lvlJc w:val="left"/>
+      <w:pPr>
+        <w:tabs>
+          <w:tab w:val="num" w:pos="3600"/>
+        </w:tabs>
+        <w:ind w:left="3600" w:hanging="360"/>
+      </w:pPr>
+      <w:rPr>
+        <w:rFonts w:ascii="Wingdings" w:hAnsi="Wingdings" w:hint="default"/>
+        <w:sz w:val="20"/>
+      </w:rPr>
+    </w:lvl>
+    <w:lvl w:ilvl="5" w:tentative="1">
+      <w:start w:val="1"/>
+      <w:numFmt w:val="bullet"/>
+      <w:lvlText w:val=""/>
+      <w:lvlJc w:val="left"/>
+      <w:pPr>
+        <w:tabs>
+          <w:tab w:val="num" w:pos="4320"/>
+        </w:tabs>
+        <w:ind w:left="4320" w:hanging="360"/>
+      </w:pPr>
+      <w:rPr>
+        <w:rFonts w:ascii="Wingdings" w:hAnsi="Wingdings" w:hint="default"/>
+        <w:sz w:val="20"/>
+      </w:rPr>
+    </w:lvl>
+    <w:lvl w:ilvl="6" w:tentative="1">
+      <w:start w:val="1"/>
+      <w:numFmt w:val="bullet"/>
+      <w:lvlText w:val=""/>
+      <w:lvlJc w:val="left"/>
+      <w:pPr>
+        <w:tabs>
+          <w:tab w:val="num" w:pos="5040"/>
+        </w:tabs>
+        <w:ind w:left="5040" w:hanging="360"/>
+      </w:pPr>
+      <w:rPr>
+        <w:rFonts w:ascii="Wingdings" w:hAnsi="Wingdings" w:hint="default"/>
+        <w:sz w:val="20"/>
+      </w:rPr>
+    </w:lvl>
+    <w:lvl w:ilvl="7" w:tentative="1">
+      <w:start w:val="1"/>
+      <w:numFmt w:val="bullet"/>
+      <w:lvlText w:val=""/>
+      <w:lvlJc w:val="left"/>
+      <w:pPr>
+        <w:tabs>
+          <w:tab w:val="num" w:pos="5760"/>
+        </w:tabs>
+        <w:ind w:left="5760" w:hanging="360"/>
+      </w:pPr>
+      <w:rPr>
+        <w:rFonts w:ascii="Wingdings" w:hAnsi="Wingdings" w:hint="default"/>
+        <w:sz w:val="20"/>
+      </w:rPr>
+    </w:lvl>
+    <w:lvl w:ilvl="8" w:tentative="1">
+      <w:start w:val="1"/>
+      <w:numFmt w:val="bullet"/>
+      <w:lvlText w:val=""/>
+      <w:lvlJc w:val="left"/>
+      <w:pPr>
+        <w:tabs>
+          <w:tab w:val="num" w:pos="6480"/>
+        </w:tabs>
+        <w:ind w:left="6480" w:hanging="360"/>
+      </w:pPr>
+      <w:rPr>
+        <w:rFonts w:ascii="Wingdings" w:hAnsi="Wingdings" w:hint="default"/>
+        <w:sz w:val="20"/>
+      </w:rPr>
+    </w:lvl>
+  </w:abstractNum>
+  <w:abstractNum w:abstractNumId="14" w15:restartNumberingAfterBreak="0">
     <w:nsid w:val="5FB1635F"/>
     <w:multiLevelType w:val="hybridMultilevel"/>
     <w:tmpl w:val="F8EC2D82"/>
@@ -782,62 +2796,780 @@
       </w:pPr>
     </w:lvl>
   </w:abstractNum>
+  <w:abstractNum w:abstractNumId="15" w15:restartNumberingAfterBreak="0">
+    <w:nsid w:val="72CB1AE4"/>
+    <w:multiLevelType w:val="hybridMultilevel"/>
+    <w:tmpl w:val="99642576"/>
+    <w:lvl w:ilvl="0" w:tplc="08090001">
+      <w:start w:val="1"/>
+      <w:numFmt w:val="bullet"/>
+      <w:lvlText w:val=""/>
+      <w:lvlJc w:val="left"/>
+      <w:pPr>
+        <w:ind w:left="720" w:hanging="360"/>
+      </w:pPr>
+      <w:rPr>
+        <w:rFonts w:ascii="Symbol" w:hAnsi="Symbol" w:hint="default"/>
+      </w:rPr>
+    </w:lvl>
+    <w:lvl w:ilvl="1" w:tplc="08090003" w:tentative="1">
+      <w:start w:val="1"/>
+      <w:numFmt w:val="bullet"/>
+      <w:lvlText w:val="o"/>
+      <w:lvlJc w:val="left"/>
+      <w:pPr>
+        <w:ind w:left="1440" w:hanging="360"/>
+      </w:pPr>
+      <w:rPr>
+        <w:rFonts w:ascii="Courier New" w:hAnsi="Courier New" w:hint="default"/>
+      </w:rPr>
+    </w:lvl>
+    <w:lvl w:ilvl="2" w:tplc="08090005" w:tentative="1">
+      <w:start w:val="1"/>
+      <w:numFmt w:val="bullet"/>
+      <w:lvlText w:val=""/>
+      <w:lvlJc w:val="left"/>
+      <w:pPr>
+        <w:ind w:left="2160" w:hanging="360"/>
+      </w:pPr>
+      <w:rPr>
+        <w:rFonts w:ascii="Wingdings" w:hAnsi="Wingdings" w:hint="default"/>
+      </w:rPr>
+    </w:lvl>
+    <w:lvl w:ilvl="3" w:tplc="08090001" w:tentative="1">
+      <w:start w:val="1"/>
+      <w:numFmt w:val="bullet"/>
+      <w:lvlText w:val=""/>
+      <w:lvlJc w:val="left"/>
+      <w:pPr>
+        <w:ind w:left="2880" w:hanging="360"/>
+      </w:pPr>
+      <w:rPr>
+        <w:rFonts w:ascii="Symbol" w:hAnsi="Symbol" w:hint="default"/>
+      </w:rPr>
+    </w:lvl>
+    <w:lvl w:ilvl="4" w:tplc="08090003" w:tentative="1">
+      <w:start w:val="1"/>
+      <w:numFmt w:val="bullet"/>
+      <w:lvlText w:val="o"/>
+      <w:lvlJc w:val="left"/>
+      <w:pPr>
+        <w:ind w:left="3600" w:hanging="360"/>
+      </w:pPr>
+      <w:rPr>
+        <w:rFonts w:ascii="Courier New" w:hAnsi="Courier New" w:hint="default"/>
+      </w:rPr>
+    </w:lvl>
+    <w:lvl w:ilvl="5" w:tplc="08090005" w:tentative="1">
+      <w:start w:val="1"/>
+      <w:numFmt w:val="bullet"/>
+      <w:lvlText w:val=""/>
+      <w:lvlJc w:val="left"/>
+      <w:pPr>
+        <w:ind w:left="4320" w:hanging="360"/>
+      </w:pPr>
+      <w:rPr>
+        <w:rFonts w:ascii="Wingdings" w:hAnsi="Wingdings" w:hint="default"/>
+      </w:rPr>
+    </w:lvl>
+    <w:lvl w:ilvl="6" w:tplc="08090001" w:tentative="1">
+      <w:start w:val="1"/>
+      <w:numFmt w:val="bullet"/>
+      <w:lvlText w:val=""/>
+      <w:lvlJc w:val="left"/>
+      <w:pPr>
+        <w:ind w:left="5040" w:hanging="360"/>
+      </w:pPr>
+      <w:rPr>
+        <w:rFonts w:ascii="Symbol" w:hAnsi="Symbol" w:hint="default"/>
+      </w:rPr>
+    </w:lvl>
+    <w:lvl w:ilvl="7" w:tplc="08090003" w:tentative="1">
+      <w:start w:val="1"/>
+      <w:numFmt w:val="bullet"/>
+      <w:lvlText w:val="o"/>
+      <w:lvlJc w:val="left"/>
+      <w:pPr>
+        <w:ind w:left="5760" w:hanging="360"/>
+      </w:pPr>
+      <w:rPr>
+        <w:rFonts w:ascii="Courier New" w:hAnsi="Courier New" w:hint="default"/>
+      </w:rPr>
+    </w:lvl>
+    <w:lvl w:ilvl="8" w:tplc="08090005" w:tentative="1">
+      <w:start w:val="1"/>
+      <w:numFmt w:val="bullet"/>
+      <w:lvlText w:val=""/>
+      <w:lvlJc w:val="left"/>
+      <w:pPr>
+        <w:ind w:left="6480" w:hanging="360"/>
+      </w:pPr>
+      <w:rPr>
+        <w:rFonts w:ascii="Wingdings" w:hAnsi="Wingdings" w:hint="default"/>
+      </w:rPr>
+    </w:lvl>
+  </w:abstractNum>
+  <w:abstractNum w:abstractNumId="16" w15:restartNumberingAfterBreak="0">
+    <w:nsid w:val="733E52E6"/>
+    <w:multiLevelType w:val="hybridMultilevel"/>
+    <w:tmpl w:val="F122442C"/>
+    <w:lvl w:ilvl="0" w:tplc="08090001">
+      <w:start w:val="1"/>
+      <w:numFmt w:val="bullet"/>
+      <w:lvlText w:val=""/>
+      <w:lvlJc w:val="left"/>
+      <w:pPr>
+        <w:ind w:left="720" w:hanging="360"/>
+      </w:pPr>
+      <w:rPr>
+        <w:rFonts w:ascii="Symbol" w:hAnsi="Symbol" w:hint="default"/>
+      </w:rPr>
+    </w:lvl>
+    <w:lvl w:ilvl="1" w:tplc="08090003" w:tentative="1">
+      <w:start w:val="1"/>
+      <w:numFmt w:val="bullet"/>
+      <w:lvlText w:val="o"/>
+      <w:lvlJc w:val="left"/>
+      <w:pPr>
+        <w:ind w:left="1440" w:hanging="360"/>
+      </w:pPr>
+      <w:rPr>
+        <w:rFonts w:ascii="Courier New" w:hAnsi="Courier New" w:hint="default"/>
+      </w:rPr>
+    </w:lvl>
+    <w:lvl w:ilvl="2" w:tplc="08090005" w:tentative="1">
+      <w:start w:val="1"/>
+      <w:numFmt w:val="bullet"/>
+      <w:lvlText w:val=""/>
+      <w:lvlJc w:val="left"/>
+      <w:pPr>
+        <w:ind w:left="2160" w:hanging="360"/>
+      </w:pPr>
+      <w:rPr>
+        <w:rFonts w:ascii="Wingdings" w:hAnsi="Wingdings" w:hint="default"/>
+      </w:rPr>
+    </w:lvl>
+    <w:lvl w:ilvl="3" w:tplc="08090001" w:tentative="1">
+      <w:start w:val="1"/>
+      <w:numFmt w:val="bullet"/>
+      <w:lvlText w:val=""/>
+      <w:lvlJc w:val="left"/>
+      <w:pPr>
+        <w:ind w:left="2880" w:hanging="360"/>
+      </w:pPr>
+      <w:rPr>
+        <w:rFonts w:ascii="Symbol" w:hAnsi="Symbol" w:hint="default"/>
+      </w:rPr>
+    </w:lvl>
+    <w:lvl w:ilvl="4" w:tplc="08090003" w:tentative="1">
+      <w:start w:val="1"/>
+      <w:numFmt w:val="bullet"/>
+      <w:lvlText w:val="o"/>
+      <w:lvlJc w:val="left"/>
+      <w:pPr>
+        <w:ind w:left="3600" w:hanging="360"/>
+      </w:pPr>
+      <w:rPr>
+        <w:rFonts w:ascii="Courier New" w:hAnsi="Courier New" w:hint="default"/>
+      </w:rPr>
+    </w:lvl>
+    <w:lvl w:ilvl="5" w:tplc="08090005" w:tentative="1">
+      <w:start w:val="1"/>
+      <w:numFmt w:val="bullet"/>
+      <w:lvlText w:val=""/>
+      <w:lvlJc w:val="left"/>
+      <w:pPr>
+        <w:ind w:left="4320" w:hanging="360"/>
+      </w:pPr>
+      <w:rPr>
+        <w:rFonts w:ascii="Wingdings" w:hAnsi="Wingdings" w:hint="default"/>
+      </w:rPr>
+    </w:lvl>
+    <w:lvl w:ilvl="6" w:tplc="08090001" w:tentative="1">
+      <w:start w:val="1"/>
+      <w:numFmt w:val="bullet"/>
+      <w:lvlText w:val=""/>
+      <w:lvlJc w:val="left"/>
+      <w:pPr>
+        <w:ind w:left="5040" w:hanging="360"/>
+      </w:pPr>
+      <w:rPr>
+        <w:rFonts w:ascii="Symbol" w:hAnsi="Symbol" w:hint="default"/>
+      </w:rPr>
+    </w:lvl>
+    <w:lvl w:ilvl="7" w:tplc="08090003" w:tentative="1">
+      <w:start w:val="1"/>
+      <w:numFmt w:val="bullet"/>
+      <w:lvlText w:val="o"/>
+      <w:lvlJc w:val="left"/>
+      <w:pPr>
+        <w:ind w:left="5760" w:hanging="360"/>
+      </w:pPr>
+      <w:rPr>
+        <w:rFonts w:ascii="Courier New" w:hAnsi="Courier New" w:hint="default"/>
+      </w:rPr>
+    </w:lvl>
+    <w:lvl w:ilvl="8" w:tplc="08090005" w:tentative="1">
+      <w:start w:val="1"/>
+      <w:numFmt w:val="bullet"/>
+      <w:lvlText w:val=""/>
+      <w:lvlJc w:val="left"/>
+      <w:pPr>
+        <w:ind w:left="6480" w:hanging="360"/>
+      </w:pPr>
+      <w:rPr>
+        <w:rFonts w:ascii="Wingdings" w:hAnsi="Wingdings" w:hint="default"/>
+      </w:rPr>
+    </w:lvl>
+  </w:abstractNum>
+  <w:abstractNum w:abstractNumId="17" w15:restartNumberingAfterBreak="0">
+    <w:nsid w:val="73572A02"/>
+    <w:multiLevelType w:val="multilevel"/>
+    <w:tmpl w:val="9A0AE64C"/>
+    <w:lvl w:ilvl="0">
+      <w:start w:val="1"/>
+      <w:numFmt w:val="bullet"/>
+      <w:lvlText w:val=""/>
+      <w:lvlJc w:val="left"/>
+      <w:pPr>
+        <w:tabs>
+          <w:tab w:val="num" w:pos="720"/>
+        </w:tabs>
+        <w:ind w:left="720" w:hanging="360"/>
+      </w:pPr>
+      <w:rPr>
+        <w:rFonts w:ascii="Symbol" w:hAnsi="Symbol" w:hint="default"/>
+        <w:sz w:val="20"/>
+      </w:rPr>
+    </w:lvl>
+    <w:lvl w:ilvl="1" w:tentative="1">
+      <w:start w:val="1"/>
+      <w:numFmt w:val="bullet"/>
+      <w:lvlText w:val="o"/>
+      <w:lvlJc w:val="left"/>
+      <w:pPr>
+        <w:tabs>
+          <w:tab w:val="num" w:pos="1440"/>
+        </w:tabs>
+        <w:ind w:left="1440" w:hanging="360"/>
+      </w:pPr>
+      <w:rPr>
+        <w:rFonts w:ascii="Courier New" w:hAnsi="Courier New" w:hint="default"/>
+        <w:sz w:val="20"/>
+      </w:rPr>
+    </w:lvl>
+    <w:lvl w:ilvl="2" w:tentative="1">
+      <w:start w:val="1"/>
+      <w:numFmt w:val="bullet"/>
+      <w:lvlText w:val=""/>
+      <w:lvlJc w:val="left"/>
+      <w:pPr>
+        <w:tabs>
+          <w:tab w:val="num" w:pos="2160"/>
+        </w:tabs>
+        <w:ind w:left="2160" w:hanging="360"/>
+      </w:pPr>
+      <w:rPr>
+        <w:rFonts w:ascii="Wingdings" w:hAnsi="Wingdings" w:hint="default"/>
+        <w:sz w:val="20"/>
+      </w:rPr>
+    </w:lvl>
+    <w:lvl w:ilvl="3" w:tentative="1">
+      <w:start w:val="1"/>
+      <w:numFmt w:val="bullet"/>
+      <w:lvlText w:val=""/>
+      <w:lvlJc w:val="left"/>
+      <w:pPr>
+        <w:tabs>
+          <w:tab w:val="num" w:pos="2880"/>
+        </w:tabs>
+        <w:ind w:left="2880" w:hanging="360"/>
+      </w:pPr>
+      <w:rPr>
+        <w:rFonts w:ascii="Wingdings" w:hAnsi="Wingdings" w:hint="default"/>
+        <w:sz w:val="20"/>
+      </w:rPr>
+    </w:lvl>
+    <w:lvl w:ilvl="4" w:tentative="1">
+      <w:start w:val="1"/>
+      <w:numFmt w:val="bullet"/>
+      <w:lvlText w:val=""/>
+      <w:lvlJc w:val="left"/>
+      <w:pPr>
+        <w:tabs>
+          <w:tab w:val="num" w:pos="3600"/>
+        </w:tabs>
+        <w:ind w:left="3600" w:hanging="360"/>
+      </w:pPr>
+      <w:rPr>
+        <w:rFonts w:ascii="Wingdings" w:hAnsi="Wingdings" w:hint="default"/>
+        <w:sz w:val="20"/>
+      </w:rPr>
+    </w:lvl>
+    <w:lvl w:ilvl="5" w:tentative="1">
+      <w:start w:val="1"/>
+      <w:numFmt w:val="bullet"/>
+      <w:lvlText w:val=""/>
+      <w:lvlJc w:val="left"/>
+      <w:pPr>
+        <w:tabs>
+          <w:tab w:val="num" w:pos="4320"/>
+        </w:tabs>
+        <w:ind w:left="4320" w:hanging="360"/>
+      </w:pPr>
+      <w:rPr>
+        <w:rFonts w:ascii="Wingdings" w:hAnsi="Wingdings" w:hint="default"/>
+        <w:sz w:val="20"/>
+      </w:rPr>
+    </w:lvl>
+    <w:lvl w:ilvl="6" w:tentative="1">
+      <w:start w:val="1"/>
+      <w:numFmt w:val="bullet"/>
+      <w:lvlText w:val=""/>
+      <w:lvlJc w:val="left"/>
+      <w:pPr>
+        <w:tabs>
+          <w:tab w:val="num" w:pos="5040"/>
+        </w:tabs>
+        <w:ind w:left="5040" w:hanging="360"/>
+      </w:pPr>
+      <w:rPr>
+        <w:rFonts w:ascii="Wingdings" w:hAnsi="Wingdings" w:hint="default"/>
+        <w:sz w:val="20"/>
+      </w:rPr>
+    </w:lvl>
+    <w:lvl w:ilvl="7" w:tentative="1">
+      <w:start w:val="1"/>
+      <w:numFmt w:val="bullet"/>
+      <w:lvlText w:val=""/>
+      <w:lvlJc w:val="left"/>
+      <w:pPr>
+        <w:tabs>
+          <w:tab w:val="num" w:pos="5760"/>
+        </w:tabs>
+        <w:ind w:left="5760" w:hanging="360"/>
+      </w:pPr>
+      <w:rPr>
+        <w:rFonts w:ascii="Wingdings" w:hAnsi="Wingdings" w:hint="default"/>
+        <w:sz w:val="20"/>
+      </w:rPr>
+    </w:lvl>
+    <w:lvl w:ilvl="8" w:tentative="1">
+      <w:start w:val="1"/>
+      <w:numFmt w:val="bullet"/>
+      <w:lvlText w:val=""/>
+      <w:lvlJc w:val="left"/>
+      <w:pPr>
+        <w:tabs>
+          <w:tab w:val="num" w:pos="6480"/>
+        </w:tabs>
+        <w:ind w:left="6480" w:hanging="360"/>
+      </w:pPr>
+      <w:rPr>
+        <w:rFonts w:ascii="Wingdings" w:hAnsi="Wingdings" w:hint="default"/>
+        <w:sz w:val="20"/>
+      </w:rPr>
+    </w:lvl>
+  </w:abstractNum>
+  <w:abstractNum w:abstractNumId="18" w15:restartNumberingAfterBreak="0">
+    <w:nsid w:val="79F92690"/>
+    <w:multiLevelType w:val="multilevel"/>
+    <w:tmpl w:val="531CE590"/>
+    <w:lvl w:ilvl="0">
+      <w:start w:val="1"/>
+      <w:numFmt w:val="bullet"/>
+      <w:lvlText w:val=""/>
+      <w:lvlJc w:val="left"/>
+      <w:pPr>
+        <w:tabs>
+          <w:tab w:val="num" w:pos="720"/>
+        </w:tabs>
+        <w:ind w:left="720" w:hanging="360"/>
+      </w:pPr>
+      <w:rPr>
+        <w:rFonts w:ascii="Symbol" w:hAnsi="Symbol" w:hint="default"/>
+        <w:sz w:val="20"/>
+      </w:rPr>
+    </w:lvl>
+    <w:lvl w:ilvl="1" w:tentative="1">
+      <w:start w:val="1"/>
+      <w:numFmt w:val="bullet"/>
+      <w:lvlText w:val="o"/>
+      <w:lvlJc w:val="left"/>
+      <w:pPr>
+        <w:tabs>
+          <w:tab w:val="num" w:pos="1440"/>
+        </w:tabs>
+        <w:ind w:left="1440" w:hanging="360"/>
+      </w:pPr>
+      <w:rPr>
+        <w:rFonts w:ascii="Courier New" w:hAnsi="Courier New" w:hint="default"/>
+        <w:sz w:val="20"/>
+      </w:rPr>
+    </w:lvl>
+    <w:lvl w:ilvl="2" w:tentative="1">
+      <w:start w:val="1"/>
+      <w:numFmt w:val="bullet"/>
+      <w:lvlText w:val=""/>
+      <w:lvlJc w:val="left"/>
+      <w:pPr>
+        <w:tabs>
+          <w:tab w:val="num" w:pos="2160"/>
+        </w:tabs>
+        <w:ind w:left="2160" w:hanging="360"/>
+      </w:pPr>
+      <w:rPr>
+        <w:rFonts w:ascii="Wingdings" w:hAnsi="Wingdings" w:hint="default"/>
+        <w:sz w:val="20"/>
+      </w:rPr>
+    </w:lvl>
+    <w:lvl w:ilvl="3" w:tentative="1">
+      <w:start w:val="1"/>
+      <w:numFmt w:val="bullet"/>
+      <w:lvlText w:val=""/>
+      <w:lvlJc w:val="left"/>
+      <w:pPr>
+        <w:tabs>
+          <w:tab w:val="num" w:pos="2880"/>
+        </w:tabs>
+        <w:ind w:left="2880" w:hanging="360"/>
+      </w:pPr>
+      <w:rPr>
+        <w:rFonts w:ascii="Wingdings" w:hAnsi="Wingdings" w:hint="default"/>
+        <w:sz w:val="20"/>
+      </w:rPr>
+    </w:lvl>
+    <w:lvl w:ilvl="4" w:tentative="1">
+      <w:start w:val="1"/>
+      <w:numFmt w:val="bullet"/>
+      <w:lvlText w:val=""/>
+      <w:lvlJc w:val="left"/>
+      <w:pPr>
+        <w:tabs>
+          <w:tab w:val="num" w:pos="3600"/>
+        </w:tabs>
+        <w:ind w:left="3600" w:hanging="360"/>
+      </w:pPr>
+      <w:rPr>
+        <w:rFonts w:ascii="Wingdings" w:hAnsi="Wingdings" w:hint="default"/>
+        <w:sz w:val="20"/>
+      </w:rPr>
+    </w:lvl>
+    <w:lvl w:ilvl="5" w:tentative="1">
+      <w:start w:val="1"/>
+      <w:numFmt w:val="bullet"/>
+      <w:lvlText w:val=""/>
+      <w:lvlJc w:val="left"/>
+      <w:pPr>
+        <w:tabs>
+          <w:tab w:val="num" w:pos="4320"/>
+        </w:tabs>
+        <w:ind w:left="4320" w:hanging="360"/>
+      </w:pPr>
+      <w:rPr>
+        <w:rFonts w:ascii="Wingdings" w:hAnsi="Wingdings" w:hint="default"/>
+        <w:sz w:val="20"/>
+      </w:rPr>
+    </w:lvl>
+    <w:lvl w:ilvl="6" w:tentative="1">
+      <w:start w:val="1"/>
+      <w:numFmt w:val="bullet"/>
+      <w:lvlText w:val=""/>
+      <w:lvlJc w:val="left"/>
+      <w:pPr>
+        <w:tabs>
+          <w:tab w:val="num" w:pos="5040"/>
+        </w:tabs>
+        <w:ind w:left="5040" w:hanging="360"/>
+      </w:pPr>
+      <w:rPr>
+        <w:rFonts w:ascii="Wingdings" w:hAnsi="Wingdings" w:hint="default"/>
+        <w:sz w:val="20"/>
+      </w:rPr>
+    </w:lvl>
+    <w:lvl w:ilvl="7" w:tentative="1">
+      <w:start w:val="1"/>
+      <w:numFmt w:val="bullet"/>
+      <w:lvlText w:val=""/>
+      <w:lvlJc w:val="left"/>
+      <w:pPr>
+        <w:tabs>
+          <w:tab w:val="num" w:pos="5760"/>
+        </w:tabs>
+        <w:ind w:left="5760" w:hanging="360"/>
+      </w:pPr>
+      <w:rPr>
+        <w:rFonts w:ascii="Wingdings" w:hAnsi="Wingdings" w:hint="default"/>
+        <w:sz w:val="20"/>
+      </w:rPr>
+    </w:lvl>
+    <w:lvl w:ilvl="8" w:tentative="1">
+      <w:start w:val="1"/>
+      <w:numFmt w:val="bullet"/>
+      <w:lvlText w:val=""/>
+      <w:lvlJc w:val="left"/>
+      <w:pPr>
+        <w:tabs>
+          <w:tab w:val="num" w:pos="6480"/>
+        </w:tabs>
+        <w:ind w:left="6480" w:hanging="360"/>
+      </w:pPr>
+      <w:rPr>
+        <w:rFonts w:ascii="Wingdings" w:hAnsi="Wingdings" w:hint="default"/>
+        <w:sz w:val="20"/>
+      </w:rPr>
+    </w:lvl>
+  </w:abstractNum>
+  <w:abstractNum w:abstractNumId="19" w15:restartNumberingAfterBreak="0">
+    <w:nsid w:val="7A6076A7"/>
+    <w:multiLevelType w:val="multilevel"/>
+    <w:tmpl w:val="710AEC28"/>
+    <w:lvl w:ilvl="0">
+      <w:start w:val="1"/>
+      <w:numFmt w:val="bullet"/>
+      <w:lvlText w:val=""/>
+      <w:lvlJc w:val="left"/>
+      <w:pPr>
+        <w:tabs>
+          <w:tab w:val="num" w:pos="720"/>
+        </w:tabs>
+        <w:ind w:left="720" w:hanging="360"/>
+      </w:pPr>
+      <w:rPr>
+        <w:rFonts w:ascii="Symbol" w:hAnsi="Symbol" w:hint="default"/>
+        <w:sz w:val="20"/>
+      </w:rPr>
+    </w:lvl>
+    <w:lvl w:ilvl="1" w:tentative="1">
+      <w:start w:val="1"/>
+      <w:numFmt w:val="bullet"/>
+      <w:lvlText w:val="o"/>
+      <w:lvlJc w:val="left"/>
+      <w:pPr>
+        <w:tabs>
+          <w:tab w:val="num" w:pos="1440"/>
+        </w:tabs>
+        <w:ind w:left="1440" w:hanging="360"/>
+      </w:pPr>
+      <w:rPr>
+        <w:rFonts w:ascii="Courier New" w:hAnsi="Courier New" w:hint="default"/>
+        <w:sz w:val="20"/>
+      </w:rPr>
+    </w:lvl>
+    <w:lvl w:ilvl="2" w:tentative="1">
+      <w:start w:val="1"/>
+      <w:numFmt w:val="bullet"/>
+      <w:lvlText w:val=""/>
+      <w:lvlJc w:val="left"/>
+      <w:pPr>
+        <w:tabs>
+          <w:tab w:val="num" w:pos="2160"/>
+        </w:tabs>
+        <w:ind w:left="2160" w:hanging="360"/>
+      </w:pPr>
+      <w:rPr>
+        <w:rFonts w:ascii="Wingdings" w:hAnsi="Wingdings" w:hint="default"/>
+        <w:sz w:val="20"/>
+      </w:rPr>
+    </w:lvl>
+    <w:lvl w:ilvl="3" w:tentative="1">
+      <w:start w:val="1"/>
+      <w:numFmt w:val="bullet"/>
+      <w:lvlText w:val=""/>
+      <w:lvlJc w:val="left"/>
+      <w:pPr>
+        <w:tabs>
+          <w:tab w:val="num" w:pos="2880"/>
+        </w:tabs>
+        <w:ind w:left="2880" w:hanging="360"/>
+      </w:pPr>
+      <w:rPr>
+        <w:rFonts w:ascii="Wingdings" w:hAnsi="Wingdings" w:hint="default"/>
+        <w:sz w:val="20"/>
+      </w:rPr>
+    </w:lvl>
+    <w:lvl w:ilvl="4" w:tentative="1">
+      <w:start w:val="1"/>
+      <w:numFmt w:val="bullet"/>
+      <w:lvlText w:val=""/>
+      <w:lvlJc w:val="left"/>
+      <w:pPr>
+        <w:tabs>
+          <w:tab w:val="num" w:pos="3600"/>
+        </w:tabs>
+        <w:ind w:left="3600" w:hanging="360"/>
+      </w:pPr>
+      <w:rPr>
+        <w:rFonts w:ascii="Wingdings" w:hAnsi="Wingdings" w:hint="default"/>
+        <w:sz w:val="20"/>
+      </w:rPr>
+    </w:lvl>
+    <w:lvl w:ilvl="5" w:tentative="1">
+      <w:start w:val="1"/>
+      <w:numFmt w:val="bullet"/>
+      <w:lvlText w:val=""/>
+      <w:lvlJc w:val="left"/>
+      <w:pPr>
+        <w:tabs>
+          <w:tab w:val="num" w:pos="4320"/>
+        </w:tabs>
+        <w:ind w:left="4320" w:hanging="360"/>
+      </w:pPr>
+      <w:rPr>
+        <w:rFonts w:ascii="Wingdings" w:hAnsi="Wingdings" w:hint="default"/>
+        <w:sz w:val="20"/>
+      </w:rPr>
+    </w:lvl>
+    <w:lvl w:ilvl="6" w:tentative="1">
+      <w:start w:val="1"/>
+      <w:numFmt w:val="bullet"/>
+      <w:lvlText w:val=""/>
+      <w:lvlJc w:val="left"/>
+      <w:pPr>
+        <w:tabs>
+          <w:tab w:val="num" w:pos="5040"/>
+        </w:tabs>
+        <w:ind w:left="5040" w:hanging="360"/>
+      </w:pPr>
+      <w:rPr>
+        <w:rFonts w:ascii="Wingdings" w:hAnsi="Wingdings" w:hint="default"/>
+        <w:sz w:val="20"/>
+      </w:rPr>
+    </w:lvl>
+    <w:lvl w:ilvl="7" w:tentative="1">
+      <w:start w:val="1"/>
+      <w:numFmt w:val="bullet"/>
+      <w:lvlText w:val=""/>
+      <w:lvlJc w:val="left"/>
+      <w:pPr>
+        <w:tabs>
+          <w:tab w:val="num" w:pos="5760"/>
+        </w:tabs>
+        <w:ind w:left="5760" w:hanging="360"/>
+      </w:pPr>
+      <w:rPr>
+        <w:rFonts w:ascii="Wingdings" w:hAnsi="Wingdings" w:hint="default"/>
+        <w:sz w:val="20"/>
+      </w:rPr>
+    </w:lvl>
+    <w:lvl w:ilvl="8" w:tentative="1">
+      <w:start w:val="1"/>
+      <w:numFmt w:val="bullet"/>
+      <w:lvlText w:val=""/>
+      <w:lvlJc w:val="left"/>
+      <w:pPr>
+        <w:tabs>
+          <w:tab w:val="num" w:pos="6480"/>
+        </w:tabs>
+        <w:ind w:left="6480" w:hanging="360"/>
+      </w:pPr>
+      <w:rPr>
+        <w:rFonts w:ascii="Wingdings" w:hAnsi="Wingdings" w:hint="default"/>
+        <w:sz w:val="20"/>
+      </w:rPr>
+    </w:lvl>
+  </w:abstractNum>
   <w:num w:numId="1" w16cid:durableId="2057659798">
+    <w:abstractNumId w:val="7"/>
+  </w:num>
+  <w:num w:numId="2" w16cid:durableId="99107261">
+    <w:abstractNumId w:val="7"/>
+  </w:num>
+  <w:num w:numId="3" w16cid:durableId="454829576">
+    <w:abstractNumId w:val="7"/>
+  </w:num>
+  <w:num w:numId="4" w16cid:durableId="919875635">
+    <w:abstractNumId w:val="7"/>
+  </w:num>
+  <w:num w:numId="5" w16cid:durableId="1989245865">
+    <w:abstractNumId w:val="7"/>
+  </w:num>
+  <w:num w:numId="6" w16cid:durableId="337856889">
+    <w:abstractNumId w:val="7"/>
+  </w:num>
+  <w:num w:numId="7" w16cid:durableId="486750497">
+    <w:abstractNumId w:val="3"/>
+  </w:num>
+  <w:num w:numId="8" w16cid:durableId="1295481688">
+    <w:abstractNumId w:val="7"/>
+  </w:num>
+  <w:num w:numId="9" w16cid:durableId="878207473">
+    <w:abstractNumId w:val="7"/>
+  </w:num>
+  <w:num w:numId="10" w16cid:durableId="390271873">
+    <w:abstractNumId w:val="3"/>
+  </w:num>
+  <w:num w:numId="11" w16cid:durableId="108548336">
+    <w:abstractNumId w:val="7"/>
+  </w:num>
+  <w:num w:numId="12" w16cid:durableId="289626826">
+    <w:abstractNumId w:val="9"/>
+  </w:num>
+  <w:num w:numId="13" w16cid:durableId="709189428">
+    <w:abstractNumId w:val="14"/>
+  </w:num>
+  <w:num w:numId="14" w16cid:durableId="1828012820">
+    <w:abstractNumId w:val="7"/>
+  </w:num>
+  <w:num w:numId="15" w16cid:durableId="1472016058">
+    <w:abstractNumId w:val="7"/>
+  </w:num>
+  <w:num w:numId="16" w16cid:durableId="2007130954">
+    <w:abstractNumId w:val="7"/>
+  </w:num>
+  <w:num w:numId="17" w16cid:durableId="2124959910">
+    <w:abstractNumId w:val="7"/>
+  </w:num>
+  <w:num w:numId="18" w16cid:durableId="1161965983">
+    <w:abstractNumId w:val="7"/>
+  </w:num>
+  <w:num w:numId="19" w16cid:durableId="41710311">
     <w:abstractNumId w:val="2"/>
   </w:num>
-  <w:num w:numId="2" w16cid:durableId="99107261">
-    <w:abstractNumId w:val="2"/>
+  <w:num w:numId="20" w16cid:durableId="1163350981">
+    <w:abstractNumId w:val="15"/>
   </w:num>
-  <w:num w:numId="3" w16cid:durableId="454829576">
-    <w:abstractNumId w:val="2"/>
+  <w:num w:numId="21" w16cid:durableId="926422226">
+    <w:abstractNumId w:val="16"/>
   </w:num>
-  <w:num w:numId="4" w16cid:durableId="919875635">
-    <w:abstractNumId w:val="2"/>
+  <w:num w:numId="22" w16cid:durableId="690304119">
+    <w:abstractNumId w:val="5"/>
   </w:num>
-  <w:num w:numId="5" w16cid:durableId="1989245865">
-    <w:abstractNumId w:val="2"/>
+  <w:num w:numId="23" w16cid:durableId="1154031265">
+    <w:abstractNumId w:val="17"/>
   </w:num>
-  <w:num w:numId="6" w16cid:durableId="337856889">
-    <w:abstractNumId w:val="2"/>
+  <w:num w:numId="24" w16cid:durableId="1956523979">
+    <w:abstractNumId w:val="4"/>
   </w:num>
-  <w:num w:numId="7" w16cid:durableId="486750497">
+  <w:num w:numId="25" w16cid:durableId="1122503775">
+    <w:abstractNumId w:val="8"/>
+  </w:num>
+  <w:num w:numId="26" w16cid:durableId="1019895648">
+    <w:abstractNumId w:val="13"/>
+  </w:num>
+  <w:num w:numId="27" w16cid:durableId="1635984666">
+    <w:abstractNumId w:val="10"/>
+  </w:num>
+  <w:num w:numId="28" w16cid:durableId="1012806949">
     <w:abstractNumId w:val="1"/>
   </w:num>
-  <w:num w:numId="8" w16cid:durableId="1295481688">
-    <w:abstractNumId w:val="2"/>
+  <w:num w:numId="29" w16cid:durableId="918251369">
+    <w:abstractNumId w:val="18"/>
   </w:num>
-  <w:num w:numId="9" w16cid:durableId="878207473">
-    <w:abstractNumId w:val="2"/>
+  <w:num w:numId="30" w16cid:durableId="825705908">
+    <w:abstractNumId w:val="19"/>
   </w:num>
-  <w:num w:numId="10" w16cid:durableId="390271873">
-    <w:abstractNumId w:val="1"/>
+  <w:num w:numId="31" w16cid:durableId="38475431">
+    <w:abstractNumId w:val="12"/>
   </w:num>
-  <w:num w:numId="11" w16cid:durableId="108548336">
-    <w:abstractNumId w:val="2"/>
+  <w:num w:numId="32" w16cid:durableId="907493259">
+    <w:abstractNumId w:val="11"/>
   </w:num>
-  <w:num w:numId="12" w16cid:durableId="289626826">
-    <w:abstractNumId w:val="3"/>
+  <w:num w:numId="33" w16cid:durableId="766772892">
+    <w:abstractNumId w:val="0"/>
   </w:num>
-  <w:num w:numId="13" w16cid:durableId="709189428">
-    <w:abstractNumId w:val="4"/>
-  </w:num>
-  <w:num w:numId="14" w16cid:durableId="1828012820">
-    <w:abstractNumId w:val="2"/>
-  </w:num>
-  <w:num w:numId="15" w16cid:durableId="1472016058">
-    <w:abstractNumId w:val="2"/>
-  </w:num>
-  <w:num w:numId="16" w16cid:durableId="2007130954">
-    <w:abstractNumId w:val="2"/>
-  </w:num>
-  <w:num w:numId="17" w16cid:durableId="2124959910">
-    <w:abstractNumId w:val="2"/>
-  </w:num>
-  <w:num w:numId="18" w16cid:durableId="1161965983">
-    <w:abstractNumId w:val="2"/>
-  </w:num>
-  <w:num w:numId="19" w16cid:durableId="41710311">
-    <w:abstractNumId w:val="0"/>
+  <w:num w:numId="34" w16cid:durableId="1505051811">
+    <w:abstractNumId w:val="6"/>
   </w:num>
 </w:numbering>
 </file>
@@ -1863,7 +4595,6 @@
     <w:name w:val="Normal (Web)"/>
     <w:basedOn w:val="Normal"/>
     <w:uiPriority w:val="99"/>
-    <w:semiHidden/>
     <w:unhideWhenUsed/>
     <w:rsid w:val="00F237D7"/>
     <w:pPr>

</xml_diff>

<commit_message>
Exploring 3rd course of Generative AI Fundamentals specialization
</commit_message>
<xml_diff>
--- a/3_Generarive_AI_Foundation_Models_and_Platforms/IBM_Gen_AI_Foundation_Models_and_Platforms_Notes.docx
+++ b/3_Generarive_AI_Foundation_Models_and_Platforms/IBM_Gen_AI_Foundation_Models_and_Platforms_Notes.docx
@@ -690,28 +690,13 @@
         <w:pStyle w:val="NormalWeb"/>
       </w:pPr>
       <w:r>
-        <w:t xml:space="preserve">This material is designed for anyone interested in exploring Generative AI and </w:t>
-      </w:r>
-      <w:r>
-        <w:t>requires</w:t>
+        <w:t>This material is designed for anyone interested in exploring Generative AI and requires</w:t>
       </w:r>
       <w:r>
         <w:rPr>
           <w:rStyle w:val="Strong"/>
         </w:rPr>
-        <w:t xml:space="preserve"> </w:t>
-      </w:r>
-      <w:r>
-        <w:rPr>
-          <w:rStyle w:val="Strong"/>
-        </w:rPr>
-        <w:t>no</w:t>
-      </w:r>
-      <w:r>
-        <w:rPr>
-          <w:rStyle w:val="Strong"/>
-        </w:rPr>
-        <w:t xml:space="preserve"> specific prerequisites</w:t>
+        <w:t xml:space="preserve"> no specific prerequisites</w:t>
       </w:r>
       <w:r>
         <w:t>.</w:t>
@@ -757,6 +742,1537 @@
       </w:pPr>
       <w:r>
         <w:t>To get the most from the material, active participation and completion of the learning activities across all sections are recommended.</w:t>
+      </w:r>
+    </w:p>
+    <w:p>
+      <w:pPr>
+        <w:pStyle w:val="Heading1"/>
+      </w:pPr>
+      <w:r>
+        <w:t>Deep Learning and Large Language Models</w:t>
+      </w:r>
+    </w:p>
+    <w:p>
+      <w:pPr>
+        <w:pStyle w:val="Heading2"/>
+      </w:pPr>
+      <w:r>
+        <w:t>Introduction</w:t>
+      </w:r>
+    </w:p>
+    <w:p>
+      <w:pPr>
+        <w:pStyle w:val="NormalWeb"/>
+      </w:pPr>
+      <w:r>
+        <w:t xml:space="preserve">In this topic, the core concepts of </w:t>
+      </w:r>
+      <w:r>
+        <w:rPr>
+          <w:rStyle w:val="Strong"/>
+        </w:rPr>
+        <w:t>Generative AI</w:t>
+      </w:r>
+      <w:r>
+        <w:t xml:space="preserve">, </w:t>
+      </w:r>
+      <w:r>
+        <w:rPr>
+          <w:rStyle w:val="Strong"/>
+        </w:rPr>
+        <w:t>Deep Learning</w:t>
+      </w:r>
+      <w:r>
+        <w:t xml:space="preserve">, and </w:t>
+      </w:r>
+      <w:r>
+        <w:rPr>
+          <w:rStyle w:val="Strong"/>
+        </w:rPr>
+        <w:t>Large Language Models (LLMs)</w:t>
+      </w:r>
+      <w:r>
+        <w:t xml:space="preserve"> are explained. It also describes how LLMs perform human-like tasks by leveraging deep learning techniques and transformer-based architectures.</w:t>
+      </w:r>
+    </w:p>
+    <w:p>
+      <w:pPr>
+        <w:pStyle w:val="Heading2"/>
+      </w:pPr>
+      <w:r>
+        <w:t>Deep Learning</w:t>
+      </w:r>
+    </w:p>
+    <w:p>
+      <w:pPr>
+        <w:pStyle w:val="NormalWeb"/>
+      </w:pPr>
+      <w:r>
+        <w:t>Deep learning is inspired by the way the human brain processes information. Just as humans develop a deeper understanding by processing information through multiple layers, deep learning creates "depth" by processing data through multiple computational layers.</w:t>
+      </w:r>
+    </w:p>
+    <w:p>
+      <w:pPr>
+        <w:pStyle w:val="NormalWeb"/>
+      </w:pPr>
+      <w:r>
+        <w:t xml:space="preserve">Deep learning is made possible through an </w:t>
+      </w:r>
+      <w:r>
+        <w:rPr>
+          <w:rStyle w:val="Strong"/>
+        </w:rPr>
+        <w:t>Artificial Neural Network (ANN)</w:t>
+      </w:r>
+      <w:r>
+        <w:t>.</w:t>
+      </w:r>
+    </w:p>
+    <w:p>
+      <w:pPr>
+        <w:pStyle w:val="Heading3"/>
+      </w:pPr>
+      <w:r>
+        <w:t>Artificial Neural Networks (ANNs)</w:t>
+      </w:r>
+    </w:p>
+    <w:p>
+      <w:pPr>
+        <w:pStyle w:val="NormalWeb"/>
+      </w:pPr>
+      <w:r>
+        <w:t xml:space="preserve">An Artificial Neural Network (ANN) consists of several computing units called </w:t>
+      </w:r>
+      <w:r>
+        <w:rPr>
+          <w:rStyle w:val="Strong"/>
+        </w:rPr>
+        <w:t>neurons</w:t>
+      </w:r>
+      <w:r>
+        <w:t>, which are organized into three connected layers:</w:t>
+      </w:r>
+    </w:p>
+    <w:p>
+      <w:pPr>
+        <w:pStyle w:val="NormalWeb"/>
+        <w:numPr>
+          <w:ilvl w:val="0"/>
+          <w:numId w:val="35"/>
+        </w:numPr>
+      </w:pPr>
+      <w:r>
+        <w:rPr>
+          <w:rStyle w:val="Strong"/>
+        </w:rPr>
+        <w:t>Input Layer</w:t>
+      </w:r>
+      <w:r>
+        <w:t xml:space="preserve"> – Captures the input data.</w:t>
+      </w:r>
+    </w:p>
+    <w:p>
+      <w:pPr>
+        <w:pStyle w:val="NormalWeb"/>
+        <w:numPr>
+          <w:ilvl w:val="0"/>
+          <w:numId w:val="35"/>
+        </w:numPr>
+      </w:pPr>
+      <w:r>
+        <w:rPr>
+          <w:rStyle w:val="Strong"/>
+        </w:rPr>
+        <w:t>Hidden Layer(s)</w:t>
+      </w:r>
+      <w:r>
+        <w:t xml:space="preserve"> – Processes and learns patterns from the data. There can be one or many hidden layers.</w:t>
+      </w:r>
+    </w:p>
+    <w:p>
+      <w:pPr>
+        <w:pStyle w:val="NormalWeb"/>
+        <w:numPr>
+          <w:ilvl w:val="0"/>
+          <w:numId w:val="35"/>
+        </w:numPr>
+      </w:pPr>
+      <w:r>
+        <w:rPr>
+          <w:rStyle w:val="Strong"/>
+        </w:rPr>
+        <w:t>Output Layer</w:t>
+      </w:r>
+      <w:r>
+        <w:t xml:space="preserve"> – Produces the final prediction or output.</w:t>
+      </w:r>
+    </w:p>
+    <w:p>
+      <w:pPr>
+        <w:pStyle w:val="NormalWeb"/>
+      </w:pPr>
+      <w:r>
+        <w:lastRenderedPageBreak/>
+        <w:t>When a vast dataset is introduced into the network:</w:t>
+      </w:r>
+    </w:p>
+    <w:p>
+      <w:pPr>
+        <w:pStyle w:val="NormalWeb"/>
+        <w:numPr>
+          <w:ilvl w:val="0"/>
+          <w:numId w:val="36"/>
+        </w:numPr>
+      </w:pPr>
+      <w:r>
+        <w:t>Neurons in the input layer capture the data.</w:t>
+      </w:r>
+    </w:p>
+    <w:p>
+      <w:pPr>
+        <w:pStyle w:val="NormalWeb"/>
+        <w:numPr>
+          <w:ilvl w:val="0"/>
+          <w:numId w:val="36"/>
+        </w:numPr>
+      </w:pPr>
+      <w:r>
+        <w:t>Neurons in the hidden layers study and process the data.</w:t>
+      </w:r>
+    </w:p>
+    <w:p>
+      <w:pPr>
+        <w:pStyle w:val="NormalWeb"/>
+        <w:numPr>
+          <w:ilvl w:val="0"/>
+          <w:numId w:val="36"/>
+        </w:numPr>
+      </w:pPr>
+      <w:r>
+        <w:t>The output layer generates the final result.</w:t>
+      </w:r>
+    </w:p>
+    <w:p>
+      <w:pPr>
+        <w:pStyle w:val="Heading3"/>
+      </w:pPr>
+      <w:r>
+        <w:t>Parameters in Neural Networks</w:t>
+      </w:r>
+    </w:p>
+    <w:p>
+      <w:pPr>
+        <w:pStyle w:val="NormalWeb"/>
+      </w:pPr>
+      <w:r>
+        <w:t xml:space="preserve">Each neuron in the hidden layer contains </w:t>
+      </w:r>
+      <w:r>
+        <w:rPr>
+          <w:rStyle w:val="Strong"/>
+        </w:rPr>
+        <w:t>bias parameters</w:t>
+      </w:r>
+      <w:r>
+        <w:t xml:space="preserve">, while the connections between neurons contain </w:t>
+      </w:r>
+      <w:r>
+        <w:rPr>
+          <w:rStyle w:val="Strong"/>
+        </w:rPr>
+        <w:t>weight parameters</w:t>
+      </w:r>
+      <w:r>
+        <w:t>.</w:t>
+      </w:r>
+    </w:p>
+    <w:p>
+      <w:pPr>
+        <w:pStyle w:val="NormalWeb"/>
+      </w:pPr>
+      <w:r>
+        <w:rPr>
+          <w:rStyle w:val="Strong"/>
+        </w:rPr>
+        <w:t>Parameters</w:t>
+      </w:r>
+      <w:r>
+        <w:t xml:space="preserve"> are internal values of a neural network that are optimized as the neurons repeatedly train on large datasets.</w:t>
+      </w:r>
+    </w:p>
+    <w:p>
+      <w:pPr>
+        <w:pStyle w:val="NormalWeb"/>
+      </w:pPr>
+      <w:r>
+        <w:t xml:space="preserve">The greater the number of </w:t>
+      </w:r>
+      <w:r>
+        <w:rPr>
+          <w:rStyle w:val="Strong"/>
+        </w:rPr>
+        <w:t>bias</w:t>
+      </w:r>
+      <w:r>
+        <w:t xml:space="preserve"> and </w:t>
+      </w:r>
+      <w:r>
+        <w:rPr>
+          <w:rStyle w:val="Strong"/>
+        </w:rPr>
+        <w:t>weight</w:t>
+      </w:r>
+      <w:r>
+        <w:t xml:space="preserve"> parameters:</w:t>
+      </w:r>
+    </w:p>
+    <w:p>
+      <w:pPr>
+        <w:pStyle w:val="NormalWeb"/>
+        <w:numPr>
+          <w:ilvl w:val="0"/>
+          <w:numId w:val="37"/>
+        </w:numPr>
+      </w:pPr>
+      <w:r>
+        <w:t>The stronger the computational power of the network.</w:t>
+      </w:r>
+    </w:p>
+    <w:p>
+      <w:pPr>
+        <w:pStyle w:val="NormalWeb"/>
+        <w:numPr>
+          <w:ilvl w:val="0"/>
+          <w:numId w:val="37"/>
+        </w:numPr>
+      </w:pPr>
+      <w:r>
+        <w:t>The higher the predictive accuracy.</w:t>
+      </w:r>
+    </w:p>
+    <w:p>
+      <w:pPr>
+        <w:pStyle w:val="Heading2"/>
+      </w:pPr>
+      <w:r>
+        <w:t>Types of Deep Learning Training</w:t>
+      </w:r>
+    </w:p>
+    <w:p>
+      <w:pPr>
+        <w:pStyle w:val="NormalWeb"/>
+      </w:pPr>
+      <w:r>
+        <w:t xml:space="preserve">Deep learning algorithms are commonly trained using either </w:t>
+      </w:r>
+      <w:r>
+        <w:rPr>
+          <w:rStyle w:val="Strong"/>
+        </w:rPr>
+        <w:t>supervised learning</w:t>
+      </w:r>
+      <w:r>
+        <w:t xml:space="preserve"> or </w:t>
+      </w:r>
+      <w:r>
+        <w:rPr>
+          <w:rStyle w:val="Strong"/>
+        </w:rPr>
+        <w:t>unsupervised learning</w:t>
+      </w:r>
+      <w:r>
+        <w:t>.</w:t>
+      </w:r>
+    </w:p>
+    <w:p>
+      <w:pPr>
+        <w:pStyle w:val="Heading3"/>
+      </w:pPr>
+      <w:r>
+        <w:t>Supervised Learning</w:t>
+      </w:r>
+    </w:p>
+    <w:p>
+      <w:pPr>
+        <w:pStyle w:val="NormalWeb"/>
+      </w:pPr>
+      <w:r>
+        <w:t xml:space="preserve">In supervised learning, algorithms are trained on </w:t>
+      </w:r>
+      <w:r>
+        <w:rPr>
+          <w:rStyle w:val="Strong"/>
+        </w:rPr>
+        <w:t>labeled datasets</w:t>
+      </w:r>
+      <w:r>
+        <w:t>, where every input has a known output.</w:t>
+      </w:r>
+    </w:p>
+    <w:p>
+      <w:pPr>
+        <w:pStyle w:val="NormalWeb"/>
+      </w:pPr>
+      <w:r>
+        <w:t>Applications include:</w:t>
+      </w:r>
+    </w:p>
+    <w:p>
+      <w:pPr>
+        <w:pStyle w:val="NormalWeb"/>
+        <w:numPr>
+          <w:ilvl w:val="0"/>
+          <w:numId w:val="38"/>
+        </w:numPr>
+      </w:pPr>
+      <w:r>
+        <w:t>Email filtering</w:t>
+      </w:r>
+    </w:p>
+    <w:p>
+      <w:pPr>
+        <w:pStyle w:val="NormalWeb"/>
+        <w:numPr>
+          <w:ilvl w:val="0"/>
+          <w:numId w:val="38"/>
+        </w:numPr>
+      </w:pPr>
+      <w:r>
+        <w:t>Credit score evaluation</w:t>
+      </w:r>
+    </w:p>
+    <w:p>
+      <w:pPr>
+        <w:pStyle w:val="NormalWeb"/>
+        <w:numPr>
+          <w:ilvl w:val="0"/>
+          <w:numId w:val="38"/>
+        </w:numPr>
+      </w:pPr>
+      <w:r>
+        <w:t>Fraud detection</w:t>
+      </w:r>
+    </w:p>
+    <w:p>
+      <w:pPr>
+        <w:pStyle w:val="NormalWeb"/>
+        <w:numPr>
+          <w:ilvl w:val="0"/>
+          <w:numId w:val="38"/>
+        </w:numPr>
+      </w:pPr>
+      <w:r>
+        <w:t>Image recognition</w:t>
+      </w:r>
+    </w:p>
+    <w:p>
+      <w:pPr>
+        <w:pStyle w:val="NormalWeb"/>
+        <w:numPr>
+          <w:ilvl w:val="0"/>
+          <w:numId w:val="38"/>
+        </w:numPr>
+      </w:pPr>
+      <w:r>
+        <w:t>Voice recognition</w:t>
+      </w:r>
+    </w:p>
+    <w:p>
+      <w:pPr>
+        <w:pStyle w:val="Heading4"/>
+      </w:pPr>
+      <w:r>
+        <w:t>Limitations of Supervised Learning</w:t>
+      </w:r>
+    </w:p>
+    <w:p>
+      <w:pPr>
+        <w:pStyle w:val="NormalWeb"/>
+      </w:pPr>
+      <w:r>
+        <w:t>Although better labeling can improve algorithm quality, supervised learning has several limitations:</w:t>
+      </w:r>
+    </w:p>
+    <w:p>
+      <w:pPr>
+        <w:pStyle w:val="NormalWeb"/>
+        <w:numPr>
+          <w:ilvl w:val="0"/>
+          <w:numId w:val="39"/>
+        </w:numPr>
+      </w:pPr>
+      <w:r>
+        <w:t>Algorithms are restricted to predefined responses.</w:t>
+      </w:r>
+    </w:p>
+    <w:p>
+      <w:pPr>
+        <w:pStyle w:val="NormalWeb"/>
+        <w:numPr>
+          <w:ilvl w:val="0"/>
+          <w:numId w:val="39"/>
+        </w:numPr>
+      </w:pPr>
+      <w:r>
+        <w:t>Creating labeled datasets is time-consuming.</w:t>
+      </w:r>
+    </w:p>
+    <w:p>
+      <w:pPr>
+        <w:pStyle w:val="NormalWeb"/>
+        <w:numPr>
+          <w:ilvl w:val="0"/>
+          <w:numId w:val="39"/>
+        </w:numPr>
+      </w:pPr>
+      <w:r>
+        <w:t>Labeling data is expensive.</w:t>
+      </w:r>
+    </w:p>
+    <w:p>
+      <w:pPr>
+        <w:pStyle w:val="Heading3"/>
+      </w:pPr>
+      <w:r>
+        <w:lastRenderedPageBreak/>
+        <w:t>Unsupervised Learning</w:t>
+      </w:r>
+    </w:p>
+    <w:p>
+      <w:pPr>
+        <w:pStyle w:val="NormalWeb"/>
+      </w:pPr>
+      <w:r>
+        <w:t xml:space="preserve">More commonly, deep learning algorithms are trained on </w:t>
+      </w:r>
+      <w:r>
+        <w:rPr>
+          <w:rStyle w:val="Strong"/>
+        </w:rPr>
+        <w:t>unlabeled datasets</w:t>
+      </w:r>
+      <w:r>
+        <w:t>, where the training data contains inputs without explicit target outputs.</w:t>
+      </w:r>
+    </w:p>
+    <w:p>
+      <w:pPr>
+        <w:pStyle w:val="NormalWeb"/>
+      </w:pPr>
+      <w:r>
+        <w:t>Common applications include:</w:t>
+      </w:r>
+    </w:p>
+    <w:p>
+      <w:pPr>
+        <w:pStyle w:val="NormalWeb"/>
+        <w:numPr>
+          <w:ilvl w:val="0"/>
+          <w:numId w:val="40"/>
+        </w:numPr>
+      </w:pPr>
+      <w:r>
+        <w:t>Clustering</w:t>
+      </w:r>
+    </w:p>
+    <w:p>
+      <w:pPr>
+        <w:pStyle w:val="NormalWeb"/>
+        <w:numPr>
+          <w:ilvl w:val="0"/>
+          <w:numId w:val="40"/>
+        </w:numPr>
+      </w:pPr>
+      <w:r>
+        <w:t>Dimensionality Reduction</w:t>
+      </w:r>
+    </w:p>
+    <w:p>
+      <w:pPr>
+        <w:pStyle w:val="Heading4"/>
+      </w:pPr>
+      <w:r>
+        <w:t>Clustering</w:t>
+      </w:r>
+    </w:p>
+    <w:p>
+      <w:pPr>
+        <w:pStyle w:val="NormalWeb"/>
+      </w:pPr>
+      <w:r>
+        <w:t>Clustering groups similar data instances together based on their inherent properties.</w:t>
+      </w:r>
+    </w:p>
+    <w:p>
+      <w:pPr>
+        <w:pStyle w:val="Heading4"/>
+      </w:pPr>
+      <w:r>
+        <w:t>Dimensionality Reduction</w:t>
+      </w:r>
+    </w:p>
+    <w:p>
+      <w:pPr>
+        <w:pStyle w:val="NormalWeb"/>
+      </w:pPr>
+      <w:r>
+        <w:t>Dimensionality reduction captures the most important features of data while discarding redundant or less informative information.</w:t>
+      </w:r>
+    </w:p>
+    <w:p>
+      <w:pPr>
+        <w:pStyle w:val="NormalWeb"/>
+      </w:pPr>
+      <w:r>
+        <w:t>Because of this, unsupervised learning algorithms are better able to discover patterns and hierarchies within datasets, often producing more efficient and accurate results.</w:t>
+      </w:r>
+    </w:p>
+    <w:p>
+      <w:pPr>
+        <w:pStyle w:val="Heading2"/>
+      </w:pPr>
+      <w:r>
+        <w:t>Factors Affecting Deep Learning Performance</w:t>
+      </w:r>
+    </w:p>
+    <w:p>
+      <w:pPr>
+        <w:pStyle w:val="NormalWeb"/>
+      </w:pPr>
+      <w:r>
+        <w:t>The quality of responses generated by deep learning algorithms depends mainly on:</w:t>
+      </w:r>
+    </w:p>
+    <w:p>
+      <w:pPr>
+        <w:pStyle w:val="NormalWeb"/>
+        <w:numPr>
+          <w:ilvl w:val="0"/>
+          <w:numId w:val="41"/>
+        </w:numPr>
+      </w:pPr>
+      <w:r>
+        <w:t>The quality of the large dataset used for training.</w:t>
+      </w:r>
+    </w:p>
+    <w:p>
+      <w:pPr>
+        <w:pStyle w:val="NormalWeb"/>
+        <w:numPr>
+          <w:ilvl w:val="0"/>
+          <w:numId w:val="41"/>
+        </w:numPr>
+      </w:pPr>
+      <w:r>
+        <w:t>The neural network architecture employed.</w:t>
+      </w:r>
+    </w:p>
+    <w:p>
+      <w:pPr>
+        <w:pStyle w:val="Heading2"/>
+      </w:pPr>
+      <w:r>
+        <w:t>Deep Learning Architectures</w:t>
+      </w:r>
+    </w:p>
+    <w:p>
+      <w:pPr>
+        <w:pStyle w:val="NormalWeb"/>
+      </w:pPr>
+      <w:r>
+        <w:t>Three major deep learning architectures are commonly used:</w:t>
+      </w:r>
+    </w:p>
+    <w:p>
+      <w:pPr>
+        <w:pStyle w:val="NormalWeb"/>
+        <w:numPr>
+          <w:ilvl w:val="0"/>
+          <w:numId w:val="42"/>
+        </w:numPr>
+      </w:pPr>
+      <w:r>
+        <w:t>Convolutional Neural Networks (CNNs)</w:t>
+      </w:r>
+    </w:p>
+    <w:p>
+      <w:pPr>
+        <w:pStyle w:val="NormalWeb"/>
+        <w:numPr>
+          <w:ilvl w:val="0"/>
+          <w:numId w:val="42"/>
+        </w:numPr>
+      </w:pPr>
+      <w:r>
+        <w:t>Recurrent Neural Networks (RNNs)</w:t>
+      </w:r>
+    </w:p>
+    <w:p>
+      <w:pPr>
+        <w:pStyle w:val="NormalWeb"/>
+        <w:numPr>
+          <w:ilvl w:val="0"/>
+          <w:numId w:val="42"/>
+        </w:numPr>
+      </w:pPr>
+      <w:r>
+        <w:t>Transformer-Based Models</w:t>
+      </w:r>
+    </w:p>
+    <w:p>
+      <w:pPr>
+        <w:pStyle w:val="Heading3"/>
+      </w:pPr>
+      <w:r>
+        <w:t>Convolutional Neural Networks (CNNs)</w:t>
+      </w:r>
+    </w:p>
+    <w:p>
+      <w:pPr>
+        <w:pStyle w:val="NormalWeb"/>
+      </w:pPr>
+      <w:r>
+        <w:t xml:space="preserve">Convolutional Neural Networks (CNNs) consist of multiple layers, each performing a </w:t>
+      </w:r>
+      <w:r>
+        <w:rPr>
+          <w:rStyle w:val="Strong"/>
+        </w:rPr>
+        <w:t>convolution</w:t>
+      </w:r>
+      <w:r>
+        <w:t xml:space="preserve"> (a mathematical operation) on the output of the previous layer.</w:t>
+      </w:r>
+    </w:p>
+    <w:p>
+      <w:pPr>
+        <w:pStyle w:val="NormalWeb"/>
+      </w:pPr>
+      <w:r>
+        <w:t>When applied to grid-based data such as images, CNNs can efficiently:</w:t>
+      </w:r>
+    </w:p>
+    <w:p>
+      <w:pPr>
+        <w:pStyle w:val="NormalWeb"/>
+        <w:numPr>
+          <w:ilvl w:val="0"/>
+          <w:numId w:val="43"/>
+        </w:numPr>
+      </w:pPr>
+      <w:r>
+        <w:t>Extract useful information from images.</w:t>
+      </w:r>
+    </w:p>
+    <w:p>
+      <w:pPr>
+        <w:pStyle w:val="NormalWeb"/>
+        <w:numPr>
+          <w:ilvl w:val="0"/>
+          <w:numId w:val="43"/>
+        </w:numPr>
+      </w:pPr>
+      <w:r>
+        <w:t>Recognize patterns.</w:t>
+      </w:r>
+    </w:p>
+    <w:p>
+      <w:pPr>
+        <w:pStyle w:val="NormalWeb"/>
+        <w:numPr>
+          <w:ilvl w:val="0"/>
+          <w:numId w:val="43"/>
+        </w:numPr>
+      </w:pPr>
+      <w:r>
+        <w:t>Classify images.</w:t>
+      </w:r>
+    </w:p>
+    <w:p>
+      <w:pPr>
+        <w:pStyle w:val="NormalWeb"/>
+        <w:numPr>
+          <w:ilvl w:val="0"/>
+          <w:numId w:val="43"/>
+        </w:numPr>
+      </w:pPr>
+      <w:r>
+        <w:t>Segment images.</w:t>
+      </w:r>
+    </w:p>
+    <w:p>
+      <w:pPr>
+        <w:pStyle w:val="NormalWeb"/>
+      </w:pPr>
+      <w:r>
+        <w:lastRenderedPageBreak/>
+        <w:t>Applications of CNNs include:</w:t>
+      </w:r>
+    </w:p>
+    <w:p>
+      <w:pPr>
+        <w:pStyle w:val="NormalWeb"/>
+        <w:numPr>
+          <w:ilvl w:val="0"/>
+          <w:numId w:val="44"/>
+        </w:numPr>
+      </w:pPr>
+      <w:r>
+        <w:t>Image processing</w:t>
+      </w:r>
+    </w:p>
+    <w:p>
+      <w:pPr>
+        <w:pStyle w:val="NormalWeb"/>
+        <w:numPr>
+          <w:ilvl w:val="0"/>
+          <w:numId w:val="44"/>
+        </w:numPr>
+      </w:pPr>
+      <w:r>
+        <w:t>Video recognition</w:t>
+      </w:r>
+    </w:p>
+    <w:p>
+      <w:pPr>
+        <w:pStyle w:val="NormalWeb"/>
+        <w:numPr>
+          <w:ilvl w:val="0"/>
+          <w:numId w:val="44"/>
+        </w:numPr>
+      </w:pPr>
+      <w:r>
+        <w:t>Natural Language Processing (NLP)</w:t>
+      </w:r>
+    </w:p>
+    <w:p>
+      <w:pPr>
+        <w:pStyle w:val="Heading3"/>
+      </w:pPr>
+      <w:r>
+        <w:t>Recurrent Neural Networks (RNNs)</w:t>
+      </w:r>
+    </w:p>
+    <w:p>
+      <w:pPr>
+        <w:pStyle w:val="NormalWeb"/>
+      </w:pPr>
+      <w:r>
+        <w:t xml:space="preserve">Recurrent Neural Networks (RNNs) are designed for processing </w:t>
+      </w:r>
+      <w:r>
+        <w:rPr>
+          <w:rStyle w:val="Strong"/>
+        </w:rPr>
+        <w:t>sequential data</w:t>
+      </w:r>
+      <w:r>
+        <w:t>, such as text and speech.</w:t>
+      </w:r>
+    </w:p>
+    <w:p>
+      <w:pPr>
+        <w:pStyle w:val="NormalWeb"/>
+      </w:pPr>
+      <w:r>
+        <w:t xml:space="preserve">A key characteristic of RNNs is their </w:t>
+      </w:r>
+      <w:r>
+        <w:rPr>
+          <w:rStyle w:val="Strong"/>
+        </w:rPr>
+        <w:t>memory component</w:t>
+      </w:r>
+      <w:r>
+        <w:t>, which enables them to capture dependencies and contextual information over time.</w:t>
+      </w:r>
+    </w:p>
+    <w:p>
+      <w:pPr>
+        <w:pStyle w:val="NormalWeb"/>
+      </w:pPr>
+      <w:r>
+        <w:t>Applications of RNNs include:</w:t>
+      </w:r>
+    </w:p>
+    <w:p>
+      <w:pPr>
+        <w:pStyle w:val="NormalWeb"/>
+        <w:numPr>
+          <w:ilvl w:val="0"/>
+          <w:numId w:val="45"/>
+        </w:numPr>
+      </w:pPr>
+      <w:r>
+        <w:t>Machine translation</w:t>
+      </w:r>
+    </w:p>
+    <w:p>
+      <w:pPr>
+        <w:pStyle w:val="NormalWeb"/>
+        <w:numPr>
+          <w:ilvl w:val="0"/>
+          <w:numId w:val="45"/>
+        </w:numPr>
+      </w:pPr>
+      <w:r>
+        <w:t>Sentiment analysis</w:t>
+      </w:r>
+    </w:p>
+    <w:p>
+      <w:pPr>
+        <w:pStyle w:val="NormalWeb"/>
+        <w:numPr>
+          <w:ilvl w:val="0"/>
+          <w:numId w:val="45"/>
+        </w:numPr>
+      </w:pPr>
+      <w:r>
+        <w:t>Speech recognition</w:t>
+      </w:r>
+    </w:p>
+    <w:p>
+      <w:pPr>
+        <w:pStyle w:val="Heading3"/>
+      </w:pPr>
+      <w:r>
+        <w:t>Transformer-Based Models</w:t>
+      </w:r>
+    </w:p>
+    <w:p>
+      <w:pPr>
+        <w:pStyle w:val="NormalWeb"/>
+      </w:pPr>
+      <w:r>
+        <w:t>Transformer-based models do not rely on convolutions or recurrence for processing data.</w:t>
+      </w:r>
+    </w:p>
+    <w:p>
+      <w:pPr>
+        <w:pStyle w:val="NormalWeb"/>
+      </w:pPr>
+      <w:r>
+        <w:t xml:space="preserve">Instead, they use a </w:t>
+      </w:r>
+      <w:r>
+        <w:rPr>
+          <w:rStyle w:val="Strong"/>
+        </w:rPr>
+        <w:t>two-stack architecture</w:t>
+      </w:r>
+      <w:r>
+        <w:t xml:space="preserve"> consisting of:</w:t>
+      </w:r>
+    </w:p>
+    <w:p>
+      <w:pPr>
+        <w:pStyle w:val="NormalWeb"/>
+        <w:numPr>
+          <w:ilvl w:val="0"/>
+          <w:numId w:val="46"/>
+        </w:numPr>
+      </w:pPr>
+      <w:r>
+        <w:t>Encoder</w:t>
+      </w:r>
+    </w:p>
+    <w:p>
+      <w:pPr>
+        <w:pStyle w:val="NormalWeb"/>
+        <w:numPr>
+          <w:ilvl w:val="0"/>
+          <w:numId w:val="46"/>
+        </w:numPr>
+      </w:pPr>
+      <w:r>
+        <w:t>Decoder</w:t>
+      </w:r>
+    </w:p>
+    <w:p>
+      <w:pPr>
+        <w:pStyle w:val="NormalWeb"/>
+      </w:pPr>
+      <w:r>
+        <w:t>These components process an exceptionally large number of parameters to understand language patterns more effectively.</w:t>
+      </w:r>
+    </w:p>
+    <w:p>
+      <w:pPr>
+        <w:pStyle w:val="NormalWeb"/>
+      </w:pPr>
+      <w:r>
+        <w:t>Transformer models can:</w:t>
+      </w:r>
+    </w:p>
+    <w:p>
+      <w:pPr>
+        <w:pStyle w:val="NormalWeb"/>
+        <w:numPr>
+          <w:ilvl w:val="0"/>
+          <w:numId w:val="47"/>
+        </w:numPr>
+      </w:pPr>
+      <w:r>
+        <w:t>Analyze the context of words.</w:t>
+      </w:r>
+    </w:p>
+    <w:p>
+      <w:pPr>
+        <w:pStyle w:val="NormalWeb"/>
+        <w:numPr>
+          <w:ilvl w:val="0"/>
+          <w:numId w:val="47"/>
+        </w:numPr>
+      </w:pPr>
+      <w:r>
+        <w:t>Understand relationships between words.</w:t>
+      </w:r>
+    </w:p>
+    <w:p>
+      <w:pPr>
+        <w:pStyle w:val="NormalWeb"/>
+        <w:numPr>
+          <w:ilvl w:val="0"/>
+          <w:numId w:val="47"/>
+        </w:numPr>
+      </w:pPr>
+      <w:r>
+        <w:t>Capture hierarchical language patterns.</w:t>
+      </w:r>
+    </w:p>
+    <w:p>
+      <w:pPr>
+        <w:pStyle w:val="NormalWeb"/>
+        <w:numPr>
+          <w:ilvl w:val="0"/>
+          <w:numId w:val="47"/>
+        </w:numPr>
+      </w:pPr>
+      <w:r>
+        <w:t>Predict the next word in a sequence.</w:t>
+      </w:r>
+    </w:p>
+    <w:p>
+      <w:pPr>
+        <w:pStyle w:val="NormalWeb"/>
+      </w:pPr>
+      <w:r>
+        <w:t xml:space="preserve">This enables the creation of </w:t>
+      </w:r>
+      <w:r>
+        <w:rPr>
+          <w:rStyle w:val="Strong"/>
+        </w:rPr>
+        <w:t>Large Language Models (LLMs)</w:t>
+      </w:r>
+      <w:r>
+        <w:t xml:space="preserve"> capable of performing various </w:t>
+      </w:r>
+      <w:r>
+        <w:rPr>
+          <w:rStyle w:val="Strong"/>
+        </w:rPr>
+        <w:t>Natural Language Processing (NLP)</w:t>
+      </w:r>
+      <w:r>
+        <w:t xml:space="preserve"> tasks.</w:t>
+      </w:r>
+    </w:p>
+    <w:p>
+      <w:pPr>
+        <w:pStyle w:val="NormalWeb"/>
+      </w:pPr>
+      <w:r>
+        <w:t>Applications include:</w:t>
+      </w:r>
+    </w:p>
+    <w:p>
+      <w:pPr>
+        <w:pStyle w:val="NormalWeb"/>
+        <w:numPr>
+          <w:ilvl w:val="0"/>
+          <w:numId w:val="48"/>
+        </w:numPr>
+      </w:pPr>
+      <w:r>
+        <w:t>Content generation</w:t>
+      </w:r>
+    </w:p>
+    <w:p>
+      <w:pPr>
+        <w:pStyle w:val="NormalWeb"/>
+        <w:numPr>
+          <w:ilvl w:val="0"/>
+          <w:numId w:val="48"/>
+        </w:numPr>
+      </w:pPr>
+      <w:r>
+        <w:t>Predictive analysis</w:t>
+      </w:r>
+    </w:p>
+    <w:p>
+      <w:pPr>
+        <w:pStyle w:val="NormalWeb"/>
+        <w:numPr>
+          <w:ilvl w:val="0"/>
+          <w:numId w:val="48"/>
+        </w:numPr>
+      </w:pPr>
+      <w:r>
+        <w:t>Language translation</w:t>
+      </w:r>
+    </w:p>
+    <w:p>
+      <w:pPr>
+        <w:pStyle w:val="NormalWeb"/>
+        <w:numPr>
+          <w:ilvl w:val="0"/>
+          <w:numId w:val="48"/>
+        </w:numPr>
+      </w:pPr>
+      <w:r>
+        <w:t>Process automation</w:t>
+      </w:r>
+    </w:p>
+    <w:p>
+      <w:pPr>
+        <w:pStyle w:val="Heading2"/>
+      </w:pPr>
+      <w:r>
+        <w:lastRenderedPageBreak/>
+        <w:t>Large Language Models (LLMs)</w:t>
+      </w:r>
+    </w:p>
+    <w:p>
+      <w:pPr>
+        <w:pStyle w:val="NormalWeb"/>
+      </w:pPr>
+      <w:r>
+        <w:t>Large Language Models (LLMs) serve as the foundational mechanism behind Generative AI applications.</w:t>
+      </w:r>
+    </w:p>
+    <w:p>
+      <w:pPr>
+        <w:pStyle w:val="NormalWeb"/>
+      </w:pPr>
+      <w:r>
+        <w:t>Examples of LLMs include:</w:t>
+      </w:r>
+    </w:p>
+    <w:p>
+      <w:pPr>
+        <w:pStyle w:val="NormalWeb"/>
+        <w:numPr>
+          <w:ilvl w:val="0"/>
+          <w:numId w:val="49"/>
+        </w:numPr>
+      </w:pPr>
+      <w:r>
+        <w:t>OpenAI's Generative Pre-trained Transformers (GPT-3 and GPT-4)</w:t>
+      </w:r>
+    </w:p>
+    <w:p>
+      <w:pPr>
+        <w:pStyle w:val="NormalWeb"/>
+        <w:numPr>
+          <w:ilvl w:val="0"/>
+          <w:numId w:val="49"/>
+        </w:numPr>
+      </w:pPr>
+      <w:r>
+        <w:t>Google's PaLM 2</w:t>
+      </w:r>
+    </w:p>
+    <w:p>
+      <w:pPr>
+        <w:pStyle w:val="NormalWeb"/>
+        <w:numPr>
+          <w:ilvl w:val="0"/>
+          <w:numId w:val="49"/>
+        </w:numPr>
+      </w:pPr>
+      <w:r>
+        <w:t>Meta's Llama</w:t>
+      </w:r>
+    </w:p>
+    <w:p>
+      <w:pPr>
+        <w:pStyle w:val="Heading3"/>
+      </w:pPr>
+      <w:r>
+        <w:t>GPT-4 Example</w:t>
+      </w:r>
+    </w:p>
+    <w:p>
+      <w:pPr>
+        <w:pStyle w:val="NormalWeb"/>
+      </w:pPr>
+      <w:r>
+        <w:t>GPT-4 is a language processing AI model trained on a massive corpus of Internet text, including:</w:t>
+      </w:r>
+    </w:p>
+    <w:p>
+      <w:pPr>
+        <w:pStyle w:val="NormalWeb"/>
+        <w:numPr>
+          <w:ilvl w:val="0"/>
+          <w:numId w:val="50"/>
+        </w:numPr>
+      </w:pPr>
+      <w:r>
+        <w:t>Books</w:t>
+      </w:r>
+    </w:p>
+    <w:p>
+      <w:pPr>
+        <w:pStyle w:val="NormalWeb"/>
+        <w:numPr>
+          <w:ilvl w:val="0"/>
+          <w:numId w:val="50"/>
+        </w:numPr>
+      </w:pPr>
+      <w:r>
+        <w:t>Articles</w:t>
+      </w:r>
+    </w:p>
+    <w:p>
+      <w:pPr>
+        <w:pStyle w:val="NormalWeb"/>
+        <w:numPr>
+          <w:ilvl w:val="0"/>
+          <w:numId w:val="50"/>
+        </w:numPr>
+      </w:pPr>
+      <w:r>
+        <w:t>Websites</w:t>
+      </w:r>
+    </w:p>
+    <w:p>
+      <w:pPr>
+        <w:pStyle w:val="NormalWeb"/>
+      </w:pPr>
+      <w:r>
+        <w:t xml:space="preserve">The model contains </w:t>
+      </w:r>
+      <w:r>
+        <w:rPr>
+          <w:rStyle w:val="Strong"/>
+        </w:rPr>
+        <w:t>over 170 trillion parameters</w:t>
+      </w:r>
+      <w:r>
+        <w:t>, enabling it to perform advanced Natural Language Processing tasks such as:</w:t>
+      </w:r>
+    </w:p>
+    <w:p>
+      <w:pPr>
+        <w:pStyle w:val="NormalWeb"/>
+        <w:numPr>
+          <w:ilvl w:val="0"/>
+          <w:numId w:val="51"/>
+        </w:numPr>
+      </w:pPr>
+      <w:r>
+        <w:t>Content creation</w:t>
+      </w:r>
+    </w:p>
+    <w:p>
+      <w:pPr>
+        <w:pStyle w:val="NormalWeb"/>
+        <w:numPr>
+          <w:ilvl w:val="0"/>
+          <w:numId w:val="51"/>
+        </w:numPr>
+      </w:pPr>
+      <w:r>
+        <w:t>Dialogue systems</w:t>
+      </w:r>
+    </w:p>
+    <w:p>
+      <w:pPr>
+        <w:pStyle w:val="NormalWeb"/>
+        <w:numPr>
+          <w:ilvl w:val="0"/>
+          <w:numId w:val="51"/>
+        </w:numPr>
+      </w:pPr>
+      <w:r>
+        <w:t>Language translation</w:t>
+      </w:r>
+    </w:p>
+    <w:p>
+      <w:pPr>
+        <w:pStyle w:val="NormalWeb"/>
+      </w:pPr>
+      <w:r>
+        <w:t>People use GPT-4 to:</w:t>
+      </w:r>
+    </w:p>
+    <w:p>
+      <w:pPr>
+        <w:pStyle w:val="NormalWeb"/>
+        <w:numPr>
+          <w:ilvl w:val="0"/>
+          <w:numId w:val="52"/>
+        </w:numPr>
+      </w:pPr>
+      <w:r>
+        <w:t>Write high-quality essays.</w:t>
+      </w:r>
+    </w:p>
+    <w:p>
+      <w:pPr>
+        <w:pStyle w:val="NormalWeb"/>
+        <w:numPr>
+          <w:ilvl w:val="0"/>
+          <w:numId w:val="52"/>
+        </w:numPr>
+      </w:pPr>
+      <w:r>
+        <w:t>Prepare case papers.</w:t>
+      </w:r>
+    </w:p>
+    <w:p>
+      <w:pPr>
+        <w:pStyle w:val="NormalWeb"/>
+        <w:numPr>
+          <w:ilvl w:val="0"/>
+          <w:numId w:val="52"/>
+        </w:numPr>
+      </w:pPr>
+      <w:r>
+        <w:t>Perform machine translation.</w:t>
+      </w:r>
+    </w:p>
+    <w:p>
+      <w:pPr>
+        <w:pStyle w:val="NormalWeb"/>
+        <w:numPr>
+          <w:ilvl w:val="0"/>
+          <w:numId w:val="52"/>
+        </w:numPr>
+      </w:pPr>
+      <w:r>
+        <w:t>Generate summaries.</w:t>
+      </w:r>
+    </w:p>
+    <w:p>
+      <w:pPr>
+        <w:pStyle w:val="NormalWeb"/>
+      </w:pPr>
+      <w:r>
+        <w:t>Organizations use GPT-4 to:</w:t>
+      </w:r>
+    </w:p>
+    <w:p>
+      <w:pPr>
+        <w:pStyle w:val="NormalWeb"/>
+        <w:numPr>
+          <w:ilvl w:val="0"/>
+          <w:numId w:val="53"/>
+        </w:numPr>
+      </w:pPr>
+      <w:r>
+        <w:t>Power chatbots.</w:t>
+      </w:r>
+    </w:p>
+    <w:p>
+      <w:pPr>
+        <w:pStyle w:val="NormalWeb"/>
+        <w:numPr>
+          <w:ilvl w:val="0"/>
+          <w:numId w:val="53"/>
+        </w:numPr>
+      </w:pPr>
+      <w:r>
+        <w:t>Build virtual agents.</w:t>
+      </w:r>
+    </w:p>
+    <w:p>
+      <w:pPr>
+        <w:pStyle w:val="NormalWeb"/>
+        <w:numPr>
+          <w:ilvl w:val="0"/>
+          <w:numId w:val="53"/>
+        </w:numPr>
+      </w:pPr>
+      <w:r>
+        <w:t>Translate international business communications.</w:t>
+      </w:r>
+    </w:p>
+    <w:p>
+      <w:pPr>
+        <w:pStyle w:val="NormalWeb"/>
+        <w:numPr>
+          <w:ilvl w:val="0"/>
+          <w:numId w:val="53"/>
+        </w:numPr>
+      </w:pPr>
+      <w:r>
+        <w:t>Localize website content into different languages.</w:t>
+      </w:r>
+    </w:p>
+    <w:p>
+      <w:pPr>
+        <w:pStyle w:val="Heading2"/>
+      </w:pPr>
+      <w:r>
+        <w:t>Future of Large Language Models</w:t>
+      </w:r>
+    </w:p>
+    <w:p>
+      <w:pPr>
+        <w:pStyle w:val="NormalWeb"/>
+      </w:pPr>
+      <w:r>
+        <w:t>As deep learning architectures and technologies continue to evolve, Large Language Models will become increasingly capable of delivering more accurate and reliable outcomes, enabling Generative AI systems to perform increasingly complex tasks.</w:t>
+      </w:r>
+    </w:p>
+    <w:p>
+      <w:pPr>
+        <w:pStyle w:val="Heading2"/>
+      </w:pPr>
+      <w:r>
+        <w:lastRenderedPageBreak/>
+        <w:t>Key Takeaways</w:t>
+      </w:r>
+    </w:p>
+    <w:p>
+      <w:pPr>
+        <w:pStyle w:val="NormalWeb"/>
+        <w:numPr>
+          <w:ilvl w:val="0"/>
+          <w:numId w:val="54"/>
+        </w:numPr>
+      </w:pPr>
+      <w:r>
+        <w:t>Deep learning is inspired by the layered information-processing approach of the human brain.</w:t>
+      </w:r>
+    </w:p>
+    <w:p>
+      <w:pPr>
+        <w:pStyle w:val="NormalWeb"/>
+        <w:numPr>
+          <w:ilvl w:val="0"/>
+          <w:numId w:val="54"/>
+        </w:numPr>
+      </w:pPr>
+      <w:r>
+        <w:t>Artificial Neural Networks (ANNs) enable deep learning through interconnected neurons organized into input, hidden, and output layers.</w:t>
+      </w:r>
+    </w:p>
+    <w:p>
+      <w:pPr>
+        <w:pStyle w:val="NormalWeb"/>
+        <w:numPr>
+          <w:ilvl w:val="0"/>
+          <w:numId w:val="54"/>
+        </w:numPr>
+      </w:pPr>
+      <w:r>
+        <w:t xml:space="preserve">Neural networks learn by optimizing </w:t>
+      </w:r>
+      <w:r>
+        <w:rPr>
+          <w:rStyle w:val="Strong"/>
+        </w:rPr>
+        <w:t>bias</w:t>
+      </w:r>
+      <w:r>
+        <w:t xml:space="preserve"> and </w:t>
+      </w:r>
+      <w:r>
+        <w:rPr>
+          <w:rStyle w:val="Strong"/>
+        </w:rPr>
+        <w:t>weight</w:t>
+      </w:r>
+      <w:r>
+        <w:t xml:space="preserve"> parameters.</w:t>
+      </w:r>
+    </w:p>
+    <w:p>
+      <w:pPr>
+        <w:pStyle w:val="NormalWeb"/>
+        <w:numPr>
+          <w:ilvl w:val="0"/>
+          <w:numId w:val="54"/>
+        </w:numPr>
+      </w:pPr>
+      <w:r>
+        <w:t>Deep learning models can be trained using supervised or unsupervised learning.</w:t>
+      </w:r>
+    </w:p>
+    <w:p>
+      <w:pPr>
+        <w:pStyle w:val="NormalWeb"/>
+        <w:numPr>
+          <w:ilvl w:val="0"/>
+          <w:numId w:val="54"/>
+        </w:numPr>
+      </w:pPr>
+      <w:r>
+        <w:t>The quality of training data and the neural network architecture significantly influence model performance.</w:t>
+      </w:r>
+    </w:p>
+    <w:p>
+      <w:pPr>
+        <w:pStyle w:val="NormalWeb"/>
+        <w:numPr>
+          <w:ilvl w:val="0"/>
+          <w:numId w:val="54"/>
+        </w:numPr>
+      </w:pPr>
+      <w:r>
+        <w:t>The three primary deep learning architectures are CNNs, RNNs, and Transformer-based models.</w:t>
+      </w:r>
+    </w:p>
+    <w:p>
+      <w:pPr>
+        <w:pStyle w:val="NormalWeb"/>
+        <w:numPr>
+          <w:ilvl w:val="0"/>
+          <w:numId w:val="54"/>
+        </w:numPr>
+      </w:pPr>
+      <w:r>
+        <w:t>Transformer networks form the foundation of Large Language Models (LLMs).</w:t>
+      </w:r>
+    </w:p>
+    <w:p>
+      <w:pPr>
+        <w:pStyle w:val="NormalWeb"/>
+        <w:numPr>
+          <w:ilvl w:val="0"/>
+          <w:numId w:val="54"/>
+        </w:numPr>
+      </w:pPr>
+      <w:r>
+        <w:t>LLMs leverage transformer architectures to pretrain deep learning algorithms on vast datasets.</w:t>
+      </w:r>
+    </w:p>
+    <w:p>
+      <w:pPr>
+        <w:pStyle w:val="NormalWeb"/>
+        <w:numPr>
+          <w:ilvl w:val="0"/>
+          <w:numId w:val="54"/>
+        </w:numPr>
+      </w:pPr>
+      <w:r>
+        <w:t>LLMs capture patterns and hierarchies within data to generate accurate, human-like responses.</w:t>
+      </w:r>
+    </w:p>
+    <w:p>
+      <w:pPr>
+        <w:pStyle w:val="NormalWeb"/>
+        <w:numPr>
+          <w:ilvl w:val="0"/>
+          <w:numId w:val="54"/>
+        </w:numPr>
+      </w:pPr>
+      <w:r>
+        <w:t>This capability makes Generative AI scalable and enables applications such as content generation, translation, predictive analysis, and intelligent automation.</w:t>
       </w:r>
     </w:p>
     <w:p>
@@ -928,6 +2444,155 @@
     </w:lvl>
   </w:abstractNum>
   <w:abstractNum w:abstractNumId="1" w15:restartNumberingAfterBreak="0">
+    <w:nsid w:val="150752A2"/>
+    <w:multiLevelType w:val="multilevel"/>
+    <w:tmpl w:val="96C2311C"/>
+    <w:lvl w:ilvl="0">
+      <w:start w:val="1"/>
+      <w:numFmt w:val="bullet"/>
+      <w:lvlText w:val=""/>
+      <w:lvlJc w:val="left"/>
+      <w:pPr>
+        <w:tabs>
+          <w:tab w:val="num" w:pos="720"/>
+        </w:tabs>
+        <w:ind w:left="720" w:hanging="360"/>
+      </w:pPr>
+      <w:rPr>
+        <w:rFonts w:ascii="Symbol" w:hAnsi="Symbol" w:hint="default"/>
+        <w:sz w:val="20"/>
+      </w:rPr>
+    </w:lvl>
+    <w:lvl w:ilvl="1" w:tentative="1">
+      <w:start w:val="1"/>
+      <w:numFmt w:val="bullet"/>
+      <w:lvlText w:val="o"/>
+      <w:lvlJc w:val="left"/>
+      <w:pPr>
+        <w:tabs>
+          <w:tab w:val="num" w:pos="1440"/>
+        </w:tabs>
+        <w:ind w:left="1440" w:hanging="360"/>
+      </w:pPr>
+      <w:rPr>
+        <w:rFonts w:ascii="Courier New" w:hAnsi="Courier New" w:hint="default"/>
+        <w:sz w:val="20"/>
+      </w:rPr>
+    </w:lvl>
+    <w:lvl w:ilvl="2" w:tentative="1">
+      <w:start w:val="1"/>
+      <w:numFmt w:val="bullet"/>
+      <w:lvlText w:val=""/>
+      <w:lvlJc w:val="left"/>
+      <w:pPr>
+        <w:tabs>
+          <w:tab w:val="num" w:pos="2160"/>
+        </w:tabs>
+        <w:ind w:left="2160" w:hanging="360"/>
+      </w:pPr>
+      <w:rPr>
+        <w:rFonts w:ascii="Wingdings" w:hAnsi="Wingdings" w:hint="default"/>
+        <w:sz w:val="20"/>
+      </w:rPr>
+    </w:lvl>
+    <w:lvl w:ilvl="3" w:tentative="1">
+      <w:start w:val="1"/>
+      <w:numFmt w:val="bullet"/>
+      <w:lvlText w:val=""/>
+      <w:lvlJc w:val="left"/>
+      <w:pPr>
+        <w:tabs>
+          <w:tab w:val="num" w:pos="2880"/>
+        </w:tabs>
+        <w:ind w:left="2880" w:hanging="360"/>
+      </w:pPr>
+      <w:rPr>
+        <w:rFonts w:ascii="Wingdings" w:hAnsi="Wingdings" w:hint="default"/>
+        <w:sz w:val="20"/>
+      </w:rPr>
+    </w:lvl>
+    <w:lvl w:ilvl="4" w:tentative="1">
+      <w:start w:val="1"/>
+      <w:numFmt w:val="bullet"/>
+      <w:lvlText w:val=""/>
+      <w:lvlJc w:val="left"/>
+      <w:pPr>
+        <w:tabs>
+          <w:tab w:val="num" w:pos="3600"/>
+        </w:tabs>
+        <w:ind w:left="3600" w:hanging="360"/>
+      </w:pPr>
+      <w:rPr>
+        <w:rFonts w:ascii="Wingdings" w:hAnsi="Wingdings" w:hint="default"/>
+        <w:sz w:val="20"/>
+      </w:rPr>
+    </w:lvl>
+    <w:lvl w:ilvl="5" w:tentative="1">
+      <w:start w:val="1"/>
+      <w:numFmt w:val="bullet"/>
+      <w:lvlText w:val=""/>
+      <w:lvlJc w:val="left"/>
+      <w:pPr>
+        <w:tabs>
+          <w:tab w:val="num" w:pos="4320"/>
+        </w:tabs>
+        <w:ind w:left="4320" w:hanging="360"/>
+      </w:pPr>
+      <w:rPr>
+        <w:rFonts w:ascii="Wingdings" w:hAnsi="Wingdings" w:hint="default"/>
+        <w:sz w:val="20"/>
+      </w:rPr>
+    </w:lvl>
+    <w:lvl w:ilvl="6" w:tentative="1">
+      <w:start w:val="1"/>
+      <w:numFmt w:val="bullet"/>
+      <w:lvlText w:val=""/>
+      <w:lvlJc w:val="left"/>
+      <w:pPr>
+        <w:tabs>
+          <w:tab w:val="num" w:pos="5040"/>
+        </w:tabs>
+        <w:ind w:left="5040" w:hanging="360"/>
+      </w:pPr>
+      <w:rPr>
+        <w:rFonts w:ascii="Wingdings" w:hAnsi="Wingdings" w:hint="default"/>
+        <w:sz w:val="20"/>
+      </w:rPr>
+    </w:lvl>
+    <w:lvl w:ilvl="7" w:tentative="1">
+      <w:start w:val="1"/>
+      <w:numFmt w:val="bullet"/>
+      <w:lvlText w:val=""/>
+      <w:lvlJc w:val="left"/>
+      <w:pPr>
+        <w:tabs>
+          <w:tab w:val="num" w:pos="5760"/>
+        </w:tabs>
+        <w:ind w:left="5760" w:hanging="360"/>
+      </w:pPr>
+      <w:rPr>
+        <w:rFonts w:ascii="Wingdings" w:hAnsi="Wingdings" w:hint="default"/>
+        <w:sz w:val="20"/>
+      </w:rPr>
+    </w:lvl>
+    <w:lvl w:ilvl="8" w:tentative="1">
+      <w:start w:val="1"/>
+      <w:numFmt w:val="bullet"/>
+      <w:lvlText w:val=""/>
+      <w:lvlJc w:val="left"/>
+      <w:pPr>
+        <w:tabs>
+          <w:tab w:val="num" w:pos="6480"/>
+        </w:tabs>
+        <w:ind w:left="6480" w:hanging="360"/>
+      </w:pPr>
+      <w:rPr>
+        <w:rFonts w:ascii="Wingdings" w:hAnsi="Wingdings" w:hint="default"/>
+        <w:sz w:val="20"/>
+      </w:rPr>
+    </w:lvl>
+  </w:abstractNum>
+  <w:abstractNum w:abstractNumId="2" w15:restartNumberingAfterBreak="0">
     <w:nsid w:val="17C060EC"/>
     <w:multiLevelType w:val="multilevel"/>
     <w:tmpl w:val="1CA2C192"/>
@@ -1076,7 +2741,7 @@
       </w:rPr>
     </w:lvl>
   </w:abstractNum>
-  <w:abstractNum w:abstractNumId="2" w15:restartNumberingAfterBreak="0">
+  <w:abstractNum w:abstractNumId="3" w15:restartNumberingAfterBreak="0">
     <w:nsid w:val="1C313645"/>
     <w:multiLevelType w:val="multilevel"/>
     <w:tmpl w:val="45682496"/>
@@ -1225,7 +2890,305 @@
       </w:rPr>
     </w:lvl>
   </w:abstractNum>
-  <w:abstractNum w:abstractNumId="3" w15:restartNumberingAfterBreak="0">
+  <w:abstractNum w:abstractNumId="4" w15:restartNumberingAfterBreak="0">
+    <w:nsid w:val="202D0E83"/>
+    <w:multiLevelType w:val="multilevel"/>
+    <w:tmpl w:val="DB68E252"/>
+    <w:lvl w:ilvl="0">
+      <w:start w:val="1"/>
+      <w:numFmt w:val="bullet"/>
+      <w:lvlText w:val=""/>
+      <w:lvlJc w:val="left"/>
+      <w:pPr>
+        <w:tabs>
+          <w:tab w:val="num" w:pos="720"/>
+        </w:tabs>
+        <w:ind w:left="720" w:hanging="360"/>
+      </w:pPr>
+      <w:rPr>
+        <w:rFonts w:ascii="Symbol" w:hAnsi="Symbol" w:hint="default"/>
+        <w:sz w:val="20"/>
+      </w:rPr>
+    </w:lvl>
+    <w:lvl w:ilvl="1" w:tentative="1">
+      <w:start w:val="1"/>
+      <w:numFmt w:val="bullet"/>
+      <w:lvlText w:val="o"/>
+      <w:lvlJc w:val="left"/>
+      <w:pPr>
+        <w:tabs>
+          <w:tab w:val="num" w:pos="1440"/>
+        </w:tabs>
+        <w:ind w:left="1440" w:hanging="360"/>
+      </w:pPr>
+      <w:rPr>
+        <w:rFonts w:ascii="Courier New" w:hAnsi="Courier New" w:hint="default"/>
+        <w:sz w:val="20"/>
+      </w:rPr>
+    </w:lvl>
+    <w:lvl w:ilvl="2" w:tentative="1">
+      <w:start w:val="1"/>
+      <w:numFmt w:val="bullet"/>
+      <w:lvlText w:val=""/>
+      <w:lvlJc w:val="left"/>
+      <w:pPr>
+        <w:tabs>
+          <w:tab w:val="num" w:pos="2160"/>
+        </w:tabs>
+        <w:ind w:left="2160" w:hanging="360"/>
+      </w:pPr>
+      <w:rPr>
+        <w:rFonts w:ascii="Wingdings" w:hAnsi="Wingdings" w:hint="default"/>
+        <w:sz w:val="20"/>
+      </w:rPr>
+    </w:lvl>
+    <w:lvl w:ilvl="3" w:tentative="1">
+      <w:start w:val="1"/>
+      <w:numFmt w:val="bullet"/>
+      <w:lvlText w:val=""/>
+      <w:lvlJc w:val="left"/>
+      <w:pPr>
+        <w:tabs>
+          <w:tab w:val="num" w:pos="2880"/>
+        </w:tabs>
+        <w:ind w:left="2880" w:hanging="360"/>
+      </w:pPr>
+      <w:rPr>
+        <w:rFonts w:ascii="Wingdings" w:hAnsi="Wingdings" w:hint="default"/>
+        <w:sz w:val="20"/>
+      </w:rPr>
+    </w:lvl>
+    <w:lvl w:ilvl="4" w:tentative="1">
+      <w:start w:val="1"/>
+      <w:numFmt w:val="bullet"/>
+      <w:lvlText w:val=""/>
+      <w:lvlJc w:val="left"/>
+      <w:pPr>
+        <w:tabs>
+          <w:tab w:val="num" w:pos="3600"/>
+        </w:tabs>
+        <w:ind w:left="3600" w:hanging="360"/>
+      </w:pPr>
+      <w:rPr>
+        <w:rFonts w:ascii="Wingdings" w:hAnsi="Wingdings" w:hint="default"/>
+        <w:sz w:val="20"/>
+      </w:rPr>
+    </w:lvl>
+    <w:lvl w:ilvl="5" w:tentative="1">
+      <w:start w:val="1"/>
+      <w:numFmt w:val="bullet"/>
+      <w:lvlText w:val=""/>
+      <w:lvlJc w:val="left"/>
+      <w:pPr>
+        <w:tabs>
+          <w:tab w:val="num" w:pos="4320"/>
+        </w:tabs>
+        <w:ind w:left="4320" w:hanging="360"/>
+      </w:pPr>
+      <w:rPr>
+        <w:rFonts w:ascii="Wingdings" w:hAnsi="Wingdings" w:hint="default"/>
+        <w:sz w:val="20"/>
+      </w:rPr>
+    </w:lvl>
+    <w:lvl w:ilvl="6" w:tentative="1">
+      <w:start w:val="1"/>
+      <w:numFmt w:val="bullet"/>
+      <w:lvlText w:val=""/>
+      <w:lvlJc w:val="left"/>
+      <w:pPr>
+        <w:tabs>
+          <w:tab w:val="num" w:pos="5040"/>
+        </w:tabs>
+        <w:ind w:left="5040" w:hanging="360"/>
+      </w:pPr>
+      <w:rPr>
+        <w:rFonts w:ascii="Wingdings" w:hAnsi="Wingdings" w:hint="default"/>
+        <w:sz w:val="20"/>
+      </w:rPr>
+    </w:lvl>
+    <w:lvl w:ilvl="7" w:tentative="1">
+      <w:start w:val="1"/>
+      <w:numFmt w:val="bullet"/>
+      <w:lvlText w:val=""/>
+      <w:lvlJc w:val="left"/>
+      <w:pPr>
+        <w:tabs>
+          <w:tab w:val="num" w:pos="5760"/>
+        </w:tabs>
+        <w:ind w:left="5760" w:hanging="360"/>
+      </w:pPr>
+      <w:rPr>
+        <w:rFonts w:ascii="Wingdings" w:hAnsi="Wingdings" w:hint="default"/>
+        <w:sz w:val="20"/>
+      </w:rPr>
+    </w:lvl>
+    <w:lvl w:ilvl="8" w:tentative="1">
+      <w:start w:val="1"/>
+      <w:numFmt w:val="bullet"/>
+      <w:lvlText w:val=""/>
+      <w:lvlJc w:val="left"/>
+      <w:pPr>
+        <w:tabs>
+          <w:tab w:val="num" w:pos="6480"/>
+        </w:tabs>
+        <w:ind w:left="6480" w:hanging="360"/>
+      </w:pPr>
+      <w:rPr>
+        <w:rFonts w:ascii="Wingdings" w:hAnsi="Wingdings" w:hint="default"/>
+        <w:sz w:val="20"/>
+      </w:rPr>
+    </w:lvl>
+  </w:abstractNum>
+  <w:abstractNum w:abstractNumId="5" w15:restartNumberingAfterBreak="0">
+    <w:nsid w:val="258B7163"/>
+    <w:multiLevelType w:val="multilevel"/>
+    <w:tmpl w:val="71FA28AE"/>
+    <w:lvl w:ilvl="0">
+      <w:start w:val="1"/>
+      <w:numFmt w:val="bullet"/>
+      <w:lvlText w:val=""/>
+      <w:lvlJc w:val="left"/>
+      <w:pPr>
+        <w:tabs>
+          <w:tab w:val="num" w:pos="720"/>
+        </w:tabs>
+        <w:ind w:left="720" w:hanging="360"/>
+      </w:pPr>
+      <w:rPr>
+        <w:rFonts w:ascii="Symbol" w:hAnsi="Symbol" w:hint="default"/>
+        <w:sz w:val="20"/>
+      </w:rPr>
+    </w:lvl>
+    <w:lvl w:ilvl="1" w:tentative="1">
+      <w:start w:val="1"/>
+      <w:numFmt w:val="bullet"/>
+      <w:lvlText w:val="o"/>
+      <w:lvlJc w:val="left"/>
+      <w:pPr>
+        <w:tabs>
+          <w:tab w:val="num" w:pos="1440"/>
+        </w:tabs>
+        <w:ind w:left="1440" w:hanging="360"/>
+      </w:pPr>
+      <w:rPr>
+        <w:rFonts w:ascii="Courier New" w:hAnsi="Courier New" w:hint="default"/>
+        <w:sz w:val="20"/>
+      </w:rPr>
+    </w:lvl>
+    <w:lvl w:ilvl="2" w:tentative="1">
+      <w:start w:val="1"/>
+      <w:numFmt w:val="bullet"/>
+      <w:lvlText w:val=""/>
+      <w:lvlJc w:val="left"/>
+      <w:pPr>
+        <w:tabs>
+          <w:tab w:val="num" w:pos="2160"/>
+        </w:tabs>
+        <w:ind w:left="2160" w:hanging="360"/>
+      </w:pPr>
+      <w:rPr>
+        <w:rFonts w:ascii="Wingdings" w:hAnsi="Wingdings" w:hint="default"/>
+        <w:sz w:val="20"/>
+      </w:rPr>
+    </w:lvl>
+    <w:lvl w:ilvl="3" w:tentative="1">
+      <w:start w:val="1"/>
+      <w:numFmt w:val="bullet"/>
+      <w:lvlText w:val=""/>
+      <w:lvlJc w:val="left"/>
+      <w:pPr>
+        <w:tabs>
+          <w:tab w:val="num" w:pos="2880"/>
+        </w:tabs>
+        <w:ind w:left="2880" w:hanging="360"/>
+      </w:pPr>
+      <w:rPr>
+        <w:rFonts w:ascii="Wingdings" w:hAnsi="Wingdings" w:hint="default"/>
+        <w:sz w:val="20"/>
+      </w:rPr>
+    </w:lvl>
+    <w:lvl w:ilvl="4" w:tentative="1">
+      <w:start w:val="1"/>
+      <w:numFmt w:val="bullet"/>
+      <w:lvlText w:val=""/>
+      <w:lvlJc w:val="left"/>
+      <w:pPr>
+        <w:tabs>
+          <w:tab w:val="num" w:pos="3600"/>
+        </w:tabs>
+        <w:ind w:left="3600" w:hanging="360"/>
+      </w:pPr>
+      <w:rPr>
+        <w:rFonts w:ascii="Wingdings" w:hAnsi="Wingdings" w:hint="default"/>
+        <w:sz w:val="20"/>
+      </w:rPr>
+    </w:lvl>
+    <w:lvl w:ilvl="5" w:tentative="1">
+      <w:start w:val="1"/>
+      <w:numFmt w:val="bullet"/>
+      <w:lvlText w:val=""/>
+      <w:lvlJc w:val="left"/>
+      <w:pPr>
+        <w:tabs>
+          <w:tab w:val="num" w:pos="4320"/>
+        </w:tabs>
+        <w:ind w:left="4320" w:hanging="360"/>
+      </w:pPr>
+      <w:rPr>
+        <w:rFonts w:ascii="Wingdings" w:hAnsi="Wingdings" w:hint="default"/>
+        <w:sz w:val="20"/>
+      </w:rPr>
+    </w:lvl>
+    <w:lvl w:ilvl="6" w:tentative="1">
+      <w:start w:val="1"/>
+      <w:numFmt w:val="bullet"/>
+      <w:lvlText w:val=""/>
+      <w:lvlJc w:val="left"/>
+      <w:pPr>
+        <w:tabs>
+          <w:tab w:val="num" w:pos="5040"/>
+        </w:tabs>
+        <w:ind w:left="5040" w:hanging="360"/>
+      </w:pPr>
+      <w:rPr>
+        <w:rFonts w:ascii="Wingdings" w:hAnsi="Wingdings" w:hint="default"/>
+        <w:sz w:val="20"/>
+      </w:rPr>
+    </w:lvl>
+    <w:lvl w:ilvl="7" w:tentative="1">
+      <w:start w:val="1"/>
+      <w:numFmt w:val="bullet"/>
+      <w:lvlText w:val=""/>
+      <w:lvlJc w:val="left"/>
+      <w:pPr>
+        <w:tabs>
+          <w:tab w:val="num" w:pos="5760"/>
+        </w:tabs>
+        <w:ind w:left="5760" w:hanging="360"/>
+      </w:pPr>
+      <w:rPr>
+        <w:rFonts w:ascii="Wingdings" w:hAnsi="Wingdings" w:hint="default"/>
+        <w:sz w:val="20"/>
+      </w:rPr>
+    </w:lvl>
+    <w:lvl w:ilvl="8" w:tentative="1">
+      <w:start w:val="1"/>
+      <w:numFmt w:val="bullet"/>
+      <w:lvlText w:val=""/>
+      <w:lvlJc w:val="left"/>
+      <w:pPr>
+        <w:tabs>
+          <w:tab w:val="num" w:pos="6480"/>
+        </w:tabs>
+        <w:ind w:left="6480" w:hanging="360"/>
+      </w:pPr>
+      <w:rPr>
+        <w:rFonts w:ascii="Wingdings" w:hAnsi="Wingdings" w:hint="default"/>
+        <w:sz w:val="20"/>
+      </w:rPr>
+    </w:lvl>
+  </w:abstractNum>
+  <w:abstractNum w:abstractNumId="6" w15:restartNumberingAfterBreak="0">
     <w:nsid w:val="26106C50"/>
     <w:multiLevelType w:val="multilevel"/>
     <w:tmpl w:val="D9869F06"/>
@@ -1338,7 +3301,156 @@
       </w:pPr>
     </w:lvl>
   </w:abstractNum>
-  <w:abstractNum w:abstractNumId="4" w15:restartNumberingAfterBreak="0">
+  <w:abstractNum w:abstractNumId="7" w15:restartNumberingAfterBreak="0">
+    <w:nsid w:val="26B76ADD"/>
+    <w:multiLevelType w:val="multilevel"/>
+    <w:tmpl w:val="C74EB8B8"/>
+    <w:lvl w:ilvl="0">
+      <w:start w:val="1"/>
+      <w:numFmt w:val="bullet"/>
+      <w:lvlText w:val=""/>
+      <w:lvlJc w:val="left"/>
+      <w:pPr>
+        <w:tabs>
+          <w:tab w:val="num" w:pos="720"/>
+        </w:tabs>
+        <w:ind w:left="720" w:hanging="360"/>
+      </w:pPr>
+      <w:rPr>
+        <w:rFonts w:ascii="Symbol" w:hAnsi="Symbol" w:hint="default"/>
+        <w:sz w:val="20"/>
+      </w:rPr>
+    </w:lvl>
+    <w:lvl w:ilvl="1" w:tentative="1">
+      <w:start w:val="1"/>
+      <w:numFmt w:val="bullet"/>
+      <w:lvlText w:val="o"/>
+      <w:lvlJc w:val="left"/>
+      <w:pPr>
+        <w:tabs>
+          <w:tab w:val="num" w:pos="1440"/>
+        </w:tabs>
+        <w:ind w:left="1440" w:hanging="360"/>
+      </w:pPr>
+      <w:rPr>
+        <w:rFonts w:ascii="Courier New" w:hAnsi="Courier New" w:hint="default"/>
+        <w:sz w:val="20"/>
+      </w:rPr>
+    </w:lvl>
+    <w:lvl w:ilvl="2" w:tentative="1">
+      <w:start w:val="1"/>
+      <w:numFmt w:val="bullet"/>
+      <w:lvlText w:val=""/>
+      <w:lvlJc w:val="left"/>
+      <w:pPr>
+        <w:tabs>
+          <w:tab w:val="num" w:pos="2160"/>
+        </w:tabs>
+        <w:ind w:left="2160" w:hanging="360"/>
+      </w:pPr>
+      <w:rPr>
+        <w:rFonts w:ascii="Wingdings" w:hAnsi="Wingdings" w:hint="default"/>
+        <w:sz w:val="20"/>
+      </w:rPr>
+    </w:lvl>
+    <w:lvl w:ilvl="3" w:tentative="1">
+      <w:start w:val="1"/>
+      <w:numFmt w:val="bullet"/>
+      <w:lvlText w:val=""/>
+      <w:lvlJc w:val="left"/>
+      <w:pPr>
+        <w:tabs>
+          <w:tab w:val="num" w:pos="2880"/>
+        </w:tabs>
+        <w:ind w:left="2880" w:hanging="360"/>
+      </w:pPr>
+      <w:rPr>
+        <w:rFonts w:ascii="Wingdings" w:hAnsi="Wingdings" w:hint="default"/>
+        <w:sz w:val="20"/>
+      </w:rPr>
+    </w:lvl>
+    <w:lvl w:ilvl="4" w:tentative="1">
+      <w:start w:val="1"/>
+      <w:numFmt w:val="bullet"/>
+      <w:lvlText w:val=""/>
+      <w:lvlJc w:val="left"/>
+      <w:pPr>
+        <w:tabs>
+          <w:tab w:val="num" w:pos="3600"/>
+        </w:tabs>
+        <w:ind w:left="3600" w:hanging="360"/>
+      </w:pPr>
+      <w:rPr>
+        <w:rFonts w:ascii="Wingdings" w:hAnsi="Wingdings" w:hint="default"/>
+        <w:sz w:val="20"/>
+      </w:rPr>
+    </w:lvl>
+    <w:lvl w:ilvl="5" w:tentative="1">
+      <w:start w:val="1"/>
+      <w:numFmt w:val="bullet"/>
+      <w:lvlText w:val=""/>
+      <w:lvlJc w:val="left"/>
+      <w:pPr>
+        <w:tabs>
+          <w:tab w:val="num" w:pos="4320"/>
+        </w:tabs>
+        <w:ind w:left="4320" w:hanging="360"/>
+      </w:pPr>
+      <w:rPr>
+        <w:rFonts w:ascii="Wingdings" w:hAnsi="Wingdings" w:hint="default"/>
+        <w:sz w:val="20"/>
+      </w:rPr>
+    </w:lvl>
+    <w:lvl w:ilvl="6" w:tentative="1">
+      <w:start w:val="1"/>
+      <w:numFmt w:val="bullet"/>
+      <w:lvlText w:val=""/>
+      <w:lvlJc w:val="left"/>
+      <w:pPr>
+        <w:tabs>
+          <w:tab w:val="num" w:pos="5040"/>
+        </w:tabs>
+        <w:ind w:left="5040" w:hanging="360"/>
+      </w:pPr>
+      <w:rPr>
+        <w:rFonts w:ascii="Wingdings" w:hAnsi="Wingdings" w:hint="default"/>
+        <w:sz w:val="20"/>
+      </w:rPr>
+    </w:lvl>
+    <w:lvl w:ilvl="7" w:tentative="1">
+      <w:start w:val="1"/>
+      <w:numFmt w:val="bullet"/>
+      <w:lvlText w:val=""/>
+      <w:lvlJc w:val="left"/>
+      <w:pPr>
+        <w:tabs>
+          <w:tab w:val="num" w:pos="5760"/>
+        </w:tabs>
+        <w:ind w:left="5760" w:hanging="360"/>
+      </w:pPr>
+      <w:rPr>
+        <w:rFonts w:ascii="Wingdings" w:hAnsi="Wingdings" w:hint="default"/>
+        <w:sz w:val="20"/>
+      </w:rPr>
+    </w:lvl>
+    <w:lvl w:ilvl="8" w:tentative="1">
+      <w:start w:val="1"/>
+      <w:numFmt w:val="bullet"/>
+      <w:lvlText w:val=""/>
+      <w:lvlJc w:val="left"/>
+      <w:pPr>
+        <w:tabs>
+          <w:tab w:val="num" w:pos="6480"/>
+        </w:tabs>
+        <w:ind w:left="6480" w:hanging="360"/>
+      </w:pPr>
+      <w:rPr>
+        <w:rFonts w:ascii="Wingdings" w:hAnsi="Wingdings" w:hint="default"/>
+        <w:sz w:val="20"/>
+      </w:rPr>
+    </w:lvl>
+  </w:abstractNum>
+  <w:abstractNum w:abstractNumId="8" w15:restartNumberingAfterBreak="0">
     <w:nsid w:val="2F643968"/>
     <w:multiLevelType w:val="multilevel"/>
     <w:tmpl w:val="398CF822"/>
@@ -1487,7 +3599,305 @@
       </w:rPr>
     </w:lvl>
   </w:abstractNum>
-  <w:abstractNum w:abstractNumId="5" w15:restartNumberingAfterBreak="0">
+  <w:abstractNum w:abstractNumId="9" w15:restartNumberingAfterBreak="0">
+    <w:nsid w:val="318C7CEC"/>
+    <w:multiLevelType w:val="multilevel"/>
+    <w:tmpl w:val="840056AA"/>
+    <w:lvl w:ilvl="0">
+      <w:start w:val="1"/>
+      <w:numFmt w:val="bullet"/>
+      <w:lvlText w:val=""/>
+      <w:lvlJc w:val="left"/>
+      <w:pPr>
+        <w:tabs>
+          <w:tab w:val="num" w:pos="720"/>
+        </w:tabs>
+        <w:ind w:left="720" w:hanging="360"/>
+      </w:pPr>
+      <w:rPr>
+        <w:rFonts w:ascii="Symbol" w:hAnsi="Symbol" w:hint="default"/>
+        <w:sz w:val="20"/>
+      </w:rPr>
+    </w:lvl>
+    <w:lvl w:ilvl="1" w:tentative="1">
+      <w:start w:val="1"/>
+      <w:numFmt w:val="bullet"/>
+      <w:lvlText w:val="o"/>
+      <w:lvlJc w:val="left"/>
+      <w:pPr>
+        <w:tabs>
+          <w:tab w:val="num" w:pos="1440"/>
+        </w:tabs>
+        <w:ind w:left="1440" w:hanging="360"/>
+      </w:pPr>
+      <w:rPr>
+        <w:rFonts w:ascii="Courier New" w:hAnsi="Courier New" w:hint="default"/>
+        <w:sz w:val="20"/>
+      </w:rPr>
+    </w:lvl>
+    <w:lvl w:ilvl="2" w:tentative="1">
+      <w:start w:val="1"/>
+      <w:numFmt w:val="bullet"/>
+      <w:lvlText w:val=""/>
+      <w:lvlJc w:val="left"/>
+      <w:pPr>
+        <w:tabs>
+          <w:tab w:val="num" w:pos="2160"/>
+        </w:tabs>
+        <w:ind w:left="2160" w:hanging="360"/>
+      </w:pPr>
+      <w:rPr>
+        <w:rFonts w:ascii="Wingdings" w:hAnsi="Wingdings" w:hint="default"/>
+        <w:sz w:val="20"/>
+      </w:rPr>
+    </w:lvl>
+    <w:lvl w:ilvl="3" w:tentative="1">
+      <w:start w:val="1"/>
+      <w:numFmt w:val="bullet"/>
+      <w:lvlText w:val=""/>
+      <w:lvlJc w:val="left"/>
+      <w:pPr>
+        <w:tabs>
+          <w:tab w:val="num" w:pos="2880"/>
+        </w:tabs>
+        <w:ind w:left="2880" w:hanging="360"/>
+      </w:pPr>
+      <w:rPr>
+        <w:rFonts w:ascii="Wingdings" w:hAnsi="Wingdings" w:hint="default"/>
+        <w:sz w:val="20"/>
+      </w:rPr>
+    </w:lvl>
+    <w:lvl w:ilvl="4" w:tentative="1">
+      <w:start w:val="1"/>
+      <w:numFmt w:val="bullet"/>
+      <w:lvlText w:val=""/>
+      <w:lvlJc w:val="left"/>
+      <w:pPr>
+        <w:tabs>
+          <w:tab w:val="num" w:pos="3600"/>
+        </w:tabs>
+        <w:ind w:left="3600" w:hanging="360"/>
+      </w:pPr>
+      <w:rPr>
+        <w:rFonts w:ascii="Wingdings" w:hAnsi="Wingdings" w:hint="default"/>
+        <w:sz w:val="20"/>
+      </w:rPr>
+    </w:lvl>
+    <w:lvl w:ilvl="5" w:tentative="1">
+      <w:start w:val="1"/>
+      <w:numFmt w:val="bullet"/>
+      <w:lvlText w:val=""/>
+      <w:lvlJc w:val="left"/>
+      <w:pPr>
+        <w:tabs>
+          <w:tab w:val="num" w:pos="4320"/>
+        </w:tabs>
+        <w:ind w:left="4320" w:hanging="360"/>
+      </w:pPr>
+      <w:rPr>
+        <w:rFonts w:ascii="Wingdings" w:hAnsi="Wingdings" w:hint="default"/>
+        <w:sz w:val="20"/>
+      </w:rPr>
+    </w:lvl>
+    <w:lvl w:ilvl="6" w:tentative="1">
+      <w:start w:val="1"/>
+      <w:numFmt w:val="bullet"/>
+      <w:lvlText w:val=""/>
+      <w:lvlJc w:val="left"/>
+      <w:pPr>
+        <w:tabs>
+          <w:tab w:val="num" w:pos="5040"/>
+        </w:tabs>
+        <w:ind w:left="5040" w:hanging="360"/>
+      </w:pPr>
+      <w:rPr>
+        <w:rFonts w:ascii="Wingdings" w:hAnsi="Wingdings" w:hint="default"/>
+        <w:sz w:val="20"/>
+      </w:rPr>
+    </w:lvl>
+    <w:lvl w:ilvl="7" w:tentative="1">
+      <w:start w:val="1"/>
+      <w:numFmt w:val="bullet"/>
+      <w:lvlText w:val=""/>
+      <w:lvlJc w:val="left"/>
+      <w:pPr>
+        <w:tabs>
+          <w:tab w:val="num" w:pos="5760"/>
+        </w:tabs>
+        <w:ind w:left="5760" w:hanging="360"/>
+      </w:pPr>
+      <w:rPr>
+        <w:rFonts w:ascii="Wingdings" w:hAnsi="Wingdings" w:hint="default"/>
+        <w:sz w:val="20"/>
+      </w:rPr>
+    </w:lvl>
+    <w:lvl w:ilvl="8" w:tentative="1">
+      <w:start w:val="1"/>
+      <w:numFmt w:val="bullet"/>
+      <w:lvlText w:val=""/>
+      <w:lvlJc w:val="left"/>
+      <w:pPr>
+        <w:tabs>
+          <w:tab w:val="num" w:pos="6480"/>
+        </w:tabs>
+        <w:ind w:left="6480" w:hanging="360"/>
+      </w:pPr>
+      <w:rPr>
+        <w:rFonts w:ascii="Wingdings" w:hAnsi="Wingdings" w:hint="default"/>
+        <w:sz w:val="20"/>
+      </w:rPr>
+    </w:lvl>
+  </w:abstractNum>
+  <w:abstractNum w:abstractNumId="10" w15:restartNumberingAfterBreak="0">
+    <w:nsid w:val="35513289"/>
+    <w:multiLevelType w:val="multilevel"/>
+    <w:tmpl w:val="E2662854"/>
+    <w:lvl w:ilvl="0">
+      <w:start w:val="1"/>
+      <w:numFmt w:val="bullet"/>
+      <w:lvlText w:val=""/>
+      <w:lvlJc w:val="left"/>
+      <w:pPr>
+        <w:tabs>
+          <w:tab w:val="num" w:pos="720"/>
+        </w:tabs>
+        <w:ind w:left="720" w:hanging="360"/>
+      </w:pPr>
+      <w:rPr>
+        <w:rFonts w:ascii="Symbol" w:hAnsi="Symbol" w:hint="default"/>
+        <w:sz w:val="20"/>
+      </w:rPr>
+    </w:lvl>
+    <w:lvl w:ilvl="1" w:tentative="1">
+      <w:start w:val="1"/>
+      <w:numFmt w:val="bullet"/>
+      <w:lvlText w:val="o"/>
+      <w:lvlJc w:val="left"/>
+      <w:pPr>
+        <w:tabs>
+          <w:tab w:val="num" w:pos="1440"/>
+        </w:tabs>
+        <w:ind w:left="1440" w:hanging="360"/>
+      </w:pPr>
+      <w:rPr>
+        <w:rFonts w:ascii="Courier New" w:hAnsi="Courier New" w:hint="default"/>
+        <w:sz w:val="20"/>
+      </w:rPr>
+    </w:lvl>
+    <w:lvl w:ilvl="2" w:tentative="1">
+      <w:start w:val="1"/>
+      <w:numFmt w:val="bullet"/>
+      <w:lvlText w:val=""/>
+      <w:lvlJc w:val="left"/>
+      <w:pPr>
+        <w:tabs>
+          <w:tab w:val="num" w:pos="2160"/>
+        </w:tabs>
+        <w:ind w:left="2160" w:hanging="360"/>
+      </w:pPr>
+      <w:rPr>
+        <w:rFonts w:ascii="Wingdings" w:hAnsi="Wingdings" w:hint="default"/>
+        <w:sz w:val="20"/>
+      </w:rPr>
+    </w:lvl>
+    <w:lvl w:ilvl="3" w:tentative="1">
+      <w:start w:val="1"/>
+      <w:numFmt w:val="bullet"/>
+      <w:lvlText w:val=""/>
+      <w:lvlJc w:val="left"/>
+      <w:pPr>
+        <w:tabs>
+          <w:tab w:val="num" w:pos="2880"/>
+        </w:tabs>
+        <w:ind w:left="2880" w:hanging="360"/>
+      </w:pPr>
+      <w:rPr>
+        <w:rFonts w:ascii="Wingdings" w:hAnsi="Wingdings" w:hint="default"/>
+        <w:sz w:val="20"/>
+      </w:rPr>
+    </w:lvl>
+    <w:lvl w:ilvl="4" w:tentative="1">
+      <w:start w:val="1"/>
+      <w:numFmt w:val="bullet"/>
+      <w:lvlText w:val=""/>
+      <w:lvlJc w:val="left"/>
+      <w:pPr>
+        <w:tabs>
+          <w:tab w:val="num" w:pos="3600"/>
+        </w:tabs>
+        <w:ind w:left="3600" w:hanging="360"/>
+      </w:pPr>
+      <w:rPr>
+        <w:rFonts w:ascii="Wingdings" w:hAnsi="Wingdings" w:hint="default"/>
+        <w:sz w:val="20"/>
+      </w:rPr>
+    </w:lvl>
+    <w:lvl w:ilvl="5" w:tentative="1">
+      <w:start w:val="1"/>
+      <w:numFmt w:val="bullet"/>
+      <w:lvlText w:val=""/>
+      <w:lvlJc w:val="left"/>
+      <w:pPr>
+        <w:tabs>
+          <w:tab w:val="num" w:pos="4320"/>
+        </w:tabs>
+        <w:ind w:left="4320" w:hanging="360"/>
+      </w:pPr>
+      <w:rPr>
+        <w:rFonts w:ascii="Wingdings" w:hAnsi="Wingdings" w:hint="default"/>
+        <w:sz w:val="20"/>
+      </w:rPr>
+    </w:lvl>
+    <w:lvl w:ilvl="6" w:tentative="1">
+      <w:start w:val="1"/>
+      <w:numFmt w:val="bullet"/>
+      <w:lvlText w:val=""/>
+      <w:lvlJc w:val="left"/>
+      <w:pPr>
+        <w:tabs>
+          <w:tab w:val="num" w:pos="5040"/>
+        </w:tabs>
+        <w:ind w:left="5040" w:hanging="360"/>
+      </w:pPr>
+      <w:rPr>
+        <w:rFonts w:ascii="Wingdings" w:hAnsi="Wingdings" w:hint="default"/>
+        <w:sz w:val="20"/>
+      </w:rPr>
+    </w:lvl>
+    <w:lvl w:ilvl="7" w:tentative="1">
+      <w:start w:val="1"/>
+      <w:numFmt w:val="bullet"/>
+      <w:lvlText w:val=""/>
+      <w:lvlJc w:val="left"/>
+      <w:pPr>
+        <w:tabs>
+          <w:tab w:val="num" w:pos="5760"/>
+        </w:tabs>
+        <w:ind w:left="5760" w:hanging="360"/>
+      </w:pPr>
+      <w:rPr>
+        <w:rFonts w:ascii="Wingdings" w:hAnsi="Wingdings" w:hint="default"/>
+        <w:sz w:val="20"/>
+      </w:rPr>
+    </w:lvl>
+    <w:lvl w:ilvl="8" w:tentative="1">
+      <w:start w:val="1"/>
+      <w:numFmt w:val="bullet"/>
+      <w:lvlText w:val=""/>
+      <w:lvlJc w:val="left"/>
+      <w:pPr>
+        <w:tabs>
+          <w:tab w:val="num" w:pos="6480"/>
+        </w:tabs>
+        <w:ind w:left="6480" w:hanging="360"/>
+      </w:pPr>
+      <w:rPr>
+        <w:rFonts w:ascii="Wingdings" w:hAnsi="Wingdings" w:hint="default"/>
+        <w:sz w:val="20"/>
+      </w:rPr>
+    </w:lvl>
+  </w:abstractNum>
+  <w:abstractNum w:abstractNumId="11" w15:restartNumberingAfterBreak="0">
     <w:nsid w:val="37562966"/>
     <w:multiLevelType w:val="multilevel"/>
     <w:tmpl w:val="D2EE95EE"/>
@@ -1636,7 +4046,7 @@
       </w:rPr>
     </w:lvl>
   </w:abstractNum>
-  <w:abstractNum w:abstractNumId="6" w15:restartNumberingAfterBreak="0">
+  <w:abstractNum w:abstractNumId="12" w15:restartNumberingAfterBreak="0">
     <w:nsid w:val="37C65F6E"/>
     <w:multiLevelType w:val="multilevel"/>
     <w:tmpl w:val="9E188722"/>
@@ -1785,7 +4195,7 @@
       </w:rPr>
     </w:lvl>
   </w:abstractNum>
-  <w:abstractNum w:abstractNumId="7" w15:restartNumberingAfterBreak="0">
+  <w:abstractNum w:abstractNumId="13" w15:restartNumberingAfterBreak="0">
     <w:nsid w:val="384C78CB"/>
     <w:multiLevelType w:val="multilevel"/>
     <w:tmpl w:val="9BE65B8E"/>
@@ -1876,7 +4286,7 @@
       </w:pPr>
     </w:lvl>
   </w:abstractNum>
-  <w:abstractNum w:abstractNumId="8" w15:restartNumberingAfterBreak="0">
+  <w:abstractNum w:abstractNumId="14" w15:restartNumberingAfterBreak="0">
     <w:nsid w:val="3858393F"/>
     <w:multiLevelType w:val="multilevel"/>
     <w:tmpl w:val="E7DC6810"/>
@@ -2025,7 +4435,156 @@
       </w:rPr>
     </w:lvl>
   </w:abstractNum>
-  <w:abstractNum w:abstractNumId="9" w15:restartNumberingAfterBreak="0">
+  <w:abstractNum w:abstractNumId="15" w15:restartNumberingAfterBreak="0">
+    <w:nsid w:val="3C4F64A0"/>
+    <w:multiLevelType w:val="multilevel"/>
+    <w:tmpl w:val="4126BF96"/>
+    <w:lvl w:ilvl="0">
+      <w:start w:val="1"/>
+      <w:numFmt w:val="bullet"/>
+      <w:lvlText w:val=""/>
+      <w:lvlJc w:val="left"/>
+      <w:pPr>
+        <w:tabs>
+          <w:tab w:val="num" w:pos="720"/>
+        </w:tabs>
+        <w:ind w:left="720" w:hanging="360"/>
+      </w:pPr>
+      <w:rPr>
+        <w:rFonts w:ascii="Symbol" w:hAnsi="Symbol" w:hint="default"/>
+        <w:sz w:val="20"/>
+      </w:rPr>
+    </w:lvl>
+    <w:lvl w:ilvl="1" w:tentative="1">
+      <w:start w:val="1"/>
+      <w:numFmt w:val="bullet"/>
+      <w:lvlText w:val="o"/>
+      <w:lvlJc w:val="left"/>
+      <w:pPr>
+        <w:tabs>
+          <w:tab w:val="num" w:pos="1440"/>
+        </w:tabs>
+        <w:ind w:left="1440" w:hanging="360"/>
+      </w:pPr>
+      <w:rPr>
+        <w:rFonts w:ascii="Courier New" w:hAnsi="Courier New" w:hint="default"/>
+        <w:sz w:val="20"/>
+      </w:rPr>
+    </w:lvl>
+    <w:lvl w:ilvl="2" w:tentative="1">
+      <w:start w:val="1"/>
+      <w:numFmt w:val="bullet"/>
+      <w:lvlText w:val=""/>
+      <w:lvlJc w:val="left"/>
+      <w:pPr>
+        <w:tabs>
+          <w:tab w:val="num" w:pos="2160"/>
+        </w:tabs>
+        <w:ind w:left="2160" w:hanging="360"/>
+      </w:pPr>
+      <w:rPr>
+        <w:rFonts w:ascii="Wingdings" w:hAnsi="Wingdings" w:hint="default"/>
+        <w:sz w:val="20"/>
+      </w:rPr>
+    </w:lvl>
+    <w:lvl w:ilvl="3" w:tentative="1">
+      <w:start w:val="1"/>
+      <w:numFmt w:val="bullet"/>
+      <w:lvlText w:val=""/>
+      <w:lvlJc w:val="left"/>
+      <w:pPr>
+        <w:tabs>
+          <w:tab w:val="num" w:pos="2880"/>
+        </w:tabs>
+        <w:ind w:left="2880" w:hanging="360"/>
+      </w:pPr>
+      <w:rPr>
+        <w:rFonts w:ascii="Wingdings" w:hAnsi="Wingdings" w:hint="default"/>
+        <w:sz w:val="20"/>
+      </w:rPr>
+    </w:lvl>
+    <w:lvl w:ilvl="4" w:tentative="1">
+      <w:start w:val="1"/>
+      <w:numFmt w:val="bullet"/>
+      <w:lvlText w:val=""/>
+      <w:lvlJc w:val="left"/>
+      <w:pPr>
+        <w:tabs>
+          <w:tab w:val="num" w:pos="3600"/>
+        </w:tabs>
+        <w:ind w:left="3600" w:hanging="360"/>
+      </w:pPr>
+      <w:rPr>
+        <w:rFonts w:ascii="Wingdings" w:hAnsi="Wingdings" w:hint="default"/>
+        <w:sz w:val="20"/>
+      </w:rPr>
+    </w:lvl>
+    <w:lvl w:ilvl="5" w:tentative="1">
+      <w:start w:val="1"/>
+      <w:numFmt w:val="bullet"/>
+      <w:lvlText w:val=""/>
+      <w:lvlJc w:val="left"/>
+      <w:pPr>
+        <w:tabs>
+          <w:tab w:val="num" w:pos="4320"/>
+        </w:tabs>
+        <w:ind w:left="4320" w:hanging="360"/>
+      </w:pPr>
+      <w:rPr>
+        <w:rFonts w:ascii="Wingdings" w:hAnsi="Wingdings" w:hint="default"/>
+        <w:sz w:val="20"/>
+      </w:rPr>
+    </w:lvl>
+    <w:lvl w:ilvl="6" w:tentative="1">
+      <w:start w:val="1"/>
+      <w:numFmt w:val="bullet"/>
+      <w:lvlText w:val=""/>
+      <w:lvlJc w:val="left"/>
+      <w:pPr>
+        <w:tabs>
+          <w:tab w:val="num" w:pos="5040"/>
+        </w:tabs>
+        <w:ind w:left="5040" w:hanging="360"/>
+      </w:pPr>
+      <w:rPr>
+        <w:rFonts w:ascii="Wingdings" w:hAnsi="Wingdings" w:hint="default"/>
+        <w:sz w:val="20"/>
+      </w:rPr>
+    </w:lvl>
+    <w:lvl w:ilvl="7" w:tentative="1">
+      <w:start w:val="1"/>
+      <w:numFmt w:val="bullet"/>
+      <w:lvlText w:val=""/>
+      <w:lvlJc w:val="left"/>
+      <w:pPr>
+        <w:tabs>
+          <w:tab w:val="num" w:pos="5760"/>
+        </w:tabs>
+        <w:ind w:left="5760" w:hanging="360"/>
+      </w:pPr>
+      <w:rPr>
+        <w:rFonts w:ascii="Wingdings" w:hAnsi="Wingdings" w:hint="default"/>
+        <w:sz w:val="20"/>
+      </w:rPr>
+    </w:lvl>
+    <w:lvl w:ilvl="8" w:tentative="1">
+      <w:start w:val="1"/>
+      <w:numFmt w:val="bullet"/>
+      <w:lvlText w:val=""/>
+      <w:lvlJc w:val="left"/>
+      <w:pPr>
+        <w:tabs>
+          <w:tab w:val="num" w:pos="6480"/>
+        </w:tabs>
+        <w:ind w:left="6480" w:hanging="360"/>
+      </w:pPr>
+      <w:rPr>
+        <w:rFonts w:ascii="Wingdings" w:hAnsi="Wingdings" w:hint="default"/>
+        <w:sz w:val="20"/>
+      </w:rPr>
+    </w:lvl>
+  </w:abstractNum>
+  <w:abstractNum w:abstractNumId="16" w15:restartNumberingAfterBreak="0">
     <w:nsid w:val="41BA488D"/>
     <w:multiLevelType w:val="multilevel"/>
     <w:tmpl w:val="4260AB64"/>
@@ -2111,7 +4670,7 @@
       </w:pPr>
     </w:lvl>
   </w:abstractNum>
-  <w:abstractNum w:abstractNumId="10" w15:restartNumberingAfterBreak="0">
+  <w:abstractNum w:abstractNumId="17" w15:restartNumberingAfterBreak="0">
     <w:nsid w:val="41E82BAE"/>
     <w:multiLevelType w:val="multilevel"/>
     <w:tmpl w:val="BB2AC3EC"/>
@@ -2260,7 +4819,305 @@
       </w:rPr>
     </w:lvl>
   </w:abstractNum>
-  <w:abstractNum w:abstractNumId="11" w15:restartNumberingAfterBreak="0">
+  <w:abstractNum w:abstractNumId="18" w15:restartNumberingAfterBreak="0">
+    <w:nsid w:val="422308DF"/>
+    <w:multiLevelType w:val="multilevel"/>
+    <w:tmpl w:val="0DB41F70"/>
+    <w:lvl w:ilvl="0">
+      <w:start w:val="1"/>
+      <w:numFmt w:val="bullet"/>
+      <w:lvlText w:val=""/>
+      <w:lvlJc w:val="left"/>
+      <w:pPr>
+        <w:tabs>
+          <w:tab w:val="num" w:pos="720"/>
+        </w:tabs>
+        <w:ind w:left="720" w:hanging="360"/>
+      </w:pPr>
+      <w:rPr>
+        <w:rFonts w:ascii="Symbol" w:hAnsi="Symbol" w:hint="default"/>
+        <w:sz w:val="20"/>
+      </w:rPr>
+    </w:lvl>
+    <w:lvl w:ilvl="1" w:tentative="1">
+      <w:start w:val="1"/>
+      <w:numFmt w:val="bullet"/>
+      <w:lvlText w:val="o"/>
+      <w:lvlJc w:val="left"/>
+      <w:pPr>
+        <w:tabs>
+          <w:tab w:val="num" w:pos="1440"/>
+        </w:tabs>
+        <w:ind w:left="1440" w:hanging="360"/>
+      </w:pPr>
+      <w:rPr>
+        <w:rFonts w:ascii="Courier New" w:hAnsi="Courier New" w:hint="default"/>
+        <w:sz w:val="20"/>
+      </w:rPr>
+    </w:lvl>
+    <w:lvl w:ilvl="2" w:tentative="1">
+      <w:start w:val="1"/>
+      <w:numFmt w:val="bullet"/>
+      <w:lvlText w:val=""/>
+      <w:lvlJc w:val="left"/>
+      <w:pPr>
+        <w:tabs>
+          <w:tab w:val="num" w:pos="2160"/>
+        </w:tabs>
+        <w:ind w:left="2160" w:hanging="360"/>
+      </w:pPr>
+      <w:rPr>
+        <w:rFonts w:ascii="Wingdings" w:hAnsi="Wingdings" w:hint="default"/>
+        <w:sz w:val="20"/>
+      </w:rPr>
+    </w:lvl>
+    <w:lvl w:ilvl="3" w:tentative="1">
+      <w:start w:val="1"/>
+      <w:numFmt w:val="bullet"/>
+      <w:lvlText w:val=""/>
+      <w:lvlJc w:val="left"/>
+      <w:pPr>
+        <w:tabs>
+          <w:tab w:val="num" w:pos="2880"/>
+        </w:tabs>
+        <w:ind w:left="2880" w:hanging="360"/>
+      </w:pPr>
+      <w:rPr>
+        <w:rFonts w:ascii="Wingdings" w:hAnsi="Wingdings" w:hint="default"/>
+        <w:sz w:val="20"/>
+      </w:rPr>
+    </w:lvl>
+    <w:lvl w:ilvl="4" w:tentative="1">
+      <w:start w:val="1"/>
+      <w:numFmt w:val="bullet"/>
+      <w:lvlText w:val=""/>
+      <w:lvlJc w:val="left"/>
+      <w:pPr>
+        <w:tabs>
+          <w:tab w:val="num" w:pos="3600"/>
+        </w:tabs>
+        <w:ind w:left="3600" w:hanging="360"/>
+      </w:pPr>
+      <w:rPr>
+        <w:rFonts w:ascii="Wingdings" w:hAnsi="Wingdings" w:hint="default"/>
+        <w:sz w:val="20"/>
+      </w:rPr>
+    </w:lvl>
+    <w:lvl w:ilvl="5" w:tentative="1">
+      <w:start w:val="1"/>
+      <w:numFmt w:val="bullet"/>
+      <w:lvlText w:val=""/>
+      <w:lvlJc w:val="left"/>
+      <w:pPr>
+        <w:tabs>
+          <w:tab w:val="num" w:pos="4320"/>
+        </w:tabs>
+        <w:ind w:left="4320" w:hanging="360"/>
+      </w:pPr>
+      <w:rPr>
+        <w:rFonts w:ascii="Wingdings" w:hAnsi="Wingdings" w:hint="default"/>
+        <w:sz w:val="20"/>
+      </w:rPr>
+    </w:lvl>
+    <w:lvl w:ilvl="6" w:tentative="1">
+      <w:start w:val="1"/>
+      <w:numFmt w:val="bullet"/>
+      <w:lvlText w:val=""/>
+      <w:lvlJc w:val="left"/>
+      <w:pPr>
+        <w:tabs>
+          <w:tab w:val="num" w:pos="5040"/>
+        </w:tabs>
+        <w:ind w:left="5040" w:hanging="360"/>
+      </w:pPr>
+      <w:rPr>
+        <w:rFonts w:ascii="Wingdings" w:hAnsi="Wingdings" w:hint="default"/>
+        <w:sz w:val="20"/>
+      </w:rPr>
+    </w:lvl>
+    <w:lvl w:ilvl="7" w:tentative="1">
+      <w:start w:val="1"/>
+      <w:numFmt w:val="bullet"/>
+      <w:lvlText w:val=""/>
+      <w:lvlJc w:val="left"/>
+      <w:pPr>
+        <w:tabs>
+          <w:tab w:val="num" w:pos="5760"/>
+        </w:tabs>
+        <w:ind w:left="5760" w:hanging="360"/>
+      </w:pPr>
+      <w:rPr>
+        <w:rFonts w:ascii="Wingdings" w:hAnsi="Wingdings" w:hint="default"/>
+        <w:sz w:val="20"/>
+      </w:rPr>
+    </w:lvl>
+    <w:lvl w:ilvl="8" w:tentative="1">
+      <w:start w:val="1"/>
+      <w:numFmt w:val="bullet"/>
+      <w:lvlText w:val=""/>
+      <w:lvlJc w:val="left"/>
+      <w:pPr>
+        <w:tabs>
+          <w:tab w:val="num" w:pos="6480"/>
+        </w:tabs>
+        <w:ind w:left="6480" w:hanging="360"/>
+      </w:pPr>
+      <w:rPr>
+        <w:rFonts w:ascii="Wingdings" w:hAnsi="Wingdings" w:hint="default"/>
+        <w:sz w:val="20"/>
+      </w:rPr>
+    </w:lvl>
+  </w:abstractNum>
+  <w:abstractNum w:abstractNumId="19" w15:restartNumberingAfterBreak="0">
+    <w:nsid w:val="4305639D"/>
+    <w:multiLevelType w:val="multilevel"/>
+    <w:tmpl w:val="8F2ABED0"/>
+    <w:lvl w:ilvl="0">
+      <w:start w:val="1"/>
+      <w:numFmt w:val="bullet"/>
+      <w:lvlText w:val=""/>
+      <w:lvlJc w:val="left"/>
+      <w:pPr>
+        <w:tabs>
+          <w:tab w:val="num" w:pos="720"/>
+        </w:tabs>
+        <w:ind w:left="720" w:hanging="360"/>
+      </w:pPr>
+      <w:rPr>
+        <w:rFonts w:ascii="Symbol" w:hAnsi="Symbol" w:hint="default"/>
+        <w:sz w:val="20"/>
+      </w:rPr>
+    </w:lvl>
+    <w:lvl w:ilvl="1" w:tentative="1">
+      <w:start w:val="1"/>
+      <w:numFmt w:val="bullet"/>
+      <w:lvlText w:val="o"/>
+      <w:lvlJc w:val="left"/>
+      <w:pPr>
+        <w:tabs>
+          <w:tab w:val="num" w:pos="1440"/>
+        </w:tabs>
+        <w:ind w:left="1440" w:hanging="360"/>
+      </w:pPr>
+      <w:rPr>
+        <w:rFonts w:ascii="Courier New" w:hAnsi="Courier New" w:hint="default"/>
+        <w:sz w:val="20"/>
+      </w:rPr>
+    </w:lvl>
+    <w:lvl w:ilvl="2" w:tentative="1">
+      <w:start w:val="1"/>
+      <w:numFmt w:val="bullet"/>
+      <w:lvlText w:val=""/>
+      <w:lvlJc w:val="left"/>
+      <w:pPr>
+        <w:tabs>
+          <w:tab w:val="num" w:pos="2160"/>
+        </w:tabs>
+        <w:ind w:left="2160" w:hanging="360"/>
+      </w:pPr>
+      <w:rPr>
+        <w:rFonts w:ascii="Wingdings" w:hAnsi="Wingdings" w:hint="default"/>
+        <w:sz w:val="20"/>
+      </w:rPr>
+    </w:lvl>
+    <w:lvl w:ilvl="3" w:tentative="1">
+      <w:start w:val="1"/>
+      <w:numFmt w:val="bullet"/>
+      <w:lvlText w:val=""/>
+      <w:lvlJc w:val="left"/>
+      <w:pPr>
+        <w:tabs>
+          <w:tab w:val="num" w:pos="2880"/>
+        </w:tabs>
+        <w:ind w:left="2880" w:hanging="360"/>
+      </w:pPr>
+      <w:rPr>
+        <w:rFonts w:ascii="Wingdings" w:hAnsi="Wingdings" w:hint="default"/>
+        <w:sz w:val="20"/>
+      </w:rPr>
+    </w:lvl>
+    <w:lvl w:ilvl="4" w:tentative="1">
+      <w:start w:val="1"/>
+      <w:numFmt w:val="bullet"/>
+      <w:lvlText w:val=""/>
+      <w:lvlJc w:val="left"/>
+      <w:pPr>
+        <w:tabs>
+          <w:tab w:val="num" w:pos="3600"/>
+        </w:tabs>
+        <w:ind w:left="3600" w:hanging="360"/>
+      </w:pPr>
+      <w:rPr>
+        <w:rFonts w:ascii="Wingdings" w:hAnsi="Wingdings" w:hint="default"/>
+        <w:sz w:val="20"/>
+      </w:rPr>
+    </w:lvl>
+    <w:lvl w:ilvl="5" w:tentative="1">
+      <w:start w:val="1"/>
+      <w:numFmt w:val="bullet"/>
+      <w:lvlText w:val=""/>
+      <w:lvlJc w:val="left"/>
+      <w:pPr>
+        <w:tabs>
+          <w:tab w:val="num" w:pos="4320"/>
+        </w:tabs>
+        <w:ind w:left="4320" w:hanging="360"/>
+      </w:pPr>
+      <w:rPr>
+        <w:rFonts w:ascii="Wingdings" w:hAnsi="Wingdings" w:hint="default"/>
+        <w:sz w:val="20"/>
+      </w:rPr>
+    </w:lvl>
+    <w:lvl w:ilvl="6" w:tentative="1">
+      <w:start w:val="1"/>
+      <w:numFmt w:val="bullet"/>
+      <w:lvlText w:val=""/>
+      <w:lvlJc w:val="left"/>
+      <w:pPr>
+        <w:tabs>
+          <w:tab w:val="num" w:pos="5040"/>
+        </w:tabs>
+        <w:ind w:left="5040" w:hanging="360"/>
+      </w:pPr>
+      <w:rPr>
+        <w:rFonts w:ascii="Wingdings" w:hAnsi="Wingdings" w:hint="default"/>
+        <w:sz w:val="20"/>
+      </w:rPr>
+    </w:lvl>
+    <w:lvl w:ilvl="7" w:tentative="1">
+      <w:start w:val="1"/>
+      <w:numFmt w:val="bullet"/>
+      <w:lvlText w:val=""/>
+      <w:lvlJc w:val="left"/>
+      <w:pPr>
+        <w:tabs>
+          <w:tab w:val="num" w:pos="5760"/>
+        </w:tabs>
+        <w:ind w:left="5760" w:hanging="360"/>
+      </w:pPr>
+      <w:rPr>
+        <w:rFonts w:ascii="Wingdings" w:hAnsi="Wingdings" w:hint="default"/>
+        <w:sz w:val="20"/>
+      </w:rPr>
+    </w:lvl>
+    <w:lvl w:ilvl="8" w:tentative="1">
+      <w:start w:val="1"/>
+      <w:numFmt w:val="bullet"/>
+      <w:lvlText w:val=""/>
+      <w:lvlJc w:val="left"/>
+      <w:pPr>
+        <w:tabs>
+          <w:tab w:val="num" w:pos="6480"/>
+        </w:tabs>
+        <w:ind w:left="6480" w:hanging="360"/>
+      </w:pPr>
+      <w:rPr>
+        <w:rFonts w:ascii="Wingdings" w:hAnsi="Wingdings" w:hint="default"/>
+        <w:sz w:val="20"/>
+      </w:rPr>
+    </w:lvl>
+  </w:abstractNum>
+  <w:abstractNum w:abstractNumId="20" w15:restartNumberingAfterBreak="0">
     <w:nsid w:val="4A7776E7"/>
     <w:multiLevelType w:val="multilevel"/>
     <w:tmpl w:val="BCE07874"/>
@@ -2409,7 +5266,7 @@
       </w:rPr>
     </w:lvl>
   </w:abstractNum>
-  <w:abstractNum w:abstractNumId="12" w15:restartNumberingAfterBreak="0">
+  <w:abstractNum w:abstractNumId="21" w15:restartNumberingAfterBreak="0">
     <w:nsid w:val="4A7B1505"/>
     <w:multiLevelType w:val="multilevel"/>
     <w:tmpl w:val="43E40CB6"/>
@@ -2558,7 +5415,156 @@
       </w:rPr>
     </w:lvl>
   </w:abstractNum>
-  <w:abstractNum w:abstractNumId="13" w15:restartNumberingAfterBreak="0">
+  <w:abstractNum w:abstractNumId="22" w15:restartNumberingAfterBreak="0">
+    <w:nsid w:val="4AAD199C"/>
+    <w:multiLevelType w:val="multilevel"/>
+    <w:tmpl w:val="76D2D050"/>
+    <w:lvl w:ilvl="0">
+      <w:start w:val="1"/>
+      <w:numFmt w:val="bullet"/>
+      <w:lvlText w:val=""/>
+      <w:lvlJc w:val="left"/>
+      <w:pPr>
+        <w:tabs>
+          <w:tab w:val="num" w:pos="720"/>
+        </w:tabs>
+        <w:ind w:left="720" w:hanging="360"/>
+      </w:pPr>
+      <w:rPr>
+        <w:rFonts w:ascii="Symbol" w:hAnsi="Symbol" w:hint="default"/>
+        <w:sz w:val="20"/>
+      </w:rPr>
+    </w:lvl>
+    <w:lvl w:ilvl="1" w:tentative="1">
+      <w:start w:val="1"/>
+      <w:numFmt w:val="bullet"/>
+      <w:lvlText w:val="o"/>
+      <w:lvlJc w:val="left"/>
+      <w:pPr>
+        <w:tabs>
+          <w:tab w:val="num" w:pos="1440"/>
+        </w:tabs>
+        <w:ind w:left="1440" w:hanging="360"/>
+      </w:pPr>
+      <w:rPr>
+        <w:rFonts w:ascii="Courier New" w:hAnsi="Courier New" w:hint="default"/>
+        <w:sz w:val="20"/>
+      </w:rPr>
+    </w:lvl>
+    <w:lvl w:ilvl="2" w:tentative="1">
+      <w:start w:val="1"/>
+      <w:numFmt w:val="bullet"/>
+      <w:lvlText w:val=""/>
+      <w:lvlJc w:val="left"/>
+      <w:pPr>
+        <w:tabs>
+          <w:tab w:val="num" w:pos="2160"/>
+        </w:tabs>
+        <w:ind w:left="2160" w:hanging="360"/>
+      </w:pPr>
+      <w:rPr>
+        <w:rFonts w:ascii="Wingdings" w:hAnsi="Wingdings" w:hint="default"/>
+        <w:sz w:val="20"/>
+      </w:rPr>
+    </w:lvl>
+    <w:lvl w:ilvl="3" w:tentative="1">
+      <w:start w:val="1"/>
+      <w:numFmt w:val="bullet"/>
+      <w:lvlText w:val=""/>
+      <w:lvlJc w:val="left"/>
+      <w:pPr>
+        <w:tabs>
+          <w:tab w:val="num" w:pos="2880"/>
+        </w:tabs>
+        <w:ind w:left="2880" w:hanging="360"/>
+      </w:pPr>
+      <w:rPr>
+        <w:rFonts w:ascii="Wingdings" w:hAnsi="Wingdings" w:hint="default"/>
+        <w:sz w:val="20"/>
+      </w:rPr>
+    </w:lvl>
+    <w:lvl w:ilvl="4" w:tentative="1">
+      <w:start w:val="1"/>
+      <w:numFmt w:val="bullet"/>
+      <w:lvlText w:val=""/>
+      <w:lvlJc w:val="left"/>
+      <w:pPr>
+        <w:tabs>
+          <w:tab w:val="num" w:pos="3600"/>
+        </w:tabs>
+        <w:ind w:left="3600" w:hanging="360"/>
+      </w:pPr>
+      <w:rPr>
+        <w:rFonts w:ascii="Wingdings" w:hAnsi="Wingdings" w:hint="default"/>
+        <w:sz w:val="20"/>
+      </w:rPr>
+    </w:lvl>
+    <w:lvl w:ilvl="5" w:tentative="1">
+      <w:start w:val="1"/>
+      <w:numFmt w:val="bullet"/>
+      <w:lvlText w:val=""/>
+      <w:lvlJc w:val="left"/>
+      <w:pPr>
+        <w:tabs>
+          <w:tab w:val="num" w:pos="4320"/>
+        </w:tabs>
+        <w:ind w:left="4320" w:hanging="360"/>
+      </w:pPr>
+      <w:rPr>
+        <w:rFonts w:ascii="Wingdings" w:hAnsi="Wingdings" w:hint="default"/>
+        <w:sz w:val="20"/>
+      </w:rPr>
+    </w:lvl>
+    <w:lvl w:ilvl="6" w:tentative="1">
+      <w:start w:val="1"/>
+      <w:numFmt w:val="bullet"/>
+      <w:lvlText w:val=""/>
+      <w:lvlJc w:val="left"/>
+      <w:pPr>
+        <w:tabs>
+          <w:tab w:val="num" w:pos="5040"/>
+        </w:tabs>
+        <w:ind w:left="5040" w:hanging="360"/>
+      </w:pPr>
+      <w:rPr>
+        <w:rFonts w:ascii="Wingdings" w:hAnsi="Wingdings" w:hint="default"/>
+        <w:sz w:val="20"/>
+      </w:rPr>
+    </w:lvl>
+    <w:lvl w:ilvl="7" w:tentative="1">
+      <w:start w:val="1"/>
+      <w:numFmt w:val="bullet"/>
+      <w:lvlText w:val=""/>
+      <w:lvlJc w:val="left"/>
+      <w:pPr>
+        <w:tabs>
+          <w:tab w:val="num" w:pos="5760"/>
+        </w:tabs>
+        <w:ind w:left="5760" w:hanging="360"/>
+      </w:pPr>
+      <w:rPr>
+        <w:rFonts w:ascii="Wingdings" w:hAnsi="Wingdings" w:hint="default"/>
+        <w:sz w:val="20"/>
+      </w:rPr>
+    </w:lvl>
+    <w:lvl w:ilvl="8" w:tentative="1">
+      <w:start w:val="1"/>
+      <w:numFmt w:val="bullet"/>
+      <w:lvlText w:val=""/>
+      <w:lvlJc w:val="left"/>
+      <w:pPr>
+        <w:tabs>
+          <w:tab w:val="num" w:pos="6480"/>
+        </w:tabs>
+        <w:ind w:left="6480" w:hanging="360"/>
+      </w:pPr>
+      <w:rPr>
+        <w:rFonts w:ascii="Wingdings" w:hAnsi="Wingdings" w:hint="default"/>
+        <w:sz w:val="20"/>
+      </w:rPr>
+    </w:lvl>
+  </w:abstractNum>
+  <w:abstractNum w:abstractNumId="23" w15:restartNumberingAfterBreak="0">
     <w:nsid w:val="4F4A7D4F"/>
     <w:multiLevelType w:val="multilevel"/>
     <w:tmpl w:val="34306C4E"/>
@@ -2707,7 +5713,901 @@
       </w:rPr>
     </w:lvl>
   </w:abstractNum>
-  <w:abstractNum w:abstractNumId="14" w15:restartNumberingAfterBreak="0">
+  <w:abstractNum w:abstractNumId="24" w15:restartNumberingAfterBreak="0">
+    <w:nsid w:val="510578A4"/>
+    <w:multiLevelType w:val="multilevel"/>
+    <w:tmpl w:val="00844A32"/>
+    <w:lvl w:ilvl="0">
+      <w:start w:val="1"/>
+      <w:numFmt w:val="bullet"/>
+      <w:lvlText w:val=""/>
+      <w:lvlJc w:val="left"/>
+      <w:pPr>
+        <w:tabs>
+          <w:tab w:val="num" w:pos="720"/>
+        </w:tabs>
+        <w:ind w:left="720" w:hanging="360"/>
+      </w:pPr>
+      <w:rPr>
+        <w:rFonts w:ascii="Symbol" w:hAnsi="Symbol" w:hint="default"/>
+        <w:sz w:val="20"/>
+      </w:rPr>
+    </w:lvl>
+    <w:lvl w:ilvl="1" w:tentative="1">
+      <w:start w:val="1"/>
+      <w:numFmt w:val="bullet"/>
+      <w:lvlText w:val="o"/>
+      <w:lvlJc w:val="left"/>
+      <w:pPr>
+        <w:tabs>
+          <w:tab w:val="num" w:pos="1440"/>
+        </w:tabs>
+        <w:ind w:left="1440" w:hanging="360"/>
+      </w:pPr>
+      <w:rPr>
+        <w:rFonts w:ascii="Courier New" w:hAnsi="Courier New" w:hint="default"/>
+        <w:sz w:val="20"/>
+      </w:rPr>
+    </w:lvl>
+    <w:lvl w:ilvl="2" w:tentative="1">
+      <w:start w:val="1"/>
+      <w:numFmt w:val="bullet"/>
+      <w:lvlText w:val=""/>
+      <w:lvlJc w:val="left"/>
+      <w:pPr>
+        <w:tabs>
+          <w:tab w:val="num" w:pos="2160"/>
+        </w:tabs>
+        <w:ind w:left="2160" w:hanging="360"/>
+      </w:pPr>
+      <w:rPr>
+        <w:rFonts w:ascii="Wingdings" w:hAnsi="Wingdings" w:hint="default"/>
+        <w:sz w:val="20"/>
+      </w:rPr>
+    </w:lvl>
+    <w:lvl w:ilvl="3" w:tentative="1">
+      <w:start w:val="1"/>
+      <w:numFmt w:val="bullet"/>
+      <w:lvlText w:val=""/>
+      <w:lvlJc w:val="left"/>
+      <w:pPr>
+        <w:tabs>
+          <w:tab w:val="num" w:pos="2880"/>
+        </w:tabs>
+        <w:ind w:left="2880" w:hanging="360"/>
+      </w:pPr>
+      <w:rPr>
+        <w:rFonts w:ascii="Wingdings" w:hAnsi="Wingdings" w:hint="default"/>
+        <w:sz w:val="20"/>
+      </w:rPr>
+    </w:lvl>
+    <w:lvl w:ilvl="4" w:tentative="1">
+      <w:start w:val="1"/>
+      <w:numFmt w:val="bullet"/>
+      <w:lvlText w:val=""/>
+      <w:lvlJc w:val="left"/>
+      <w:pPr>
+        <w:tabs>
+          <w:tab w:val="num" w:pos="3600"/>
+        </w:tabs>
+        <w:ind w:left="3600" w:hanging="360"/>
+      </w:pPr>
+      <w:rPr>
+        <w:rFonts w:ascii="Wingdings" w:hAnsi="Wingdings" w:hint="default"/>
+        <w:sz w:val="20"/>
+      </w:rPr>
+    </w:lvl>
+    <w:lvl w:ilvl="5" w:tentative="1">
+      <w:start w:val="1"/>
+      <w:numFmt w:val="bullet"/>
+      <w:lvlText w:val=""/>
+      <w:lvlJc w:val="left"/>
+      <w:pPr>
+        <w:tabs>
+          <w:tab w:val="num" w:pos="4320"/>
+        </w:tabs>
+        <w:ind w:left="4320" w:hanging="360"/>
+      </w:pPr>
+      <w:rPr>
+        <w:rFonts w:ascii="Wingdings" w:hAnsi="Wingdings" w:hint="default"/>
+        <w:sz w:val="20"/>
+      </w:rPr>
+    </w:lvl>
+    <w:lvl w:ilvl="6" w:tentative="1">
+      <w:start w:val="1"/>
+      <w:numFmt w:val="bullet"/>
+      <w:lvlText w:val=""/>
+      <w:lvlJc w:val="left"/>
+      <w:pPr>
+        <w:tabs>
+          <w:tab w:val="num" w:pos="5040"/>
+        </w:tabs>
+        <w:ind w:left="5040" w:hanging="360"/>
+      </w:pPr>
+      <w:rPr>
+        <w:rFonts w:ascii="Wingdings" w:hAnsi="Wingdings" w:hint="default"/>
+        <w:sz w:val="20"/>
+      </w:rPr>
+    </w:lvl>
+    <w:lvl w:ilvl="7" w:tentative="1">
+      <w:start w:val="1"/>
+      <w:numFmt w:val="bullet"/>
+      <w:lvlText w:val=""/>
+      <w:lvlJc w:val="left"/>
+      <w:pPr>
+        <w:tabs>
+          <w:tab w:val="num" w:pos="5760"/>
+        </w:tabs>
+        <w:ind w:left="5760" w:hanging="360"/>
+      </w:pPr>
+      <w:rPr>
+        <w:rFonts w:ascii="Wingdings" w:hAnsi="Wingdings" w:hint="default"/>
+        <w:sz w:val="20"/>
+      </w:rPr>
+    </w:lvl>
+    <w:lvl w:ilvl="8" w:tentative="1">
+      <w:start w:val="1"/>
+      <w:numFmt w:val="bullet"/>
+      <w:lvlText w:val=""/>
+      <w:lvlJc w:val="left"/>
+      <w:pPr>
+        <w:tabs>
+          <w:tab w:val="num" w:pos="6480"/>
+        </w:tabs>
+        <w:ind w:left="6480" w:hanging="360"/>
+      </w:pPr>
+      <w:rPr>
+        <w:rFonts w:ascii="Wingdings" w:hAnsi="Wingdings" w:hint="default"/>
+        <w:sz w:val="20"/>
+      </w:rPr>
+    </w:lvl>
+  </w:abstractNum>
+  <w:abstractNum w:abstractNumId="25" w15:restartNumberingAfterBreak="0">
+    <w:nsid w:val="51FC7E00"/>
+    <w:multiLevelType w:val="multilevel"/>
+    <w:tmpl w:val="45C02A4A"/>
+    <w:lvl w:ilvl="0">
+      <w:start w:val="1"/>
+      <w:numFmt w:val="bullet"/>
+      <w:lvlText w:val=""/>
+      <w:lvlJc w:val="left"/>
+      <w:pPr>
+        <w:tabs>
+          <w:tab w:val="num" w:pos="720"/>
+        </w:tabs>
+        <w:ind w:left="720" w:hanging="360"/>
+      </w:pPr>
+      <w:rPr>
+        <w:rFonts w:ascii="Symbol" w:hAnsi="Symbol" w:hint="default"/>
+        <w:sz w:val="20"/>
+      </w:rPr>
+    </w:lvl>
+    <w:lvl w:ilvl="1" w:tentative="1">
+      <w:start w:val="1"/>
+      <w:numFmt w:val="bullet"/>
+      <w:lvlText w:val="o"/>
+      <w:lvlJc w:val="left"/>
+      <w:pPr>
+        <w:tabs>
+          <w:tab w:val="num" w:pos="1440"/>
+        </w:tabs>
+        <w:ind w:left="1440" w:hanging="360"/>
+      </w:pPr>
+      <w:rPr>
+        <w:rFonts w:ascii="Courier New" w:hAnsi="Courier New" w:hint="default"/>
+        <w:sz w:val="20"/>
+      </w:rPr>
+    </w:lvl>
+    <w:lvl w:ilvl="2" w:tentative="1">
+      <w:start w:val="1"/>
+      <w:numFmt w:val="bullet"/>
+      <w:lvlText w:val=""/>
+      <w:lvlJc w:val="left"/>
+      <w:pPr>
+        <w:tabs>
+          <w:tab w:val="num" w:pos="2160"/>
+        </w:tabs>
+        <w:ind w:left="2160" w:hanging="360"/>
+      </w:pPr>
+      <w:rPr>
+        <w:rFonts w:ascii="Wingdings" w:hAnsi="Wingdings" w:hint="default"/>
+        <w:sz w:val="20"/>
+      </w:rPr>
+    </w:lvl>
+    <w:lvl w:ilvl="3" w:tentative="1">
+      <w:start w:val="1"/>
+      <w:numFmt w:val="bullet"/>
+      <w:lvlText w:val=""/>
+      <w:lvlJc w:val="left"/>
+      <w:pPr>
+        <w:tabs>
+          <w:tab w:val="num" w:pos="2880"/>
+        </w:tabs>
+        <w:ind w:left="2880" w:hanging="360"/>
+      </w:pPr>
+      <w:rPr>
+        <w:rFonts w:ascii="Wingdings" w:hAnsi="Wingdings" w:hint="default"/>
+        <w:sz w:val="20"/>
+      </w:rPr>
+    </w:lvl>
+    <w:lvl w:ilvl="4" w:tentative="1">
+      <w:start w:val="1"/>
+      <w:numFmt w:val="bullet"/>
+      <w:lvlText w:val=""/>
+      <w:lvlJc w:val="left"/>
+      <w:pPr>
+        <w:tabs>
+          <w:tab w:val="num" w:pos="3600"/>
+        </w:tabs>
+        <w:ind w:left="3600" w:hanging="360"/>
+      </w:pPr>
+      <w:rPr>
+        <w:rFonts w:ascii="Wingdings" w:hAnsi="Wingdings" w:hint="default"/>
+        <w:sz w:val="20"/>
+      </w:rPr>
+    </w:lvl>
+    <w:lvl w:ilvl="5" w:tentative="1">
+      <w:start w:val="1"/>
+      <w:numFmt w:val="bullet"/>
+      <w:lvlText w:val=""/>
+      <w:lvlJc w:val="left"/>
+      <w:pPr>
+        <w:tabs>
+          <w:tab w:val="num" w:pos="4320"/>
+        </w:tabs>
+        <w:ind w:left="4320" w:hanging="360"/>
+      </w:pPr>
+      <w:rPr>
+        <w:rFonts w:ascii="Wingdings" w:hAnsi="Wingdings" w:hint="default"/>
+        <w:sz w:val="20"/>
+      </w:rPr>
+    </w:lvl>
+    <w:lvl w:ilvl="6" w:tentative="1">
+      <w:start w:val="1"/>
+      <w:numFmt w:val="bullet"/>
+      <w:lvlText w:val=""/>
+      <w:lvlJc w:val="left"/>
+      <w:pPr>
+        <w:tabs>
+          <w:tab w:val="num" w:pos="5040"/>
+        </w:tabs>
+        <w:ind w:left="5040" w:hanging="360"/>
+      </w:pPr>
+      <w:rPr>
+        <w:rFonts w:ascii="Wingdings" w:hAnsi="Wingdings" w:hint="default"/>
+        <w:sz w:val="20"/>
+      </w:rPr>
+    </w:lvl>
+    <w:lvl w:ilvl="7" w:tentative="1">
+      <w:start w:val="1"/>
+      <w:numFmt w:val="bullet"/>
+      <w:lvlText w:val=""/>
+      <w:lvlJc w:val="left"/>
+      <w:pPr>
+        <w:tabs>
+          <w:tab w:val="num" w:pos="5760"/>
+        </w:tabs>
+        <w:ind w:left="5760" w:hanging="360"/>
+      </w:pPr>
+      <w:rPr>
+        <w:rFonts w:ascii="Wingdings" w:hAnsi="Wingdings" w:hint="default"/>
+        <w:sz w:val="20"/>
+      </w:rPr>
+    </w:lvl>
+    <w:lvl w:ilvl="8" w:tentative="1">
+      <w:start w:val="1"/>
+      <w:numFmt w:val="bullet"/>
+      <w:lvlText w:val=""/>
+      <w:lvlJc w:val="left"/>
+      <w:pPr>
+        <w:tabs>
+          <w:tab w:val="num" w:pos="6480"/>
+        </w:tabs>
+        <w:ind w:left="6480" w:hanging="360"/>
+      </w:pPr>
+      <w:rPr>
+        <w:rFonts w:ascii="Wingdings" w:hAnsi="Wingdings" w:hint="default"/>
+        <w:sz w:val="20"/>
+      </w:rPr>
+    </w:lvl>
+  </w:abstractNum>
+  <w:abstractNum w:abstractNumId="26" w15:restartNumberingAfterBreak="0">
+    <w:nsid w:val="538A267B"/>
+    <w:multiLevelType w:val="multilevel"/>
+    <w:tmpl w:val="FF0ADE0E"/>
+    <w:lvl w:ilvl="0">
+      <w:start w:val="1"/>
+      <w:numFmt w:val="bullet"/>
+      <w:lvlText w:val=""/>
+      <w:lvlJc w:val="left"/>
+      <w:pPr>
+        <w:tabs>
+          <w:tab w:val="num" w:pos="720"/>
+        </w:tabs>
+        <w:ind w:left="720" w:hanging="360"/>
+      </w:pPr>
+      <w:rPr>
+        <w:rFonts w:ascii="Symbol" w:hAnsi="Symbol" w:hint="default"/>
+        <w:sz w:val="20"/>
+      </w:rPr>
+    </w:lvl>
+    <w:lvl w:ilvl="1" w:tentative="1">
+      <w:start w:val="1"/>
+      <w:numFmt w:val="bullet"/>
+      <w:lvlText w:val="o"/>
+      <w:lvlJc w:val="left"/>
+      <w:pPr>
+        <w:tabs>
+          <w:tab w:val="num" w:pos="1440"/>
+        </w:tabs>
+        <w:ind w:left="1440" w:hanging="360"/>
+      </w:pPr>
+      <w:rPr>
+        <w:rFonts w:ascii="Courier New" w:hAnsi="Courier New" w:hint="default"/>
+        <w:sz w:val="20"/>
+      </w:rPr>
+    </w:lvl>
+    <w:lvl w:ilvl="2" w:tentative="1">
+      <w:start w:val="1"/>
+      <w:numFmt w:val="bullet"/>
+      <w:lvlText w:val=""/>
+      <w:lvlJc w:val="left"/>
+      <w:pPr>
+        <w:tabs>
+          <w:tab w:val="num" w:pos="2160"/>
+        </w:tabs>
+        <w:ind w:left="2160" w:hanging="360"/>
+      </w:pPr>
+      <w:rPr>
+        <w:rFonts w:ascii="Wingdings" w:hAnsi="Wingdings" w:hint="default"/>
+        <w:sz w:val="20"/>
+      </w:rPr>
+    </w:lvl>
+    <w:lvl w:ilvl="3" w:tentative="1">
+      <w:start w:val="1"/>
+      <w:numFmt w:val="bullet"/>
+      <w:lvlText w:val=""/>
+      <w:lvlJc w:val="left"/>
+      <w:pPr>
+        <w:tabs>
+          <w:tab w:val="num" w:pos="2880"/>
+        </w:tabs>
+        <w:ind w:left="2880" w:hanging="360"/>
+      </w:pPr>
+      <w:rPr>
+        <w:rFonts w:ascii="Wingdings" w:hAnsi="Wingdings" w:hint="default"/>
+        <w:sz w:val="20"/>
+      </w:rPr>
+    </w:lvl>
+    <w:lvl w:ilvl="4" w:tentative="1">
+      <w:start w:val="1"/>
+      <w:numFmt w:val="bullet"/>
+      <w:lvlText w:val=""/>
+      <w:lvlJc w:val="left"/>
+      <w:pPr>
+        <w:tabs>
+          <w:tab w:val="num" w:pos="3600"/>
+        </w:tabs>
+        <w:ind w:left="3600" w:hanging="360"/>
+      </w:pPr>
+      <w:rPr>
+        <w:rFonts w:ascii="Wingdings" w:hAnsi="Wingdings" w:hint="default"/>
+        <w:sz w:val="20"/>
+      </w:rPr>
+    </w:lvl>
+    <w:lvl w:ilvl="5" w:tentative="1">
+      <w:start w:val="1"/>
+      <w:numFmt w:val="bullet"/>
+      <w:lvlText w:val=""/>
+      <w:lvlJc w:val="left"/>
+      <w:pPr>
+        <w:tabs>
+          <w:tab w:val="num" w:pos="4320"/>
+        </w:tabs>
+        <w:ind w:left="4320" w:hanging="360"/>
+      </w:pPr>
+      <w:rPr>
+        <w:rFonts w:ascii="Wingdings" w:hAnsi="Wingdings" w:hint="default"/>
+        <w:sz w:val="20"/>
+      </w:rPr>
+    </w:lvl>
+    <w:lvl w:ilvl="6" w:tentative="1">
+      <w:start w:val="1"/>
+      <w:numFmt w:val="bullet"/>
+      <w:lvlText w:val=""/>
+      <w:lvlJc w:val="left"/>
+      <w:pPr>
+        <w:tabs>
+          <w:tab w:val="num" w:pos="5040"/>
+        </w:tabs>
+        <w:ind w:left="5040" w:hanging="360"/>
+      </w:pPr>
+      <w:rPr>
+        <w:rFonts w:ascii="Wingdings" w:hAnsi="Wingdings" w:hint="default"/>
+        <w:sz w:val="20"/>
+      </w:rPr>
+    </w:lvl>
+    <w:lvl w:ilvl="7" w:tentative="1">
+      <w:start w:val="1"/>
+      <w:numFmt w:val="bullet"/>
+      <w:lvlText w:val=""/>
+      <w:lvlJc w:val="left"/>
+      <w:pPr>
+        <w:tabs>
+          <w:tab w:val="num" w:pos="5760"/>
+        </w:tabs>
+        <w:ind w:left="5760" w:hanging="360"/>
+      </w:pPr>
+      <w:rPr>
+        <w:rFonts w:ascii="Wingdings" w:hAnsi="Wingdings" w:hint="default"/>
+        <w:sz w:val="20"/>
+      </w:rPr>
+    </w:lvl>
+    <w:lvl w:ilvl="8" w:tentative="1">
+      <w:start w:val="1"/>
+      <w:numFmt w:val="bullet"/>
+      <w:lvlText w:val=""/>
+      <w:lvlJc w:val="left"/>
+      <w:pPr>
+        <w:tabs>
+          <w:tab w:val="num" w:pos="6480"/>
+        </w:tabs>
+        <w:ind w:left="6480" w:hanging="360"/>
+      </w:pPr>
+      <w:rPr>
+        <w:rFonts w:ascii="Wingdings" w:hAnsi="Wingdings" w:hint="default"/>
+        <w:sz w:val="20"/>
+      </w:rPr>
+    </w:lvl>
+  </w:abstractNum>
+  <w:abstractNum w:abstractNumId="27" w15:restartNumberingAfterBreak="0">
+    <w:nsid w:val="558D513D"/>
+    <w:multiLevelType w:val="multilevel"/>
+    <w:tmpl w:val="A0D2205C"/>
+    <w:lvl w:ilvl="0">
+      <w:start w:val="1"/>
+      <w:numFmt w:val="bullet"/>
+      <w:lvlText w:val=""/>
+      <w:lvlJc w:val="left"/>
+      <w:pPr>
+        <w:tabs>
+          <w:tab w:val="num" w:pos="720"/>
+        </w:tabs>
+        <w:ind w:left="720" w:hanging="360"/>
+      </w:pPr>
+      <w:rPr>
+        <w:rFonts w:ascii="Symbol" w:hAnsi="Symbol" w:hint="default"/>
+        <w:sz w:val="20"/>
+      </w:rPr>
+    </w:lvl>
+    <w:lvl w:ilvl="1" w:tentative="1">
+      <w:start w:val="1"/>
+      <w:numFmt w:val="bullet"/>
+      <w:lvlText w:val="o"/>
+      <w:lvlJc w:val="left"/>
+      <w:pPr>
+        <w:tabs>
+          <w:tab w:val="num" w:pos="1440"/>
+        </w:tabs>
+        <w:ind w:left="1440" w:hanging="360"/>
+      </w:pPr>
+      <w:rPr>
+        <w:rFonts w:ascii="Courier New" w:hAnsi="Courier New" w:hint="default"/>
+        <w:sz w:val="20"/>
+      </w:rPr>
+    </w:lvl>
+    <w:lvl w:ilvl="2" w:tentative="1">
+      <w:start w:val="1"/>
+      <w:numFmt w:val="bullet"/>
+      <w:lvlText w:val=""/>
+      <w:lvlJc w:val="left"/>
+      <w:pPr>
+        <w:tabs>
+          <w:tab w:val="num" w:pos="2160"/>
+        </w:tabs>
+        <w:ind w:left="2160" w:hanging="360"/>
+      </w:pPr>
+      <w:rPr>
+        <w:rFonts w:ascii="Wingdings" w:hAnsi="Wingdings" w:hint="default"/>
+        <w:sz w:val="20"/>
+      </w:rPr>
+    </w:lvl>
+    <w:lvl w:ilvl="3" w:tentative="1">
+      <w:start w:val="1"/>
+      <w:numFmt w:val="bullet"/>
+      <w:lvlText w:val=""/>
+      <w:lvlJc w:val="left"/>
+      <w:pPr>
+        <w:tabs>
+          <w:tab w:val="num" w:pos="2880"/>
+        </w:tabs>
+        <w:ind w:left="2880" w:hanging="360"/>
+      </w:pPr>
+      <w:rPr>
+        <w:rFonts w:ascii="Wingdings" w:hAnsi="Wingdings" w:hint="default"/>
+        <w:sz w:val="20"/>
+      </w:rPr>
+    </w:lvl>
+    <w:lvl w:ilvl="4" w:tentative="1">
+      <w:start w:val="1"/>
+      <w:numFmt w:val="bullet"/>
+      <w:lvlText w:val=""/>
+      <w:lvlJc w:val="left"/>
+      <w:pPr>
+        <w:tabs>
+          <w:tab w:val="num" w:pos="3600"/>
+        </w:tabs>
+        <w:ind w:left="3600" w:hanging="360"/>
+      </w:pPr>
+      <w:rPr>
+        <w:rFonts w:ascii="Wingdings" w:hAnsi="Wingdings" w:hint="default"/>
+        <w:sz w:val="20"/>
+      </w:rPr>
+    </w:lvl>
+    <w:lvl w:ilvl="5" w:tentative="1">
+      <w:start w:val="1"/>
+      <w:numFmt w:val="bullet"/>
+      <w:lvlText w:val=""/>
+      <w:lvlJc w:val="left"/>
+      <w:pPr>
+        <w:tabs>
+          <w:tab w:val="num" w:pos="4320"/>
+        </w:tabs>
+        <w:ind w:left="4320" w:hanging="360"/>
+      </w:pPr>
+      <w:rPr>
+        <w:rFonts w:ascii="Wingdings" w:hAnsi="Wingdings" w:hint="default"/>
+        <w:sz w:val="20"/>
+      </w:rPr>
+    </w:lvl>
+    <w:lvl w:ilvl="6" w:tentative="1">
+      <w:start w:val="1"/>
+      <w:numFmt w:val="bullet"/>
+      <w:lvlText w:val=""/>
+      <w:lvlJc w:val="left"/>
+      <w:pPr>
+        <w:tabs>
+          <w:tab w:val="num" w:pos="5040"/>
+        </w:tabs>
+        <w:ind w:left="5040" w:hanging="360"/>
+      </w:pPr>
+      <w:rPr>
+        <w:rFonts w:ascii="Wingdings" w:hAnsi="Wingdings" w:hint="default"/>
+        <w:sz w:val="20"/>
+      </w:rPr>
+    </w:lvl>
+    <w:lvl w:ilvl="7" w:tentative="1">
+      <w:start w:val="1"/>
+      <w:numFmt w:val="bullet"/>
+      <w:lvlText w:val=""/>
+      <w:lvlJc w:val="left"/>
+      <w:pPr>
+        <w:tabs>
+          <w:tab w:val="num" w:pos="5760"/>
+        </w:tabs>
+        <w:ind w:left="5760" w:hanging="360"/>
+      </w:pPr>
+      <w:rPr>
+        <w:rFonts w:ascii="Wingdings" w:hAnsi="Wingdings" w:hint="default"/>
+        <w:sz w:val="20"/>
+      </w:rPr>
+    </w:lvl>
+    <w:lvl w:ilvl="8" w:tentative="1">
+      <w:start w:val="1"/>
+      <w:numFmt w:val="bullet"/>
+      <w:lvlText w:val=""/>
+      <w:lvlJc w:val="left"/>
+      <w:pPr>
+        <w:tabs>
+          <w:tab w:val="num" w:pos="6480"/>
+        </w:tabs>
+        <w:ind w:left="6480" w:hanging="360"/>
+      </w:pPr>
+      <w:rPr>
+        <w:rFonts w:ascii="Wingdings" w:hAnsi="Wingdings" w:hint="default"/>
+        <w:sz w:val="20"/>
+      </w:rPr>
+    </w:lvl>
+  </w:abstractNum>
+  <w:abstractNum w:abstractNumId="28" w15:restartNumberingAfterBreak="0">
+    <w:nsid w:val="5A6E71CB"/>
+    <w:multiLevelType w:val="multilevel"/>
+    <w:tmpl w:val="9C62F8D6"/>
+    <w:lvl w:ilvl="0">
+      <w:start w:val="1"/>
+      <w:numFmt w:val="bullet"/>
+      <w:lvlText w:val=""/>
+      <w:lvlJc w:val="left"/>
+      <w:pPr>
+        <w:tabs>
+          <w:tab w:val="num" w:pos="720"/>
+        </w:tabs>
+        <w:ind w:left="720" w:hanging="360"/>
+      </w:pPr>
+      <w:rPr>
+        <w:rFonts w:ascii="Symbol" w:hAnsi="Symbol" w:hint="default"/>
+        <w:sz w:val="20"/>
+      </w:rPr>
+    </w:lvl>
+    <w:lvl w:ilvl="1" w:tentative="1">
+      <w:start w:val="1"/>
+      <w:numFmt w:val="bullet"/>
+      <w:lvlText w:val="o"/>
+      <w:lvlJc w:val="left"/>
+      <w:pPr>
+        <w:tabs>
+          <w:tab w:val="num" w:pos="1440"/>
+        </w:tabs>
+        <w:ind w:left="1440" w:hanging="360"/>
+      </w:pPr>
+      <w:rPr>
+        <w:rFonts w:ascii="Courier New" w:hAnsi="Courier New" w:hint="default"/>
+        <w:sz w:val="20"/>
+      </w:rPr>
+    </w:lvl>
+    <w:lvl w:ilvl="2" w:tentative="1">
+      <w:start w:val="1"/>
+      <w:numFmt w:val="bullet"/>
+      <w:lvlText w:val=""/>
+      <w:lvlJc w:val="left"/>
+      <w:pPr>
+        <w:tabs>
+          <w:tab w:val="num" w:pos="2160"/>
+        </w:tabs>
+        <w:ind w:left="2160" w:hanging="360"/>
+      </w:pPr>
+      <w:rPr>
+        <w:rFonts w:ascii="Wingdings" w:hAnsi="Wingdings" w:hint="default"/>
+        <w:sz w:val="20"/>
+      </w:rPr>
+    </w:lvl>
+    <w:lvl w:ilvl="3" w:tentative="1">
+      <w:start w:val="1"/>
+      <w:numFmt w:val="bullet"/>
+      <w:lvlText w:val=""/>
+      <w:lvlJc w:val="left"/>
+      <w:pPr>
+        <w:tabs>
+          <w:tab w:val="num" w:pos="2880"/>
+        </w:tabs>
+        <w:ind w:left="2880" w:hanging="360"/>
+      </w:pPr>
+      <w:rPr>
+        <w:rFonts w:ascii="Wingdings" w:hAnsi="Wingdings" w:hint="default"/>
+        <w:sz w:val="20"/>
+      </w:rPr>
+    </w:lvl>
+    <w:lvl w:ilvl="4" w:tentative="1">
+      <w:start w:val="1"/>
+      <w:numFmt w:val="bullet"/>
+      <w:lvlText w:val=""/>
+      <w:lvlJc w:val="left"/>
+      <w:pPr>
+        <w:tabs>
+          <w:tab w:val="num" w:pos="3600"/>
+        </w:tabs>
+        <w:ind w:left="3600" w:hanging="360"/>
+      </w:pPr>
+      <w:rPr>
+        <w:rFonts w:ascii="Wingdings" w:hAnsi="Wingdings" w:hint="default"/>
+        <w:sz w:val="20"/>
+      </w:rPr>
+    </w:lvl>
+    <w:lvl w:ilvl="5" w:tentative="1">
+      <w:start w:val="1"/>
+      <w:numFmt w:val="bullet"/>
+      <w:lvlText w:val=""/>
+      <w:lvlJc w:val="left"/>
+      <w:pPr>
+        <w:tabs>
+          <w:tab w:val="num" w:pos="4320"/>
+        </w:tabs>
+        <w:ind w:left="4320" w:hanging="360"/>
+      </w:pPr>
+      <w:rPr>
+        <w:rFonts w:ascii="Wingdings" w:hAnsi="Wingdings" w:hint="default"/>
+        <w:sz w:val="20"/>
+      </w:rPr>
+    </w:lvl>
+    <w:lvl w:ilvl="6" w:tentative="1">
+      <w:start w:val="1"/>
+      <w:numFmt w:val="bullet"/>
+      <w:lvlText w:val=""/>
+      <w:lvlJc w:val="left"/>
+      <w:pPr>
+        <w:tabs>
+          <w:tab w:val="num" w:pos="5040"/>
+        </w:tabs>
+        <w:ind w:left="5040" w:hanging="360"/>
+      </w:pPr>
+      <w:rPr>
+        <w:rFonts w:ascii="Wingdings" w:hAnsi="Wingdings" w:hint="default"/>
+        <w:sz w:val="20"/>
+      </w:rPr>
+    </w:lvl>
+    <w:lvl w:ilvl="7" w:tentative="1">
+      <w:start w:val="1"/>
+      <w:numFmt w:val="bullet"/>
+      <w:lvlText w:val=""/>
+      <w:lvlJc w:val="left"/>
+      <w:pPr>
+        <w:tabs>
+          <w:tab w:val="num" w:pos="5760"/>
+        </w:tabs>
+        <w:ind w:left="5760" w:hanging="360"/>
+      </w:pPr>
+      <w:rPr>
+        <w:rFonts w:ascii="Wingdings" w:hAnsi="Wingdings" w:hint="default"/>
+        <w:sz w:val="20"/>
+      </w:rPr>
+    </w:lvl>
+    <w:lvl w:ilvl="8" w:tentative="1">
+      <w:start w:val="1"/>
+      <w:numFmt w:val="bullet"/>
+      <w:lvlText w:val=""/>
+      <w:lvlJc w:val="left"/>
+      <w:pPr>
+        <w:tabs>
+          <w:tab w:val="num" w:pos="6480"/>
+        </w:tabs>
+        <w:ind w:left="6480" w:hanging="360"/>
+      </w:pPr>
+      <w:rPr>
+        <w:rFonts w:ascii="Wingdings" w:hAnsi="Wingdings" w:hint="default"/>
+        <w:sz w:val="20"/>
+      </w:rPr>
+    </w:lvl>
+  </w:abstractNum>
+  <w:abstractNum w:abstractNumId="29" w15:restartNumberingAfterBreak="0">
+    <w:nsid w:val="5E245F7A"/>
+    <w:multiLevelType w:val="multilevel"/>
+    <w:tmpl w:val="092C1FD6"/>
+    <w:lvl w:ilvl="0">
+      <w:start w:val="1"/>
+      <w:numFmt w:val="bullet"/>
+      <w:lvlText w:val=""/>
+      <w:lvlJc w:val="left"/>
+      <w:pPr>
+        <w:tabs>
+          <w:tab w:val="num" w:pos="720"/>
+        </w:tabs>
+        <w:ind w:left="720" w:hanging="360"/>
+      </w:pPr>
+      <w:rPr>
+        <w:rFonts w:ascii="Symbol" w:hAnsi="Symbol" w:hint="default"/>
+        <w:sz w:val="20"/>
+      </w:rPr>
+    </w:lvl>
+    <w:lvl w:ilvl="1" w:tentative="1">
+      <w:start w:val="1"/>
+      <w:numFmt w:val="bullet"/>
+      <w:lvlText w:val="o"/>
+      <w:lvlJc w:val="left"/>
+      <w:pPr>
+        <w:tabs>
+          <w:tab w:val="num" w:pos="1440"/>
+        </w:tabs>
+        <w:ind w:left="1440" w:hanging="360"/>
+      </w:pPr>
+      <w:rPr>
+        <w:rFonts w:ascii="Courier New" w:hAnsi="Courier New" w:hint="default"/>
+        <w:sz w:val="20"/>
+      </w:rPr>
+    </w:lvl>
+    <w:lvl w:ilvl="2" w:tentative="1">
+      <w:start w:val="1"/>
+      <w:numFmt w:val="bullet"/>
+      <w:lvlText w:val=""/>
+      <w:lvlJc w:val="left"/>
+      <w:pPr>
+        <w:tabs>
+          <w:tab w:val="num" w:pos="2160"/>
+        </w:tabs>
+        <w:ind w:left="2160" w:hanging="360"/>
+      </w:pPr>
+      <w:rPr>
+        <w:rFonts w:ascii="Wingdings" w:hAnsi="Wingdings" w:hint="default"/>
+        <w:sz w:val="20"/>
+      </w:rPr>
+    </w:lvl>
+    <w:lvl w:ilvl="3" w:tentative="1">
+      <w:start w:val="1"/>
+      <w:numFmt w:val="bullet"/>
+      <w:lvlText w:val=""/>
+      <w:lvlJc w:val="left"/>
+      <w:pPr>
+        <w:tabs>
+          <w:tab w:val="num" w:pos="2880"/>
+        </w:tabs>
+        <w:ind w:left="2880" w:hanging="360"/>
+      </w:pPr>
+      <w:rPr>
+        <w:rFonts w:ascii="Wingdings" w:hAnsi="Wingdings" w:hint="default"/>
+        <w:sz w:val="20"/>
+      </w:rPr>
+    </w:lvl>
+    <w:lvl w:ilvl="4" w:tentative="1">
+      <w:start w:val="1"/>
+      <w:numFmt w:val="bullet"/>
+      <w:lvlText w:val=""/>
+      <w:lvlJc w:val="left"/>
+      <w:pPr>
+        <w:tabs>
+          <w:tab w:val="num" w:pos="3600"/>
+        </w:tabs>
+        <w:ind w:left="3600" w:hanging="360"/>
+      </w:pPr>
+      <w:rPr>
+        <w:rFonts w:ascii="Wingdings" w:hAnsi="Wingdings" w:hint="default"/>
+        <w:sz w:val="20"/>
+      </w:rPr>
+    </w:lvl>
+    <w:lvl w:ilvl="5" w:tentative="1">
+      <w:start w:val="1"/>
+      <w:numFmt w:val="bullet"/>
+      <w:lvlText w:val=""/>
+      <w:lvlJc w:val="left"/>
+      <w:pPr>
+        <w:tabs>
+          <w:tab w:val="num" w:pos="4320"/>
+        </w:tabs>
+        <w:ind w:left="4320" w:hanging="360"/>
+      </w:pPr>
+      <w:rPr>
+        <w:rFonts w:ascii="Wingdings" w:hAnsi="Wingdings" w:hint="default"/>
+        <w:sz w:val="20"/>
+      </w:rPr>
+    </w:lvl>
+    <w:lvl w:ilvl="6" w:tentative="1">
+      <w:start w:val="1"/>
+      <w:numFmt w:val="bullet"/>
+      <w:lvlText w:val=""/>
+      <w:lvlJc w:val="left"/>
+      <w:pPr>
+        <w:tabs>
+          <w:tab w:val="num" w:pos="5040"/>
+        </w:tabs>
+        <w:ind w:left="5040" w:hanging="360"/>
+      </w:pPr>
+      <w:rPr>
+        <w:rFonts w:ascii="Wingdings" w:hAnsi="Wingdings" w:hint="default"/>
+        <w:sz w:val="20"/>
+      </w:rPr>
+    </w:lvl>
+    <w:lvl w:ilvl="7" w:tentative="1">
+      <w:start w:val="1"/>
+      <w:numFmt w:val="bullet"/>
+      <w:lvlText w:val=""/>
+      <w:lvlJc w:val="left"/>
+      <w:pPr>
+        <w:tabs>
+          <w:tab w:val="num" w:pos="5760"/>
+        </w:tabs>
+        <w:ind w:left="5760" w:hanging="360"/>
+      </w:pPr>
+      <w:rPr>
+        <w:rFonts w:ascii="Wingdings" w:hAnsi="Wingdings" w:hint="default"/>
+        <w:sz w:val="20"/>
+      </w:rPr>
+    </w:lvl>
+    <w:lvl w:ilvl="8" w:tentative="1">
+      <w:start w:val="1"/>
+      <w:numFmt w:val="bullet"/>
+      <w:lvlText w:val=""/>
+      <w:lvlJc w:val="left"/>
+      <w:pPr>
+        <w:tabs>
+          <w:tab w:val="num" w:pos="6480"/>
+        </w:tabs>
+        <w:ind w:left="6480" w:hanging="360"/>
+      </w:pPr>
+      <w:rPr>
+        <w:rFonts w:ascii="Wingdings" w:hAnsi="Wingdings" w:hint="default"/>
+        <w:sz w:val="20"/>
+      </w:rPr>
+    </w:lvl>
+  </w:abstractNum>
+  <w:abstractNum w:abstractNumId="30" w15:restartNumberingAfterBreak="0">
     <w:nsid w:val="5FB1635F"/>
     <w:multiLevelType w:val="hybridMultilevel"/>
     <w:tmpl w:val="F8EC2D82"/>
@@ -2796,7 +6696,454 @@
       </w:pPr>
     </w:lvl>
   </w:abstractNum>
-  <w:abstractNum w:abstractNumId="15" w15:restartNumberingAfterBreak="0">
+  <w:abstractNum w:abstractNumId="31" w15:restartNumberingAfterBreak="0">
+    <w:nsid w:val="61833281"/>
+    <w:multiLevelType w:val="multilevel"/>
+    <w:tmpl w:val="8E4A1AE8"/>
+    <w:lvl w:ilvl="0">
+      <w:start w:val="1"/>
+      <w:numFmt w:val="bullet"/>
+      <w:lvlText w:val=""/>
+      <w:lvlJc w:val="left"/>
+      <w:pPr>
+        <w:tabs>
+          <w:tab w:val="num" w:pos="720"/>
+        </w:tabs>
+        <w:ind w:left="720" w:hanging="360"/>
+      </w:pPr>
+      <w:rPr>
+        <w:rFonts w:ascii="Symbol" w:hAnsi="Symbol" w:hint="default"/>
+        <w:sz w:val="20"/>
+      </w:rPr>
+    </w:lvl>
+    <w:lvl w:ilvl="1" w:tentative="1">
+      <w:start w:val="1"/>
+      <w:numFmt w:val="bullet"/>
+      <w:lvlText w:val="o"/>
+      <w:lvlJc w:val="left"/>
+      <w:pPr>
+        <w:tabs>
+          <w:tab w:val="num" w:pos="1440"/>
+        </w:tabs>
+        <w:ind w:left="1440" w:hanging="360"/>
+      </w:pPr>
+      <w:rPr>
+        <w:rFonts w:ascii="Courier New" w:hAnsi="Courier New" w:hint="default"/>
+        <w:sz w:val="20"/>
+      </w:rPr>
+    </w:lvl>
+    <w:lvl w:ilvl="2" w:tentative="1">
+      <w:start w:val="1"/>
+      <w:numFmt w:val="bullet"/>
+      <w:lvlText w:val=""/>
+      <w:lvlJc w:val="left"/>
+      <w:pPr>
+        <w:tabs>
+          <w:tab w:val="num" w:pos="2160"/>
+        </w:tabs>
+        <w:ind w:left="2160" w:hanging="360"/>
+      </w:pPr>
+      <w:rPr>
+        <w:rFonts w:ascii="Wingdings" w:hAnsi="Wingdings" w:hint="default"/>
+        <w:sz w:val="20"/>
+      </w:rPr>
+    </w:lvl>
+    <w:lvl w:ilvl="3" w:tentative="1">
+      <w:start w:val="1"/>
+      <w:numFmt w:val="bullet"/>
+      <w:lvlText w:val=""/>
+      <w:lvlJc w:val="left"/>
+      <w:pPr>
+        <w:tabs>
+          <w:tab w:val="num" w:pos="2880"/>
+        </w:tabs>
+        <w:ind w:left="2880" w:hanging="360"/>
+      </w:pPr>
+      <w:rPr>
+        <w:rFonts w:ascii="Wingdings" w:hAnsi="Wingdings" w:hint="default"/>
+        <w:sz w:val="20"/>
+      </w:rPr>
+    </w:lvl>
+    <w:lvl w:ilvl="4" w:tentative="1">
+      <w:start w:val="1"/>
+      <w:numFmt w:val="bullet"/>
+      <w:lvlText w:val=""/>
+      <w:lvlJc w:val="left"/>
+      <w:pPr>
+        <w:tabs>
+          <w:tab w:val="num" w:pos="3600"/>
+        </w:tabs>
+        <w:ind w:left="3600" w:hanging="360"/>
+      </w:pPr>
+      <w:rPr>
+        <w:rFonts w:ascii="Wingdings" w:hAnsi="Wingdings" w:hint="default"/>
+        <w:sz w:val="20"/>
+      </w:rPr>
+    </w:lvl>
+    <w:lvl w:ilvl="5" w:tentative="1">
+      <w:start w:val="1"/>
+      <w:numFmt w:val="bullet"/>
+      <w:lvlText w:val=""/>
+      <w:lvlJc w:val="left"/>
+      <w:pPr>
+        <w:tabs>
+          <w:tab w:val="num" w:pos="4320"/>
+        </w:tabs>
+        <w:ind w:left="4320" w:hanging="360"/>
+      </w:pPr>
+      <w:rPr>
+        <w:rFonts w:ascii="Wingdings" w:hAnsi="Wingdings" w:hint="default"/>
+        <w:sz w:val="20"/>
+      </w:rPr>
+    </w:lvl>
+    <w:lvl w:ilvl="6" w:tentative="1">
+      <w:start w:val="1"/>
+      <w:numFmt w:val="bullet"/>
+      <w:lvlText w:val=""/>
+      <w:lvlJc w:val="left"/>
+      <w:pPr>
+        <w:tabs>
+          <w:tab w:val="num" w:pos="5040"/>
+        </w:tabs>
+        <w:ind w:left="5040" w:hanging="360"/>
+      </w:pPr>
+      <w:rPr>
+        <w:rFonts w:ascii="Wingdings" w:hAnsi="Wingdings" w:hint="default"/>
+        <w:sz w:val="20"/>
+      </w:rPr>
+    </w:lvl>
+    <w:lvl w:ilvl="7" w:tentative="1">
+      <w:start w:val="1"/>
+      <w:numFmt w:val="bullet"/>
+      <w:lvlText w:val=""/>
+      <w:lvlJc w:val="left"/>
+      <w:pPr>
+        <w:tabs>
+          <w:tab w:val="num" w:pos="5760"/>
+        </w:tabs>
+        <w:ind w:left="5760" w:hanging="360"/>
+      </w:pPr>
+      <w:rPr>
+        <w:rFonts w:ascii="Wingdings" w:hAnsi="Wingdings" w:hint="default"/>
+        <w:sz w:val="20"/>
+      </w:rPr>
+    </w:lvl>
+    <w:lvl w:ilvl="8" w:tentative="1">
+      <w:start w:val="1"/>
+      <w:numFmt w:val="bullet"/>
+      <w:lvlText w:val=""/>
+      <w:lvlJc w:val="left"/>
+      <w:pPr>
+        <w:tabs>
+          <w:tab w:val="num" w:pos="6480"/>
+        </w:tabs>
+        <w:ind w:left="6480" w:hanging="360"/>
+      </w:pPr>
+      <w:rPr>
+        <w:rFonts w:ascii="Wingdings" w:hAnsi="Wingdings" w:hint="default"/>
+        <w:sz w:val="20"/>
+      </w:rPr>
+    </w:lvl>
+  </w:abstractNum>
+  <w:abstractNum w:abstractNumId="32" w15:restartNumberingAfterBreak="0">
+    <w:nsid w:val="62ED5A4C"/>
+    <w:multiLevelType w:val="multilevel"/>
+    <w:tmpl w:val="BED8145E"/>
+    <w:lvl w:ilvl="0">
+      <w:start w:val="1"/>
+      <w:numFmt w:val="bullet"/>
+      <w:lvlText w:val=""/>
+      <w:lvlJc w:val="left"/>
+      <w:pPr>
+        <w:tabs>
+          <w:tab w:val="num" w:pos="720"/>
+        </w:tabs>
+        <w:ind w:left="720" w:hanging="360"/>
+      </w:pPr>
+      <w:rPr>
+        <w:rFonts w:ascii="Symbol" w:hAnsi="Symbol" w:hint="default"/>
+        <w:sz w:val="20"/>
+      </w:rPr>
+    </w:lvl>
+    <w:lvl w:ilvl="1" w:tentative="1">
+      <w:start w:val="1"/>
+      <w:numFmt w:val="bullet"/>
+      <w:lvlText w:val="o"/>
+      <w:lvlJc w:val="left"/>
+      <w:pPr>
+        <w:tabs>
+          <w:tab w:val="num" w:pos="1440"/>
+        </w:tabs>
+        <w:ind w:left="1440" w:hanging="360"/>
+      </w:pPr>
+      <w:rPr>
+        <w:rFonts w:ascii="Courier New" w:hAnsi="Courier New" w:hint="default"/>
+        <w:sz w:val="20"/>
+      </w:rPr>
+    </w:lvl>
+    <w:lvl w:ilvl="2" w:tentative="1">
+      <w:start w:val="1"/>
+      <w:numFmt w:val="bullet"/>
+      <w:lvlText w:val=""/>
+      <w:lvlJc w:val="left"/>
+      <w:pPr>
+        <w:tabs>
+          <w:tab w:val="num" w:pos="2160"/>
+        </w:tabs>
+        <w:ind w:left="2160" w:hanging="360"/>
+      </w:pPr>
+      <w:rPr>
+        <w:rFonts w:ascii="Wingdings" w:hAnsi="Wingdings" w:hint="default"/>
+        <w:sz w:val="20"/>
+      </w:rPr>
+    </w:lvl>
+    <w:lvl w:ilvl="3" w:tentative="1">
+      <w:start w:val="1"/>
+      <w:numFmt w:val="bullet"/>
+      <w:lvlText w:val=""/>
+      <w:lvlJc w:val="left"/>
+      <w:pPr>
+        <w:tabs>
+          <w:tab w:val="num" w:pos="2880"/>
+        </w:tabs>
+        <w:ind w:left="2880" w:hanging="360"/>
+      </w:pPr>
+      <w:rPr>
+        <w:rFonts w:ascii="Wingdings" w:hAnsi="Wingdings" w:hint="default"/>
+        <w:sz w:val="20"/>
+      </w:rPr>
+    </w:lvl>
+    <w:lvl w:ilvl="4" w:tentative="1">
+      <w:start w:val="1"/>
+      <w:numFmt w:val="bullet"/>
+      <w:lvlText w:val=""/>
+      <w:lvlJc w:val="left"/>
+      <w:pPr>
+        <w:tabs>
+          <w:tab w:val="num" w:pos="3600"/>
+        </w:tabs>
+        <w:ind w:left="3600" w:hanging="360"/>
+      </w:pPr>
+      <w:rPr>
+        <w:rFonts w:ascii="Wingdings" w:hAnsi="Wingdings" w:hint="default"/>
+        <w:sz w:val="20"/>
+      </w:rPr>
+    </w:lvl>
+    <w:lvl w:ilvl="5" w:tentative="1">
+      <w:start w:val="1"/>
+      <w:numFmt w:val="bullet"/>
+      <w:lvlText w:val=""/>
+      <w:lvlJc w:val="left"/>
+      <w:pPr>
+        <w:tabs>
+          <w:tab w:val="num" w:pos="4320"/>
+        </w:tabs>
+        <w:ind w:left="4320" w:hanging="360"/>
+      </w:pPr>
+      <w:rPr>
+        <w:rFonts w:ascii="Wingdings" w:hAnsi="Wingdings" w:hint="default"/>
+        <w:sz w:val="20"/>
+      </w:rPr>
+    </w:lvl>
+    <w:lvl w:ilvl="6" w:tentative="1">
+      <w:start w:val="1"/>
+      <w:numFmt w:val="bullet"/>
+      <w:lvlText w:val=""/>
+      <w:lvlJc w:val="left"/>
+      <w:pPr>
+        <w:tabs>
+          <w:tab w:val="num" w:pos="5040"/>
+        </w:tabs>
+        <w:ind w:left="5040" w:hanging="360"/>
+      </w:pPr>
+      <w:rPr>
+        <w:rFonts w:ascii="Wingdings" w:hAnsi="Wingdings" w:hint="default"/>
+        <w:sz w:val="20"/>
+      </w:rPr>
+    </w:lvl>
+    <w:lvl w:ilvl="7" w:tentative="1">
+      <w:start w:val="1"/>
+      <w:numFmt w:val="bullet"/>
+      <w:lvlText w:val=""/>
+      <w:lvlJc w:val="left"/>
+      <w:pPr>
+        <w:tabs>
+          <w:tab w:val="num" w:pos="5760"/>
+        </w:tabs>
+        <w:ind w:left="5760" w:hanging="360"/>
+      </w:pPr>
+      <w:rPr>
+        <w:rFonts w:ascii="Wingdings" w:hAnsi="Wingdings" w:hint="default"/>
+        <w:sz w:val="20"/>
+      </w:rPr>
+    </w:lvl>
+    <w:lvl w:ilvl="8" w:tentative="1">
+      <w:start w:val="1"/>
+      <w:numFmt w:val="bullet"/>
+      <w:lvlText w:val=""/>
+      <w:lvlJc w:val="left"/>
+      <w:pPr>
+        <w:tabs>
+          <w:tab w:val="num" w:pos="6480"/>
+        </w:tabs>
+        <w:ind w:left="6480" w:hanging="360"/>
+      </w:pPr>
+      <w:rPr>
+        <w:rFonts w:ascii="Wingdings" w:hAnsi="Wingdings" w:hint="default"/>
+        <w:sz w:val="20"/>
+      </w:rPr>
+    </w:lvl>
+  </w:abstractNum>
+  <w:abstractNum w:abstractNumId="33" w15:restartNumberingAfterBreak="0">
+    <w:nsid w:val="66D375BF"/>
+    <w:multiLevelType w:val="multilevel"/>
+    <w:tmpl w:val="F1D2CE52"/>
+    <w:lvl w:ilvl="0">
+      <w:start w:val="1"/>
+      <w:numFmt w:val="bullet"/>
+      <w:lvlText w:val=""/>
+      <w:lvlJc w:val="left"/>
+      <w:pPr>
+        <w:tabs>
+          <w:tab w:val="num" w:pos="720"/>
+        </w:tabs>
+        <w:ind w:left="720" w:hanging="360"/>
+      </w:pPr>
+      <w:rPr>
+        <w:rFonts w:ascii="Symbol" w:hAnsi="Symbol" w:hint="default"/>
+        <w:sz w:val="20"/>
+      </w:rPr>
+    </w:lvl>
+    <w:lvl w:ilvl="1" w:tentative="1">
+      <w:start w:val="1"/>
+      <w:numFmt w:val="bullet"/>
+      <w:lvlText w:val="o"/>
+      <w:lvlJc w:val="left"/>
+      <w:pPr>
+        <w:tabs>
+          <w:tab w:val="num" w:pos="1440"/>
+        </w:tabs>
+        <w:ind w:left="1440" w:hanging="360"/>
+      </w:pPr>
+      <w:rPr>
+        <w:rFonts w:ascii="Courier New" w:hAnsi="Courier New" w:hint="default"/>
+        <w:sz w:val="20"/>
+      </w:rPr>
+    </w:lvl>
+    <w:lvl w:ilvl="2" w:tentative="1">
+      <w:start w:val="1"/>
+      <w:numFmt w:val="bullet"/>
+      <w:lvlText w:val=""/>
+      <w:lvlJc w:val="left"/>
+      <w:pPr>
+        <w:tabs>
+          <w:tab w:val="num" w:pos="2160"/>
+        </w:tabs>
+        <w:ind w:left="2160" w:hanging="360"/>
+      </w:pPr>
+      <w:rPr>
+        <w:rFonts w:ascii="Wingdings" w:hAnsi="Wingdings" w:hint="default"/>
+        <w:sz w:val="20"/>
+      </w:rPr>
+    </w:lvl>
+    <w:lvl w:ilvl="3" w:tentative="1">
+      <w:start w:val="1"/>
+      <w:numFmt w:val="bullet"/>
+      <w:lvlText w:val=""/>
+      <w:lvlJc w:val="left"/>
+      <w:pPr>
+        <w:tabs>
+          <w:tab w:val="num" w:pos="2880"/>
+        </w:tabs>
+        <w:ind w:left="2880" w:hanging="360"/>
+      </w:pPr>
+      <w:rPr>
+        <w:rFonts w:ascii="Wingdings" w:hAnsi="Wingdings" w:hint="default"/>
+        <w:sz w:val="20"/>
+      </w:rPr>
+    </w:lvl>
+    <w:lvl w:ilvl="4" w:tentative="1">
+      <w:start w:val="1"/>
+      <w:numFmt w:val="bullet"/>
+      <w:lvlText w:val=""/>
+      <w:lvlJc w:val="left"/>
+      <w:pPr>
+        <w:tabs>
+          <w:tab w:val="num" w:pos="3600"/>
+        </w:tabs>
+        <w:ind w:left="3600" w:hanging="360"/>
+      </w:pPr>
+      <w:rPr>
+        <w:rFonts w:ascii="Wingdings" w:hAnsi="Wingdings" w:hint="default"/>
+        <w:sz w:val="20"/>
+      </w:rPr>
+    </w:lvl>
+    <w:lvl w:ilvl="5" w:tentative="1">
+      <w:start w:val="1"/>
+      <w:numFmt w:val="bullet"/>
+      <w:lvlText w:val=""/>
+      <w:lvlJc w:val="left"/>
+      <w:pPr>
+        <w:tabs>
+          <w:tab w:val="num" w:pos="4320"/>
+        </w:tabs>
+        <w:ind w:left="4320" w:hanging="360"/>
+      </w:pPr>
+      <w:rPr>
+        <w:rFonts w:ascii="Wingdings" w:hAnsi="Wingdings" w:hint="default"/>
+        <w:sz w:val="20"/>
+      </w:rPr>
+    </w:lvl>
+    <w:lvl w:ilvl="6" w:tentative="1">
+      <w:start w:val="1"/>
+      <w:numFmt w:val="bullet"/>
+      <w:lvlText w:val=""/>
+      <w:lvlJc w:val="left"/>
+      <w:pPr>
+        <w:tabs>
+          <w:tab w:val="num" w:pos="5040"/>
+        </w:tabs>
+        <w:ind w:left="5040" w:hanging="360"/>
+      </w:pPr>
+      <w:rPr>
+        <w:rFonts w:ascii="Wingdings" w:hAnsi="Wingdings" w:hint="default"/>
+        <w:sz w:val="20"/>
+      </w:rPr>
+    </w:lvl>
+    <w:lvl w:ilvl="7" w:tentative="1">
+      <w:start w:val="1"/>
+      <w:numFmt w:val="bullet"/>
+      <w:lvlText w:val=""/>
+      <w:lvlJc w:val="left"/>
+      <w:pPr>
+        <w:tabs>
+          <w:tab w:val="num" w:pos="5760"/>
+        </w:tabs>
+        <w:ind w:left="5760" w:hanging="360"/>
+      </w:pPr>
+      <w:rPr>
+        <w:rFonts w:ascii="Wingdings" w:hAnsi="Wingdings" w:hint="default"/>
+        <w:sz w:val="20"/>
+      </w:rPr>
+    </w:lvl>
+    <w:lvl w:ilvl="8" w:tentative="1">
+      <w:start w:val="1"/>
+      <w:numFmt w:val="bullet"/>
+      <w:lvlText w:val=""/>
+      <w:lvlJc w:val="left"/>
+      <w:pPr>
+        <w:tabs>
+          <w:tab w:val="num" w:pos="6480"/>
+        </w:tabs>
+        <w:ind w:left="6480" w:hanging="360"/>
+      </w:pPr>
+      <w:rPr>
+        <w:rFonts w:ascii="Wingdings" w:hAnsi="Wingdings" w:hint="default"/>
+        <w:sz w:val="20"/>
+      </w:rPr>
+    </w:lvl>
+  </w:abstractNum>
+  <w:abstractNum w:abstractNumId="34" w15:restartNumberingAfterBreak="0">
     <w:nsid w:val="72CB1AE4"/>
     <w:multiLevelType w:val="hybridMultilevel"/>
     <w:tmpl w:val="99642576"/>
@@ -2909,7 +7256,7 @@
       </w:rPr>
     </w:lvl>
   </w:abstractNum>
-  <w:abstractNum w:abstractNumId="16" w15:restartNumberingAfterBreak="0">
+  <w:abstractNum w:abstractNumId="35" w15:restartNumberingAfterBreak="0">
     <w:nsid w:val="733E52E6"/>
     <w:multiLevelType w:val="hybridMultilevel"/>
     <w:tmpl w:val="F122442C"/>
@@ -3022,7 +7369,7 @@
       </w:rPr>
     </w:lvl>
   </w:abstractNum>
-  <w:abstractNum w:abstractNumId="17" w15:restartNumberingAfterBreak="0">
+  <w:abstractNum w:abstractNumId="36" w15:restartNumberingAfterBreak="0">
     <w:nsid w:val="73572A02"/>
     <w:multiLevelType w:val="multilevel"/>
     <w:tmpl w:val="9A0AE64C"/>
@@ -3171,7 +7518,156 @@
       </w:rPr>
     </w:lvl>
   </w:abstractNum>
-  <w:abstractNum w:abstractNumId="18" w15:restartNumberingAfterBreak="0">
+  <w:abstractNum w:abstractNumId="37" w15:restartNumberingAfterBreak="0">
+    <w:nsid w:val="775D032B"/>
+    <w:multiLevelType w:val="multilevel"/>
+    <w:tmpl w:val="6A000CFA"/>
+    <w:lvl w:ilvl="0">
+      <w:start w:val="1"/>
+      <w:numFmt w:val="bullet"/>
+      <w:lvlText w:val=""/>
+      <w:lvlJc w:val="left"/>
+      <w:pPr>
+        <w:tabs>
+          <w:tab w:val="num" w:pos="720"/>
+        </w:tabs>
+        <w:ind w:left="720" w:hanging="360"/>
+      </w:pPr>
+      <w:rPr>
+        <w:rFonts w:ascii="Symbol" w:hAnsi="Symbol" w:hint="default"/>
+        <w:sz w:val="20"/>
+      </w:rPr>
+    </w:lvl>
+    <w:lvl w:ilvl="1" w:tentative="1">
+      <w:start w:val="1"/>
+      <w:numFmt w:val="bullet"/>
+      <w:lvlText w:val="o"/>
+      <w:lvlJc w:val="left"/>
+      <w:pPr>
+        <w:tabs>
+          <w:tab w:val="num" w:pos="1440"/>
+        </w:tabs>
+        <w:ind w:left="1440" w:hanging="360"/>
+      </w:pPr>
+      <w:rPr>
+        <w:rFonts w:ascii="Courier New" w:hAnsi="Courier New" w:hint="default"/>
+        <w:sz w:val="20"/>
+      </w:rPr>
+    </w:lvl>
+    <w:lvl w:ilvl="2" w:tentative="1">
+      <w:start w:val="1"/>
+      <w:numFmt w:val="bullet"/>
+      <w:lvlText w:val=""/>
+      <w:lvlJc w:val="left"/>
+      <w:pPr>
+        <w:tabs>
+          <w:tab w:val="num" w:pos="2160"/>
+        </w:tabs>
+        <w:ind w:left="2160" w:hanging="360"/>
+      </w:pPr>
+      <w:rPr>
+        <w:rFonts w:ascii="Wingdings" w:hAnsi="Wingdings" w:hint="default"/>
+        <w:sz w:val="20"/>
+      </w:rPr>
+    </w:lvl>
+    <w:lvl w:ilvl="3" w:tentative="1">
+      <w:start w:val="1"/>
+      <w:numFmt w:val="bullet"/>
+      <w:lvlText w:val=""/>
+      <w:lvlJc w:val="left"/>
+      <w:pPr>
+        <w:tabs>
+          <w:tab w:val="num" w:pos="2880"/>
+        </w:tabs>
+        <w:ind w:left="2880" w:hanging="360"/>
+      </w:pPr>
+      <w:rPr>
+        <w:rFonts w:ascii="Wingdings" w:hAnsi="Wingdings" w:hint="default"/>
+        <w:sz w:val="20"/>
+      </w:rPr>
+    </w:lvl>
+    <w:lvl w:ilvl="4" w:tentative="1">
+      <w:start w:val="1"/>
+      <w:numFmt w:val="bullet"/>
+      <w:lvlText w:val=""/>
+      <w:lvlJc w:val="left"/>
+      <w:pPr>
+        <w:tabs>
+          <w:tab w:val="num" w:pos="3600"/>
+        </w:tabs>
+        <w:ind w:left="3600" w:hanging="360"/>
+      </w:pPr>
+      <w:rPr>
+        <w:rFonts w:ascii="Wingdings" w:hAnsi="Wingdings" w:hint="default"/>
+        <w:sz w:val="20"/>
+      </w:rPr>
+    </w:lvl>
+    <w:lvl w:ilvl="5" w:tentative="1">
+      <w:start w:val="1"/>
+      <w:numFmt w:val="bullet"/>
+      <w:lvlText w:val=""/>
+      <w:lvlJc w:val="left"/>
+      <w:pPr>
+        <w:tabs>
+          <w:tab w:val="num" w:pos="4320"/>
+        </w:tabs>
+        <w:ind w:left="4320" w:hanging="360"/>
+      </w:pPr>
+      <w:rPr>
+        <w:rFonts w:ascii="Wingdings" w:hAnsi="Wingdings" w:hint="default"/>
+        <w:sz w:val="20"/>
+      </w:rPr>
+    </w:lvl>
+    <w:lvl w:ilvl="6" w:tentative="1">
+      <w:start w:val="1"/>
+      <w:numFmt w:val="bullet"/>
+      <w:lvlText w:val=""/>
+      <w:lvlJc w:val="left"/>
+      <w:pPr>
+        <w:tabs>
+          <w:tab w:val="num" w:pos="5040"/>
+        </w:tabs>
+        <w:ind w:left="5040" w:hanging="360"/>
+      </w:pPr>
+      <w:rPr>
+        <w:rFonts w:ascii="Wingdings" w:hAnsi="Wingdings" w:hint="default"/>
+        <w:sz w:val="20"/>
+      </w:rPr>
+    </w:lvl>
+    <w:lvl w:ilvl="7" w:tentative="1">
+      <w:start w:val="1"/>
+      <w:numFmt w:val="bullet"/>
+      <w:lvlText w:val=""/>
+      <w:lvlJc w:val="left"/>
+      <w:pPr>
+        <w:tabs>
+          <w:tab w:val="num" w:pos="5760"/>
+        </w:tabs>
+        <w:ind w:left="5760" w:hanging="360"/>
+      </w:pPr>
+      <w:rPr>
+        <w:rFonts w:ascii="Wingdings" w:hAnsi="Wingdings" w:hint="default"/>
+        <w:sz w:val="20"/>
+      </w:rPr>
+    </w:lvl>
+    <w:lvl w:ilvl="8" w:tentative="1">
+      <w:start w:val="1"/>
+      <w:numFmt w:val="bullet"/>
+      <w:lvlText w:val=""/>
+      <w:lvlJc w:val="left"/>
+      <w:pPr>
+        <w:tabs>
+          <w:tab w:val="num" w:pos="6480"/>
+        </w:tabs>
+        <w:ind w:left="6480" w:hanging="360"/>
+      </w:pPr>
+      <w:rPr>
+        <w:rFonts w:ascii="Wingdings" w:hAnsi="Wingdings" w:hint="default"/>
+        <w:sz w:val="20"/>
+      </w:rPr>
+    </w:lvl>
+  </w:abstractNum>
+  <w:abstractNum w:abstractNumId="38" w15:restartNumberingAfterBreak="0">
     <w:nsid w:val="79F92690"/>
     <w:multiLevelType w:val="multilevel"/>
     <w:tmpl w:val="531CE590"/>
@@ -3320,7 +7816,7 @@
       </w:rPr>
     </w:lvl>
   </w:abstractNum>
-  <w:abstractNum w:abstractNumId="19" w15:restartNumberingAfterBreak="0">
+  <w:abstractNum w:abstractNumId="39" w15:restartNumberingAfterBreak="0">
     <w:nsid w:val="7A6076A7"/>
     <w:multiLevelType w:val="multilevel"/>
     <w:tmpl w:val="710AEC28"/>
@@ -3470,106 +7966,166 @@
     </w:lvl>
   </w:abstractNum>
   <w:num w:numId="1" w16cid:durableId="2057659798">
-    <w:abstractNumId w:val="7"/>
+    <w:abstractNumId w:val="13"/>
   </w:num>
   <w:num w:numId="2" w16cid:durableId="99107261">
-    <w:abstractNumId w:val="7"/>
+    <w:abstractNumId w:val="13"/>
   </w:num>
   <w:num w:numId="3" w16cid:durableId="454829576">
-    <w:abstractNumId w:val="7"/>
+    <w:abstractNumId w:val="13"/>
   </w:num>
   <w:num w:numId="4" w16cid:durableId="919875635">
-    <w:abstractNumId w:val="7"/>
+    <w:abstractNumId w:val="13"/>
   </w:num>
   <w:num w:numId="5" w16cid:durableId="1989245865">
-    <w:abstractNumId w:val="7"/>
+    <w:abstractNumId w:val="13"/>
   </w:num>
   <w:num w:numId="6" w16cid:durableId="337856889">
-    <w:abstractNumId w:val="7"/>
+    <w:abstractNumId w:val="13"/>
   </w:num>
   <w:num w:numId="7" w16cid:durableId="486750497">
+    <w:abstractNumId w:val="6"/>
+  </w:num>
+  <w:num w:numId="8" w16cid:durableId="1295481688">
+    <w:abstractNumId w:val="13"/>
+  </w:num>
+  <w:num w:numId="9" w16cid:durableId="878207473">
+    <w:abstractNumId w:val="13"/>
+  </w:num>
+  <w:num w:numId="10" w16cid:durableId="390271873">
+    <w:abstractNumId w:val="6"/>
+  </w:num>
+  <w:num w:numId="11" w16cid:durableId="108548336">
+    <w:abstractNumId w:val="13"/>
+  </w:num>
+  <w:num w:numId="12" w16cid:durableId="289626826">
+    <w:abstractNumId w:val="16"/>
+  </w:num>
+  <w:num w:numId="13" w16cid:durableId="709189428">
+    <w:abstractNumId w:val="30"/>
+  </w:num>
+  <w:num w:numId="14" w16cid:durableId="1828012820">
+    <w:abstractNumId w:val="13"/>
+  </w:num>
+  <w:num w:numId="15" w16cid:durableId="1472016058">
+    <w:abstractNumId w:val="13"/>
+  </w:num>
+  <w:num w:numId="16" w16cid:durableId="2007130954">
+    <w:abstractNumId w:val="13"/>
+  </w:num>
+  <w:num w:numId="17" w16cid:durableId="2124959910">
+    <w:abstractNumId w:val="13"/>
+  </w:num>
+  <w:num w:numId="18" w16cid:durableId="1161965983">
+    <w:abstractNumId w:val="13"/>
+  </w:num>
+  <w:num w:numId="19" w16cid:durableId="41710311">
     <w:abstractNumId w:val="3"/>
   </w:num>
-  <w:num w:numId="8" w16cid:durableId="1295481688">
-    <w:abstractNumId w:val="7"/>
+  <w:num w:numId="20" w16cid:durableId="1163350981">
+    <w:abstractNumId w:val="34"/>
   </w:num>
-  <w:num w:numId="9" w16cid:durableId="878207473">
-    <w:abstractNumId w:val="7"/>
+  <w:num w:numId="21" w16cid:durableId="926422226">
+    <w:abstractNumId w:val="35"/>
   </w:num>
-  <w:num w:numId="10" w16cid:durableId="390271873">
-    <w:abstractNumId w:val="3"/>
+  <w:num w:numId="22" w16cid:durableId="690304119">
+    <w:abstractNumId w:val="11"/>
   </w:num>
-  <w:num w:numId="11" w16cid:durableId="108548336">
-    <w:abstractNumId w:val="7"/>
+  <w:num w:numId="23" w16cid:durableId="1154031265">
+    <w:abstractNumId w:val="36"/>
   </w:num>
-  <w:num w:numId="12" w16cid:durableId="289626826">
-    <w:abstractNumId w:val="9"/>
+  <w:num w:numId="24" w16cid:durableId="1956523979">
+    <w:abstractNumId w:val="8"/>
   </w:num>
-  <w:num w:numId="13" w16cid:durableId="709189428">
+  <w:num w:numId="25" w16cid:durableId="1122503775">
     <w:abstractNumId w:val="14"/>
   </w:num>
-  <w:num w:numId="14" w16cid:durableId="1828012820">
-    <w:abstractNumId w:val="7"/>
+  <w:num w:numId="26" w16cid:durableId="1019895648">
+    <w:abstractNumId w:val="23"/>
   </w:num>
-  <w:num w:numId="15" w16cid:durableId="1472016058">
-    <w:abstractNumId w:val="7"/>
+  <w:num w:numId="27" w16cid:durableId="1635984666">
+    <w:abstractNumId w:val="17"/>
   </w:num>
-  <w:num w:numId="16" w16cid:durableId="2007130954">
-    <w:abstractNumId w:val="7"/>
-  </w:num>
-  <w:num w:numId="17" w16cid:durableId="2124959910">
-    <w:abstractNumId w:val="7"/>
-  </w:num>
-  <w:num w:numId="18" w16cid:durableId="1161965983">
-    <w:abstractNumId w:val="7"/>
-  </w:num>
-  <w:num w:numId="19" w16cid:durableId="41710311">
+  <w:num w:numId="28" w16cid:durableId="1012806949">
     <w:abstractNumId w:val="2"/>
   </w:num>
-  <w:num w:numId="20" w16cid:durableId="1163350981">
-    <w:abstractNumId w:val="15"/>
-  </w:num>
-  <w:num w:numId="21" w16cid:durableId="926422226">
-    <w:abstractNumId w:val="16"/>
-  </w:num>
-  <w:num w:numId="22" w16cid:durableId="690304119">
-    <w:abstractNumId w:val="5"/>
-  </w:num>
-  <w:num w:numId="23" w16cid:durableId="1154031265">
-    <w:abstractNumId w:val="17"/>
-  </w:num>
-  <w:num w:numId="24" w16cid:durableId="1956523979">
-    <w:abstractNumId w:val="4"/>
-  </w:num>
-  <w:num w:numId="25" w16cid:durableId="1122503775">
-    <w:abstractNumId w:val="8"/>
-  </w:num>
-  <w:num w:numId="26" w16cid:durableId="1019895648">
-    <w:abstractNumId w:val="13"/>
-  </w:num>
-  <w:num w:numId="27" w16cid:durableId="1635984666">
-    <w:abstractNumId w:val="10"/>
-  </w:num>
-  <w:num w:numId="28" w16cid:durableId="1012806949">
-    <w:abstractNumId w:val="1"/>
-  </w:num>
   <w:num w:numId="29" w16cid:durableId="918251369">
-    <w:abstractNumId w:val="18"/>
+    <w:abstractNumId w:val="38"/>
   </w:num>
   <w:num w:numId="30" w16cid:durableId="825705908">
-    <w:abstractNumId w:val="19"/>
+    <w:abstractNumId w:val="39"/>
   </w:num>
   <w:num w:numId="31" w16cid:durableId="38475431">
-    <w:abstractNumId w:val="12"/>
+    <w:abstractNumId w:val="21"/>
   </w:num>
   <w:num w:numId="32" w16cid:durableId="907493259">
-    <w:abstractNumId w:val="11"/>
+    <w:abstractNumId w:val="20"/>
   </w:num>
   <w:num w:numId="33" w16cid:durableId="766772892">
     <w:abstractNumId w:val="0"/>
   </w:num>
   <w:num w:numId="34" w16cid:durableId="1505051811">
-    <w:abstractNumId w:val="6"/>
+    <w:abstractNumId w:val="12"/>
+  </w:num>
+  <w:num w:numId="35" w16cid:durableId="53547850">
+    <w:abstractNumId w:val="7"/>
+  </w:num>
+  <w:num w:numId="36" w16cid:durableId="1158808271">
+    <w:abstractNumId w:val="10"/>
+  </w:num>
+  <w:num w:numId="37" w16cid:durableId="1025057996">
+    <w:abstractNumId w:val="31"/>
+  </w:num>
+  <w:num w:numId="38" w16cid:durableId="1689139318">
+    <w:abstractNumId w:val="24"/>
+  </w:num>
+  <w:num w:numId="39" w16cid:durableId="1721245189">
+    <w:abstractNumId w:val="27"/>
+  </w:num>
+  <w:num w:numId="40" w16cid:durableId="698579991">
+    <w:abstractNumId w:val="26"/>
+  </w:num>
+  <w:num w:numId="41" w16cid:durableId="476261604">
+    <w:abstractNumId w:val="22"/>
+  </w:num>
+  <w:num w:numId="42" w16cid:durableId="1939019691">
+    <w:abstractNumId w:val="28"/>
+  </w:num>
+  <w:num w:numId="43" w16cid:durableId="848253045">
+    <w:abstractNumId w:val="18"/>
+  </w:num>
+  <w:num w:numId="44" w16cid:durableId="1247886382">
+    <w:abstractNumId w:val="33"/>
+  </w:num>
+  <w:num w:numId="45" w16cid:durableId="1842620916">
+    <w:abstractNumId w:val="32"/>
+  </w:num>
+  <w:num w:numId="46" w16cid:durableId="354967061">
+    <w:abstractNumId w:val="9"/>
+  </w:num>
+  <w:num w:numId="47" w16cid:durableId="23479184">
+    <w:abstractNumId w:val="5"/>
+  </w:num>
+  <w:num w:numId="48" w16cid:durableId="25449443">
+    <w:abstractNumId w:val="4"/>
+  </w:num>
+  <w:num w:numId="49" w16cid:durableId="196047337">
+    <w:abstractNumId w:val="37"/>
+  </w:num>
+  <w:num w:numId="50" w16cid:durableId="1539313586">
+    <w:abstractNumId w:val="19"/>
+  </w:num>
+  <w:num w:numId="51" w16cid:durableId="1893495052">
+    <w:abstractNumId w:val="25"/>
+  </w:num>
+  <w:num w:numId="52" w16cid:durableId="1195389668">
+    <w:abstractNumId w:val="15"/>
+  </w:num>
+  <w:num w:numId="53" w16cid:durableId="943079126">
+    <w:abstractNumId w:val="1"/>
+  </w:num>
+  <w:num w:numId="54" w16cid:durableId="1568304592">
+    <w:abstractNumId w:val="29"/>
   </w:num>
 </w:numbering>
 </file>

</xml_diff>